<commit_message>
chore: commit recent research deliverables
</commit_message>
<xml_diff>
--- a/output/task-007/面向光子芯片智能设计的三方向技术调研_飞书上传版.docx
+++ b/output/task-007/面向光子芯片智能设计的三方向技术调研_飞书上传版.docx
@@ -120,15 +120,30 @@
         <w:rPr>
           <w:rFonts w:ascii="微软雅黑" w:hAnsi="微软雅黑" w:eastAsia="微软雅黑"/>
         </w:rPr>
-        <w:t>调研显示，DAS 方向已经有硅光集成收发前端、高消光比调制器、微梳并行传感和 InP–SOI 混合集成窄线宽激光模块进入真实系统实验，但激光、放大、环行、电子采集、数字信号处理、封装与长期稳定性仍常以片外或未充分报告的形式存在。当前未发现公开证据证明人工智能 Agent 已端到端设计并物理验证一款 DAS 光电混合集成芯片。光子人工智能计算已经从核心算子演示发展到真实模型或任务的芯片/系统实验，涵盖干涉网格、微环/波分/微梳和衍射架构；然而，器件误差、校准、激光、光电转换、控制、存储和数据移动的边界并不统一，核心 TOPS/W 不能直接等同完整系统优势。Agentic PIC Design 则已出现自然语言到结构化电路、脚本生成、真实仿真在环、自动评价和工具适配等局部闭环，但没有一套公开、可复现的系统同时覆盖可靠需求表示、确定性工具调用、器件/电路仿真、版图、DRC/LVS、PDK 合规、失败恢复和 foundry signoff。</w:t>
+        <w:t>调研显示，DAS 方向已经有硅光集成收发前端、高消光比调制器、微梳并行传感和 InP–SOI 混合集成窄线宽激光模块进入真实系统实验，但激光、放大、环行、电子采集、数字信号处理、封装与长期稳定性仍常以片外或未充分报告的形式存在。</w:t>
+      </w:r>
+      <w:r>
+        <w:rPr>
+          <w:rFonts w:ascii="微软雅黑" w:hAnsi="微软雅黑" w:eastAsia="微软雅黑"/>
+          <w:highlight w:val="yellow"/>
+        </w:rPr>
+        <w:t>当前未发现公开证据证明人工智能 Agent 已端到端设计并物理验证一款 DAS 光电混合集成芯片。</w:t>
+      </w:r>
+      <w:r>
+        <w:rPr>
+          <w:rFonts w:ascii="微软雅黑" w:hAnsi="微软雅黑" w:eastAsia="微软雅黑"/>
+        </w:rPr>
+        <w:t>光子人工智能计算已经从核心算子演示发展到真实模型或任务的芯片/系统实验，涵盖干涉网格、微环/波分/微梳和衍射架构；然而，器件误差、校准、激光、光电转换、控制、存储和数据移动的边界并不统一，核心 TOPS/W 不能直接等同完整系统优势。Agentic PIC Design 则已出现自然语言到结构化电路、脚本生成、真实仿真在环、自动评价和工具适配等局部闭环，但没有一套公开、可复现的系统同时覆盖可靠需求表示、确定性工具调用、器件/电路仿真、版图、DRC/LVS、PDK 合规、失败恢复和 foundry signoff。</w:t>
       </w:r>
     </w:p>
     <w:p>
-      <w:r>
-        <w:rPr>
-          <w:rFonts w:ascii="微软雅黑" w:hAnsi="微软雅黑" w:eastAsia="微软雅黑"/>
-        </w:rPr>
-        <w:t>因此，本报告不预设最终方向，而提出三条供进一步讨论的候选路线：证据优先的 Agentic PIC Harness 方法研究；DAS 系统需求到光电混合集成约束的可追溯传播；光子 AI 的器件误差—任务精度—系统成本联合证据链。三者的共同核心不是“让 LLM 多生成代码”，而是建立明确的系统边界、确定性工具证据、分层验证和诚实的结论强度。</w:t>
+      <w:bookmarkStart w:id="0" w:name="_GoBack"/>
+      <w:bookmarkEnd w:id="0"/>
+      <w:r>
+        <w:rPr>
+          <w:rFonts w:ascii="微软雅黑" w:hAnsi="微软雅黑" w:eastAsia="微软雅黑"/>
+        </w:rPr>
+        <w:t>本报告最终将研究重点收敛到证据优先的 Agentic PIC Harness 方法研究，重点关注 AI 对真实 PIC 设计需求与物理约束的理解，以及设计、仿真、优化、版图和验证工具的可靠协同。研究核心不是单纯增强 LLM 的代码生成能力，而是通过结构化需求表达、明确的系统边界、确定性工具证据和分层验证，建立可追溯、可验证的光子芯片智能设计流程。</w:t>
       </w:r>
     </w:p>
     <w:p>
@@ -3582,8 +3597,6 @@
         </w:rPr>
         <w:t>Fig. 5 在 20 km launch fiber 后记录 200 Hz 扬声器扰动，约 0.9 rad 峰峰相位变化。结果为 AUTHOR CLAIM；会议短文未给出与 Jin 同口径的检测限/空间分辨率。原图版权限制未核实，故不复制。</w:t>
       </w:r>
-      <w:bookmarkStart w:id="0" w:name="_GoBack"/>
-      <w:bookmarkEnd w:id="0"/>
     </w:p>
     <w:p>
       <w:pPr>
@@ -11379,71 +11392,20 @@
         <w:rPr>
           <w:rFonts w:ascii="微软雅黑" w:hAnsi="微软雅黑" w:eastAsia="微软雅黑"/>
         </w:rPr>
-        <w:t>4.4 Reference Architecture V0</w:t>
-      </w:r>
-    </w:p>
-    <w:p>
-      <w:pPr>
-        <w:spacing w:after="140"/>
-        <w:jc w:val="center"/>
-      </w:pPr>
-      <w:r>
-        <w:drawing>
-          <wp:inline distT="0" distB="0" distL="114300" distR="114300">
-            <wp:extent cx="6080760" cy="7670800"/>
-            <wp:effectExtent l="0" t="0" r="2540" b="0"/>
-            <wp:docPr id="2" name="Picture 2"/>
-            <wp:cNvGraphicFramePr>
-              <a:graphicFrameLocks xmlns:a="http://schemas.openxmlformats.org/drawingml/2006/main" noChangeAspect="1"/>
-            </wp:cNvGraphicFramePr>
-            <a:graphic xmlns:a="http://schemas.openxmlformats.org/drawingml/2006/main">
-              <a:graphicData uri="http://schemas.openxmlformats.org/drawingml/2006/picture">
-                <pic:pic xmlns:pic="http://schemas.openxmlformats.org/drawingml/2006/picture">
-                  <pic:nvPicPr>
-                    <pic:cNvPr id="2" name="Picture 2"/>
-                    <pic:cNvPicPr>
-                      <a:picLocks noChangeAspect="1"/>
-                    </pic:cNvPicPr>
-                  </pic:nvPicPr>
-                  <pic:blipFill>
-                    <a:blip r:embed="rId15"/>
-                    <a:stretch>
-                      <a:fillRect/>
-                    </a:stretch>
-                  </pic:blipFill>
-                  <pic:spPr>
-                    <a:xfrm>
-                      <a:off x="0" y="0"/>
-                      <a:ext cx="6080760" cy="7671113"/>
-                    </a:xfrm>
-                    <a:prstGeom prst="rect">
-                      <a:avLst/>
-                    </a:prstGeom>
-                  </pic:spPr>
-                </pic:pic>
-              </a:graphicData>
-            </a:graphic>
-          </wp:inline>
-        </w:drawing>
-      </w:r>
-    </w:p>
-    <w:p>
-      <w:r>
-        <w:rPr>
-          <w:rFonts w:ascii="微软雅黑" w:hAnsi="微软雅黑" w:eastAsia="微软雅黑"/>
-        </w:rPr>
-        <w:t>该架构不是“必须全部自研”的蓝图，而是把责任分开：LLM 产生计划与候选；Tool Adapter 保证输入契约和执行边界；求解器/CAD/EDA 产生确定性产物；Evaluator 计算指标；Evidence Ledger 保存版本、条件和失败；Verification Gate 决定当前证据能够支持多强结论。</w:t>
-      </w:r>
-    </w:p>
-    <w:p>
-      <w:pPr>
-        <w:pStyle w:val="4"/>
-      </w:pPr>
-      <w:r>
-        <w:rPr>
-          <w:rFonts w:ascii="微软雅黑" w:hAnsi="微软雅黑" w:eastAsia="微软雅黑"/>
-        </w:rPr>
-        <w:t>4.5 关键研究缺口</w:t>
+        <w:t>4.</w:t>
+      </w:r>
+      <w:r>
+        <w:rPr>
+          <w:rFonts w:hint="eastAsia" w:ascii="微软雅黑" w:hAnsi="微软雅黑" w:eastAsia="微软雅黑"/>
+          <w:lang w:val="en-US" w:eastAsia="zh-CN"/>
+        </w:rPr>
+        <w:t>4</w:t>
+      </w:r>
+      <w:r>
+        <w:rPr>
+          <w:rFonts w:ascii="微软雅黑" w:hAnsi="微软雅黑" w:eastAsia="微软雅黑"/>
+        </w:rPr>
+        <w:t xml:space="preserve"> 关键研究缺口</w:t>
       </w:r>
     </w:p>
     <w:p>
@@ -11598,6 +11560,15 @@
         </w:rPr>
         <w:t xml:space="preserve"> RAG、typed IR、多 Agent、MCP 和 adaptive calling 都可能增加复杂度，其独立贡献尚不清楚。</w:t>
       </w:r>
+    </w:p>
+    <w:p>
+      <w:pPr>
+        <w:spacing w:after="80"/>
+        <w:ind w:left="360" w:hanging="360"/>
+        <w:rPr>
+          <w:rFonts w:ascii="微软雅黑" w:hAnsi="微软雅黑" w:eastAsia="微软雅黑"/>
+        </w:rPr>
+      </w:pPr>
     </w:p>
     <w:p>
       <w:pPr>
@@ -12778,6 +12749,7 @@
       </w:pPr>
     </w:p>
     <w:p/>
+    <w:p/>
     <w:p>
       <w:pPr>
         <w:pStyle w:val="3"/>
@@ -12794,7 +12766,7 @@
         <w:rPr>
           <w:rFonts w:ascii="微软雅黑" w:hAnsi="微软雅黑" w:eastAsia="微软雅黑"/>
         </w:rPr>
-        <w:t>本章只提出候选研究问题，不评估课题组资源，不设计实验，不设定成功阈值，也不选择最终路线。完整条目见</w:t>
+        <w:t>完整条目见</w:t>
       </w:r>
       <w:r>
         <w:fldChar w:fldCharType="begin"/>
@@ -12824,270 +12796,6 @@
           <w:rFonts w:ascii="微软雅黑" w:hAnsi="微软雅黑" w:eastAsia="微软雅黑"/>
         </w:rPr>
         <w:t>。</w:t>
-      </w:r>
-    </w:p>
-    <w:p>
-      <w:pPr>
-        <w:pStyle w:val="4"/>
-      </w:pPr>
-      <w:r>
-        <w:rPr>
-          <w:rFonts w:ascii="微软雅黑" w:hAnsi="微软雅黑" w:eastAsia="微软雅黑"/>
-        </w:rPr>
-        <w:t>6.1 Route A：证据优先的 Agentic PIC Harness</w:t>
-      </w:r>
-    </w:p>
-    <w:p>
-      <w:r>
-        <w:rPr>
-          <w:rFonts w:ascii="微软雅黑" w:hAnsi="微软雅黑" w:eastAsia="微软雅黑"/>
-        </w:rPr>
-        <w:t>研究重点是把 Requirement、Spec、Tool Execution、RESULT、Evaluator、Evidence Ledger 和 Verification Gate 分开，使每个结论可追溯到确定性工具和条件。现有开源组件可提供局部基础，但仍需研究最小 Tool Contract、失败分类、评价器独立性和验证证据语义。最大风险是工作退化为工程封装；只有回答“何种机制显著提升科学可靠性和归因能力”，才形成独立研究价值。</w:t>
-      </w:r>
-    </w:p>
-    <w:p>
-      <w:pPr>
-        <w:pStyle w:val="4"/>
-      </w:pPr>
-      <w:r>
-        <w:rPr>
-          <w:rFonts w:ascii="微软雅黑" w:hAnsi="微软雅黑" w:eastAsia="微软雅黑"/>
-        </w:rPr>
-        <w:t>6.2 Route B：DAS 需求到光电混合集成约束传播</w:t>
-      </w:r>
-    </w:p>
-    <w:p>
-      <w:r>
-        <w:rPr>
-          <w:rFonts w:ascii="微软雅黑" w:hAnsi="微软雅黑" w:eastAsia="微软雅黑"/>
-        </w:rPr>
-        <w:t>研究重点是将 DAS 的距离、分辨率、灵敏度、带宽、偏振和稳定性要求，转为激光、调制、接收、电子、封装和 DSP 的分层约束，并保留来源、单位与外部组件边界。它最直接对应“AI 设计 DAS 芯片”目标，但公开数据分散、跨论文指标不可比和真实工艺/封装参数不足是主要困难。</w:t>
-      </w:r>
-    </w:p>
-    <w:p>
-      <w:pPr>
-        <w:pStyle w:val="4"/>
-      </w:pPr>
-      <w:r>
-        <w:rPr>
-          <w:rFonts w:ascii="微软雅黑" w:hAnsi="微软雅黑" w:eastAsia="微软雅黑"/>
-        </w:rPr>
-        <w:t>6.3 Route C：光子 AI 的误差—精度—系统成本链</w:t>
-      </w:r>
-    </w:p>
-    <w:p>
-      <w:r>
-        <w:rPr>
-          <w:rFonts w:ascii="微软雅黑" w:hAnsi="微软雅黑" w:eastAsia="微软雅黑"/>
-        </w:rPr>
-        <w:t>研究重点是统一器件误差、校准、光学算子、模型精度和完整系统成本的记录边界，从而避免以核心 TOPS/W 代替系统结论。它可连接器件物理和 AI 任务，但领域竞争激烈，跨平台数据不完整，必须避免只做文献归一化或理想化模型。</w:t>
-      </w:r>
-    </w:p>
-    <w:p>
-      <w:pPr>
-        <w:pStyle w:val="4"/>
-      </w:pPr>
-      <w:r>
-        <w:rPr>
-          <w:rFonts w:ascii="微软雅黑" w:hAnsi="微软雅黑" w:eastAsia="微软雅黑"/>
-        </w:rPr>
-        <w:t>6.4 当前结论</w:t>
-      </w:r>
-    </w:p>
-    <w:p>
-      <w:pPr>
-        <w:spacing w:after="80"/>
-        <w:ind w:left="360" w:hanging="360"/>
-      </w:pPr>
-      <w:r>
-        <w:rPr>
-          <w:rFonts w:ascii="微软雅黑" w:hAnsi="微软雅黑" w:eastAsia="微软雅黑"/>
-        </w:rPr>
-        <w:t xml:space="preserve">1. </w:t>
-      </w:r>
-      <w:r>
-        <w:rPr>
-          <w:rFonts w:ascii="微软雅黑" w:hAnsi="微软雅黑" w:eastAsia="微软雅黑"/>
-          <w:b/>
-        </w:rPr>
-        <w:t>DAS</w:t>
-      </w:r>
-      <w:r>
-        <w:rPr>
-          <w:rFonts w:ascii="微软雅黑" w:hAnsi="微软雅黑" w:eastAsia="微软雅黑"/>
-        </w:rPr>
-        <w:t>：已有真实 PIC 和混合集成模块，但完整系统仍高度混合；AI 端到端设计证据缺失。</w:t>
-      </w:r>
-    </w:p>
-    <w:p>
-      <w:pPr>
-        <w:spacing w:after="80"/>
-        <w:ind w:left="360" w:hanging="360"/>
-      </w:pPr>
-      <w:r>
-        <w:rPr>
-          <w:rFonts w:ascii="微软雅黑" w:hAnsi="微软雅黑" w:eastAsia="微软雅黑"/>
-        </w:rPr>
-        <w:t xml:space="preserve">2. </w:t>
-      </w:r>
-      <w:r>
-        <w:rPr>
-          <w:rFonts w:ascii="微软雅黑" w:hAnsi="微软雅黑" w:eastAsia="微软雅黑"/>
-          <w:b/>
-        </w:rPr>
-        <w:t>Photonic AI</w:t>
-      </w:r>
-      <w:r>
-        <w:rPr>
-          <w:rFonts w:ascii="微软雅黑" w:hAnsi="微软雅黑" w:eastAsia="微软雅黑"/>
-        </w:rPr>
-        <w:t>：已进入真实芯片/系统与任务级演示阶段，主要矛盾转向系统边界、误差、控制与可扩展性。</w:t>
-      </w:r>
-    </w:p>
-    <w:p>
-      <w:pPr>
-        <w:spacing w:after="80"/>
-        <w:ind w:left="360" w:hanging="360"/>
-      </w:pPr>
-      <w:r>
-        <w:rPr>
-          <w:rFonts w:ascii="微软雅黑" w:hAnsi="微软雅黑" w:eastAsia="微软雅黑"/>
-        </w:rPr>
-        <w:t xml:space="preserve">3. </w:t>
-      </w:r>
-      <w:r>
-        <w:rPr>
-          <w:rFonts w:ascii="微软雅黑" w:hAnsi="微软雅黑" w:eastAsia="微软雅黑"/>
-          <w:b/>
-        </w:rPr>
-        <w:t>Agentic PIC</w:t>
-      </w:r>
-      <w:r>
-        <w:rPr>
-          <w:rFonts w:ascii="微软雅黑" w:hAnsi="微软雅黑" w:eastAsia="微软雅黑"/>
-        </w:rPr>
-        <w:t>：已形成多个局部闭环，但没有公开、全开源、通用且制造级可信的完整 Harness。</w:t>
-      </w:r>
-    </w:p>
-    <w:p>
-      <w:pPr>
-        <w:spacing w:after="80"/>
-        <w:ind w:left="360" w:hanging="360"/>
-      </w:pPr>
-      <w:r>
-        <w:rPr>
-          <w:rFonts w:ascii="微软雅黑" w:hAnsi="微软雅黑" w:eastAsia="微软雅黑"/>
-        </w:rPr>
-        <w:t xml:space="preserve">4. </w:t>
-      </w:r>
-      <w:r>
-        <w:rPr>
-          <w:rFonts w:ascii="微软雅黑" w:hAnsi="微软雅黑" w:eastAsia="微软雅黑"/>
-          <w:b/>
-        </w:rPr>
-        <w:t>共同机会</w:t>
-      </w:r>
-      <w:r>
-        <w:rPr>
-          <w:rFonts w:ascii="微软雅黑" w:hAnsi="微软雅黑" w:eastAsia="微软雅黑"/>
-        </w:rPr>
-        <w:t>：建立从需求到证据的可追溯关系，比单纯扩大 LLM 生成范围更能暴露真正科研问题。</w:t>
-      </w:r>
-    </w:p>
-    <w:p>
-      <w:pPr>
-        <w:spacing w:after="80"/>
-        <w:ind w:left="360" w:hanging="360"/>
-      </w:pPr>
-      <w:r>
-        <w:rPr>
-          <w:rFonts w:ascii="微软雅黑" w:hAnsi="微软雅黑" w:eastAsia="微软雅黑"/>
-        </w:rPr>
-        <w:t xml:space="preserve">5. </w:t>
-      </w:r>
-      <w:r>
-        <w:rPr>
-          <w:rFonts w:ascii="微软雅黑" w:hAnsi="微软雅黑" w:eastAsia="微软雅黑"/>
-          <w:b/>
-        </w:rPr>
-        <w:t>当前决策边界</w:t>
-      </w:r>
-      <w:r>
-        <w:rPr>
-          <w:rFonts w:ascii="微软雅黑" w:hAnsi="微软雅黑" w:eastAsia="微软雅黑"/>
-        </w:rPr>
-        <w:t>：三条路线均需导师讨论和更多一手证据；本报告不确定最终研究方向。</w:t>
-      </w:r>
-    </w:p>
-    <w:p>
-      <w:pPr>
-        <w:pStyle w:val="4"/>
-      </w:pPr>
-      <w:r>
-        <w:rPr>
-          <w:rFonts w:ascii="微软雅黑" w:hAnsi="微软雅黑" w:eastAsia="微软雅黑"/>
-        </w:rPr>
-        <w:t>6.5 尚待讨论的关键问题</w:t>
-      </w:r>
-    </w:p>
-    <w:p>
-      <w:pPr>
-        <w:pStyle w:val="16"/>
-        <w:spacing w:after="80"/>
-      </w:pPr>
-      <w:r>
-        <w:rPr>
-          <w:rFonts w:ascii="微软雅黑" w:hAnsi="微软雅黑" w:eastAsia="微软雅黑"/>
-        </w:rPr>
-        <w:t>最终科研贡献更希望落在设计方法、具体 DAS 系统还是光子计算硬件评价？</w:t>
-      </w:r>
-    </w:p>
-    <w:p>
-      <w:pPr>
-        <w:pStyle w:val="16"/>
-        <w:spacing w:after="80"/>
-      </w:pPr>
-      <w:r>
-        <w:rPr>
-          <w:rFonts w:ascii="微软雅黑" w:hAnsi="微软雅黑" w:eastAsia="微软雅黑"/>
-        </w:rPr>
-        <w:t>软件流程、物理仿真和实物系统三类证据中，课题目标希望达到哪一层？</w:t>
-      </w:r>
-    </w:p>
-    <w:p>
-      <w:pPr>
-        <w:pStyle w:val="16"/>
-        <w:spacing w:after="80"/>
-      </w:pPr>
-      <w:r>
-        <w:rPr>
-          <w:rFonts w:ascii="微软雅黑" w:hAnsi="微软雅黑" w:eastAsia="微软雅黑"/>
-        </w:rPr>
-        <w:t>哪些公开 PDK、求解器和数据可以作为后续研究事实基础？</w:t>
-      </w:r>
-    </w:p>
-    <w:p>
-      <w:pPr>
-        <w:pStyle w:val="16"/>
-        <w:spacing w:after="80"/>
-      </w:pPr>
-      <w:r>
-        <w:rPr>
-          <w:rFonts w:ascii="微软雅黑" w:hAnsi="微软雅黑" w:eastAsia="微软雅黑"/>
-        </w:rPr>
-        <w:t>对 DAS 与光子 AI，怎样定义公平、完整且可取得数据的系统边界？</w:t>
-      </w:r>
-    </w:p>
-    <w:p>
-      <w:pPr>
-        <w:pStyle w:val="16"/>
-        <w:spacing w:after="80"/>
-      </w:pPr>
-      <w:r>
-        <w:rPr>
-          <w:rFonts w:ascii="微软雅黑" w:hAnsi="微软雅黑" w:eastAsia="微软雅黑"/>
-        </w:rPr>
-        <w:t>Harness 研究如何证明方法贡献，而不只是把现有工具包装为 Agent？</w:t>
       </w:r>
     </w:p>
     <w:p>
@@ -13095,13 +12803,18 @@
         <w:pStyle w:val="4"/>
         <w:keepNext/>
         <w:spacing w:after="120" w:line="278" w:lineRule="auto"/>
+        <w:rPr>
+          <w:sz w:val="24"/>
+          <w:szCs w:val="24"/>
+        </w:rPr>
       </w:pPr>
       <w:r>
         <w:rPr>
-          <w:rFonts w:ascii="Microsoft YaHei" w:hAnsi="Microsoft YaHei" w:eastAsia="Microsoft YaHei"/>
-          <w:sz w:val="22"/>
-        </w:rPr>
-        <w:t>6.6 当前候选主线：物理驱动的自主光子芯片设计</w:t>
+          <w:rFonts w:ascii="微软雅黑" w:hAnsi="微软雅黑" w:eastAsia="微软雅黑"/>
+          <w:sz w:val="24"/>
+          <w:szCs w:val="24"/>
+        </w:rPr>
+        <w:t>当前候选主线：物理驱动的自主光子芯片设计</w:t>
       </w:r>
     </w:p>
     <w:p>
@@ -13110,7 +12823,7 @@
       </w:pPr>
       <w:r>
         <w:rPr>
-          <w:rFonts w:ascii="Microsoft YaHei" w:hAnsi="Microsoft YaHei" w:eastAsia="Microsoft YaHei"/>
+          <w:rFonts w:ascii="微软雅黑" w:hAnsi="微软雅黑" w:eastAsia="微软雅黑"/>
           <w:b/>
           <w:sz w:val="19"/>
         </w:rPr>
@@ -13123,14 +12836,14 @@
       </w:pPr>
       <w:r>
         <w:rPr>
-          <w:rFonts w:ascii="Microsoft YaHei" w:hAnsi="Microsoft YaHei" w:eastAsia="Microsoft YaHei"/>
+          <w:rFonts w:ascii="微软雅黑" w:hAnsi="微软雅黑" w:eastAsia="微软雅黑"/>
           <w:sz w:val="19"/>
         </w:rPr>
         <w:t>状态：</w:t>
       </w:r>
       <w:r>
         <w:rPr>
-          <w:rFonts w:ascii="Microsoft YaHei" w:hAnsi="Microsoft YaHei" w:eastAsia="Microsoft YaHei"/>
+          <w:rFonts w:ascii="微软雅黑" w:hAnsi="微软雅黑" w:eastAsia="微软雅黑"/>
           <w:color w:val="44546A"/>
           <w:sz w:val="19"/>
         </w:rPr>
@@ -13138,7 +12851,7 @@
       </w:r>
       <w:r>
         <w:rPr>
-          <w:rFonts w:ascii="Microsoft YaHei" w:hAnsi="Microsoft YaHei" w:eastAsia="Microsoft YaHei"/>
+          <w:rFonts w:ascii="微软雅黑" w:hAnsi="微软雅黑" w:eastAsia="微软雅黑"/>
           <w:sz w:val="19"/>
         </w:rPr>
         <w:t>，2026-09-30 更新。不是最终定题，未证明创新性或有效性；不改变既有证据截止范围。</w:t>
@@ -13150,7 +12863,7 @@
       </w:pPr>
       <w:r>
         <w:rPr>
-          <w:rFonts w:ascii="Microsoft YaHei" w:hAnsi="Microsoft YaHei" w:eastAsia="Microsoft YaHei"/>
+          <w:rFonts w:ascii="微软雅黑" w:hAnsi="微软雅黑" w:eastAsia="微软雅黑"/>
           <w:sz w:val="19"/>
         </w:rPr>
         <w:t>一句话：研究如何让 PIC Agent 利用器件物理知识和真实仿真反馈进行设计诊断与决策，从“会调用仿真器”进一步发展为“能够根据物理结果自主做设计”。</w:t>
@@ -13164,10 +12877,25 @@
       </w:pPr>
       <w:r>
         <w:rPr>
-          <w:rFonts w:ascii="Microsoft YaHei" w:hAnsi="Microsoft YaHei" w:eastAsia="Microsoft YaHei"/>
+          <w:rFonts w:ascii="微软雅黑" w:hAnsi="微软雅黑" w:eastAsia="微软雅黑"/>
           <w:sz w:val="22"/>
         </w:rPr>
-        <w:t>6.6.1 从已有调研得到的问题</w:t>
+        <w:t>6.</w:t>
+      </w:r>
+      <w:r>
+        <w:rPr>
+          <w:rFonts w:hint="eastAsia" w:ascii="微软雅黑" w:hAnsi="微软雅黑" w:eastAsia="微软雅黑"/>
+          <w:sz w:val="22"/>
+          <w:lang w:val="en-US" w:eastAsia="zh-CN"/>
+        </w:rPr>
+        <w:t>1</w:t>
+      </w:r>
+      <w:r>
+        <w:rPr>
+          <w:rFonts w:ascii="微软雅黑" w:hAnsi="微软雅黑" w:eastAsia="微软雅黑"/>
+          <w:sz w:val="22"/>
+        </w:rPr>
+        <w:t xml:space="preserve"> 候选研究问题</w:t>
       </w:r>
     </w:p>
     <w:p>
@@ -13176,41 +12904,18 @@
       </w:pPr>
       <w:r>
         <w:rPr>
-          <w:rFonts w:ascii="Microsoft YaHei" w:hAnsi="Microsoft YaHei" w:eastAsia="Microsoft YaHei"/>
-          <w:sz w:val="19"/>
-        </w:rPr>
-        <w:t xml:space="preserve">- </w:t>
-      </w:r>
-      <w:r>
-        <w:rPr>
-          <w:rFonts w:ascii="Microsoft YaHei" w:hAnsi="Microsoft YaHei" w:eastAsia="Microsoft YaHei"/>
+          <w:rFonts w:ascii="微软雅黑" w:hAnsi="微软雅黑" w:eastAsia="微软雅黑"/>
           <w:color w:val="44546A"/>
           <w:sz w:val="19"/>
         </w:rPr>
-        <w:t>FACT</w:t>
-      </w:r>
-      <w:r>
-        <w:rPr>
-          <w:rFonts w:ascii="Microsoft YaHei" w:hAnsi="Microsoft YaHei" w:eastAsia="Microsoft YaHei"/>
+        <w:t>USER RESEARCH PREFERENCE</w:t>
+      </w:r>
+      <w:r>
+        <w:rPr>
+          <w:rFonts w:ascii="微软雅黑" w:hAnsi="微软雅黑" w:eastAsia="微软雅黑"/>
           <w:sz w:val="19"/>
         </w:rPr>
-        <w:t>（文献内容核读事实）：</w:t>
-      </w:r>
-      <w:hyperlink r:id="rId19">
-        <w:r>
-          <w:rPr>
-            <w:rFonts w:ascii="Microsoft YaHei" w:hAnsi="Microsoft YaHei" w:eastAsia="Microsoft YaHei"/>
-            <w:color w:val="205493"/>
-          </w:rPr>
-          <w:t>PhIDO</w:t>
-        </w:r>
-      </w:hyperlink>
-      <w:r>
-        <w:rPr>
-          <w:rFonts w:ascii="Microsoft YaHei" w:hAnsi="Microsoft YaHei" w:eastAsia="Microsoft YaHei"/>
-          <w:sz w:val="19"/>
-        </w:rPr>
-        <w:t xml:space="preserve"> Fig. 1 / Table II 的主 benchmark 以结构与 GDS 有效性为成功定义；不能由此推断全波性能达标。</w:t>
+        <w:t>：如何结合 PIC 器件物理知识与数值仿真反馈，使 Agent 对设计结果作出可检验的物理诊断、选择合理的下一步修改，并提高自主设计可靠性？</w:t>
       </w:r>
     </w:p>
     <w:p>
@@ -13219,153 +12924,25 @@
       </w:pPr>
       <w:r>
         <w:rPr>
-          <w:rFonts w:ascii="Microsoft YaHei" w:hAnsi="Microsoft YaHei" w:eastAsia="Microsoft YaHei"/>
+          <w:rFonts w:ascii="微软雅黑" w:hAnsi="微软雅黑" w:eastAsia="微软雅黑"/>
           <w:sz w:val="19"/>
         </w:rPr>
-        <w:t xml:space="preserve">- </w:t>
-      </w:r>
-      <w:r>
-        <w:rPr>
-          <w:rFonts w:ascii="Microsoft YaHei" w:hAnsi="Microsoft YaHei" w:eastAsia="Microsoft YaHei"/>
-          <w:color w:val="44546A"/>
-          <w:sz w:val="19"/>
-        </w:rPr>
-        <w:t>FACT</w:t>
-      </w:r>
-      <w:r>
-        <w:rPr>
-          <w:rFonts w:ascii="Microsoft YaHei" w:hAnsi="Microsoft YaHei" w:eastAsia="Microsoft YaHei"/>
-          <w:sz w:val="19"/>
-        </w:rPr>
-        <w:t>（文献内容核读事实）：</w:t>
-      </w:r>
-      <w:hyperlink r:id="rId20">
-        <w:r>
-          <w:rPr>
-            <w:rFonts w:ascii="Microsoft YaHei" w:hAnsi="Microsoft YaHei" w:eastAsia="Microsoft YaHei"/>
-            <w:color w:val="205493"/>
-          </w:rPr>
-          <w:t>PICopilot</w:t>
-        </w:r>
-      </w:hyperlink>
-      <w:r>
-        <w:rPr>
-          <w:rFonts w:ascii="Microsoft YaHei" w:hAnsi="Microsoft YaHei" w:eastAsia="Microsoft YaHei"/>
-          <w:sz w:val="19"/>
-        </w:rPr>
-        <w:t xml:space="preserve"> §3.6 的内部评价主要是静态代码检查、自定义检查库和 LLM；外部 benchmark 执行评分不等于内部物理仿真迭代。</w:t>
-      </w:r>
-    </w:p>
-    <w:p>
-      <w:pPr>
-        <w:spacing w:after="120" w:line="278" w:lineRule="auto"/>
-      </w:pPr>
-      <w:r>
-        <w:rPr>
-          <w:rFonts w:ascii="Microsoft YaHei" w:hAnsi="Microsoft YaHei" w:eastAsia="Microsoft YaHei"/>
-          <w:sz w:val="19"/>
-        </w:rPr>
-        <w:t xml:space="preserve">- </w:t>
-      </w:r>
-      <w:r>
-        <w:rPr>
-          <w:rFonts w:ascii="Microsoft YaHei" w:hAnsi="Microsoft YaHei" w:eastAsia="Microsoft YaHei"/>
-          <w:color w:val="44546A"/>
-          <w:sz w:val="19"/>
-        </w:rPr>
-        <w:t>AUTHOR CLAIM</w:t>
-      </w:r>
-      <w:r>
-        <w:rPr>
-          <w:rFonts w:ascii="Microsoft YaHei" w:hAnsi="Microsoft YaHei" w:eastAsia="Microsoft YaHei"/>
-          <w:sz w:val="19"/>
-        </w:rPr>
-        <w:t>：</w:t>
-      </w:r>
-      <w:hyperlink r:id="rId21">
-        <w:r>
-          <w:rPr>
-            <w:rFonts w:ascii="Microsoft YaHei" w:hAnsi="Microsoft YaHei" w:eastAsia="Microsoft YaHei"/>
-            <w:color w:val="205493"/>
-          </w:rPr>
-          <w:t>Kharel / AutoPhotonicDesign</w:t>
-        </w:r>
-      </w:hyperlink>
-      <w:r>
-        <w:rPr>
-          <w:rFonts w:ascii="Microsoft YaHei" w:hAnsi="Microsoft YaHei" w:eastAsia="Microsoft YaHei"/>
-          <w:sz w:val="19"/>
-        </w:rPr>
-        <w:t xml:space="preserve"> Fig. 1–6 展示规则闸门、真实求解器反馈和定量验收迭代；Table S2 记录多物理初设曾由专家纠错。这是“领域只会生成脚本”的强反例。</w:t>
-      </w:r>
-    </w:p>
-    <w:p>
-      <w:pPr>
-        <w:spacing w:after="120" w:line="278" w:lineRule="auto"/>
-      </w:pPr>
-      <w:r>
-        <w:rPr>
-          <w:rFonts w:ascii="Microsoft YaHei" w:hAnsi="Microsoft YaHei" w:eastAsia="Microsoft YaHei"/>
-          <w:sz w:val="19"/>
-        </w:rPr>
-        <w:t xml:space="preserve">- </w:t>
-      </w:r>
-      <w:r>
-        <w:rPr>
-          <w:rFonts w:ascii="Microsoft YaHei" w:hAnsi="Microsoft YaHei" w:eastAsia="Microsoft YaHei"/>
-          <w:color w:val="44546A"/>
-          <w:sz w:val="19"/>
-        </w:rPr>
-        <w:t>CODE VERIFIED</w:t>
-      </w:r>
-      <w:r>
-        <w:rPr>
-          <w:rFonts w:ascii="Microsoft YaHei" w:hAnsi="Microsoft YaHei" w:eastAsia="Microsoft YaHei"/>
-          <w:sz w:val="19"/>
-        </w:rPr>
-        <w:t>：沿用既有 TASK-005 固定范围只读源码记录；</w:t>
-      </w:r>
-      <w:r>
-        <w:rPr>
-          <w:rFonts w:ascii="Microsoft YaHei" w:hAnsi="Microsoft YaHei" w:eastAsia="Microsoft YaHei"/>
+        <w:t>研究重点由“需求理解与物理约束处理”进一步转向</w:t>
+      </w:r>
+      <w:r>
+        <w:rPr>
+          <w:rFonts w:ascii="微软雅黑" w:hAnsi="微软雅黑" w:eastAsia="微软雅黑"/>
           <w:b/>
           <w:sz w:val="19"/>
         </w:rPr>
-        <w:t>本次未开展新的源码执行核验</w:t>
-      </w:r>
-      <w:r>
-        <w:rPr>
-          <w:rFonts w:ascii="Microsoft YaHei" w:hAnsi="Microsoft YaHei" w:eastAsia="Microsoft YaHei"/>
+        <w:t>仿真后的结果分析与设计决策</w:t>
+      </w:r>
+      <w:r>
+        <w:rPr>
+          <w:rFonts w:ascii="微软雅黑" w:hAnsi="微软雅黑" w:eastAsia="微软雅黑"/>
           <w:sz w:val="19"/>
         </w:rPr>
-        <w:t>，不能赋予新候选方法此标签。</w:t>
-      </w:r>
-    </w:p>
-    <w:p>
-      <w:pPr>
-        <w:spacing w:after="120" w:line="278" w:lineRule="auto"/>
-      </w:pPr>
-      <w:r>
-        <w:rPr>
-          <w:rFonts w:ascii="Microsoft YaHei" w:hAnsi="Microsoft YaHei" w:eastAsia="Microsoft YaHei"/>
-          <w:sz w:val="19"/>
-        </w:rPr>
-        <w:t xml:space="preserve">- </w:t>
-      </w:r>
-      <w:r>
-        <w:rPr>
-          <w:rFonts w:ascii="Microsoft YaHei" w:hAnsi="Microsoft YaHei" w:eastAsia="Microsoft YaHei"/>
-          <w:color w:val="44546A"/>
-          <w:sz w:val="19"/>
-        </w:rPr>
-        <w:t>INFERENCE</w:t>
-      </w:r>
-      <w:r>
-        <w:rPr>
-          <w:rFonts w:ascii="Microsoft YaHei" w:hAnsi="Microsoft YaHei" w:eastAsia="Microsoft YaHei"/>
-          <w:sz w:val="19"/>
-        </w:rPr>
-        <w:t>：值得追问的是反馈如何支持可核验的诊断与动作选择，而非预设“所有现有 Agent 均缺少物理推理”。相关证据见三项目比较（见仓库同名证据材料）与证据日志（见仓库同名证据材料）。</w:t>
+        <w:t>。DesignSpec（结构化设计规范）仍是必要支持层，不自动成为本候选方向的最高层研究问题。物理推理失败与失败恢复均重要，但研究对象不缩减为单独的恢复模块。</w:t>
       </w:r>
     </w:p>
     <w:p>
@@ -13376,10 +12953,25 @@
       </w:pPr>
       <w:r>
         <w:rPr>
-          <w:rFonts w:ascii="Microsoft YaHei" w:hAnsi="Microsoft YaHei" w:eastAsia="Microsoft YaHei"/>
+          <w:rFonts w:ascii="微软雅黑" w:hAnsi="微软雅黑" w:eastAsia="微软雅黑"/>
           <w:sz w:val="22"/>
         </w:rPr>
-        <w:t>6.6.2 候选研究问题</w:t>
+        <w:t>6.</w:t>
+      </w:r>
+      <w:r>
+        <w:rPr>
+          <w:rFonts w:hint="eastAsia" w:ascii="微软雅黑" w:hAnsi="微软雅黑" w:eastAsia="微软雅黑"/>
+          <w:sz w:val="22"/>
+          <w:lang w:val="en-US" w:eastAsia="zh-CN"/>
+        </w:rPr>
+        <w:t>2</w:t>
+      </w:r>
+      <w:r>
+        <w:rPr>
+          <w:rFonts w:ascii="微软雅黑" w:hAnsi="微软雅黑" w:eastAsia="微软雅黑"/>
+          <w:sz w:val="22"/>
+        </w:rPr>
+        <w:t xml:space="preserve"> 拟议系统概念：双层分工</w:t>
       </w:r>
     </w:p>
     <w:p>
@@ -13388,45 +12980,420 @@
       </w:pPr>
       <w:r>
         <w:rPr>
-          <w:rFonts w:ascii="Microsoft YaHei" w:hAnsi="Microsoft YaHei" w:eastAsia="Microsoft YaHei"/>
+          <w:rFonts w:ascii="微软雅黑" w:hAnsi="微软雅黑" w:eastAsia="微软雅黑"/>
           <w:color w:val="44546A"/>
           <w:sz w:val="19"/>
         </w:rPr>
-        <w:t>USER RESEARCH PREFERENCE</w:t>
-      </w:r>
-      <w:r>
-        <w:rPr>
-          <w:rFonts w:ascii="Microsoft YaHei" w:hAnsi="Microsoft YaHei" w:eastAsia="Microsoft YaHei"/>
+        <w:t>INFERENCE / USER RESEARCH PREFERENCE</w:t>
+      </w:r>
+      <w:r>
+        <w:rPr>
+          <w:rFonts w:ascii="微软雅黑" w:hAnsi="微软雅黑" w:eastAsia="微软雅黑"/>
           <w:sz w:val="19"/>
         </w:rPr>
-        <w:t>：如何结合 PIC 器件物理知识与数值仿真反馈，使 Agent 对设计结果作出可检验的物理诊断、选择合理的下一步修改，并提高自主设计可靠性？</w:t>
+        <w:t>：核心方法具有研究深度，Harness 是证明方法价值的系统载体，而非以工具拼接本身宣称科研贡献。</w:t>
       </w:r>
     </w:p>
+    <w:tbl>
+      <w:tblPr>
+        <w:tblStyle w:val="32"/>
+        <w:tblW w:w="0" w:type="auto"/>
+        <w:tblInd w:w="0" w:type="dxa"/>
+        <w:tblLayout w:type="fixed"/>
+        <w:tblCellMar>
+          <w:top w:w="0" w:type="dxa"/>
+          <w:left w:w="108" w:type="dxa"/>
+          <w:bottom w:w="0" w:type="dxa"/>
+          <w:right w:w="108" w:type="dxa"/>
+        </w:tblCellMar>
+      </w:tblPr>
+      <w:tblGrid>
+        <w:gridCol w:w="3293"/>
+        <w:gridCol w:w="3293"/>
+        <w:gridCol w:w="3293"/>
+      </w:tblGrid>
+      <w:tr>
+        <w:tblPrEx>
+          <w:tblCellMar>
+            <w:top w:w="0" w:type="dxa"/>
+            <w:left w:w="108" w:type="dxa"/>
+            <w:bottom w:w="0" w:type="dxa"/>
+            <w:right w:w="108" w:type="dxa"/>
+          </w:tblCellMar>
+        </w:tblPrEx>
+        <w:trPr>
+          <w:cantSplit/>
+          <w:tblHeader/>
+        </w:trPr>
+        <w:tc>
+          <w:tcPr>
+            <w:tcW w:w="3072" w:type="dxa"/>
+            <w:tcBorders>
+              <w:top w:val="single" w:color="D9D9D9" w:sz="4" w:space="0"/>
+              <w:left w:val="single" w:color="D9D9D9" w:sz="4" w:space="0"/>
+              <w:bottom w:val="single" w:color="D9D9D9" w:sz="4" w:space="0"/>
+              <w:right w:val="single" w:color="D9D9D9" w:sz="4" w:space="0"/>
+            </w:tcBorders>
+            <w:shd w:val="clear" w:color="auto" w:fill="274766"/>
+            <w:tcMar>
+              <w:top w:w="90" w:type="dxa"/>
+              <w:left w:w="90" w:type="dxa"/>
+              <w:bottom w:w="90" w:type="dxa"/>
+              <w:right w:w="90" w:type="dxa"/>
+            </w:tcMar>
+            <w:vAlign w:val="center"/>
+          </w:tcPr>
+          <w:p>
+            <w:pPr>
+              <w:spacing w:after="0" w:line="269" w:lineRule="auto"/>
+            </w:pPr>
+            <w:r>
+              <w:rPr>
+                <w:rFonts w:ascii="微软雅黑" w:hAnsi="微软雅黑" w:eastAsia="微软雅黑"/>
+                <w:b/>
+                <w:color w:val="FFFFFF"/>
+                <w:sz w:val="17"/>
+              </w:rPr>
+              <w:t>层</w:t>
+            </w:r>
+          </w:p>
+        </w:tc>
+        <w:tc>
+          <w:tcPr>
+            <w:tcW w:w="3072" w:type="dxa"/>
+            <w:tcBorders>
+              <w:top w:val="single" w:color="D9D9D9" w:sz="4" w:space="0"/>
+              <w:left w:val="single" w:color="D9D9D9" w:sz="4" w:space="0"/>
+              <w:bottom w:val="single" w:color="D9D9D9" w:sz="4" w:space="0"/>
+              <w:right w:val="single" w:color="D9D9D9" w:sz="4" w:space="0"/>
+            </w:tcBorders>
+            <w:shd w:val="clear" w:color="auto" w:fill="274766"/>
+            <w:tcMar>
+              <w:top w:w="90" w:type="dxa"/>
+              <w:left w:w="90" w:type="dxa"/>
+              <w:bottom w:w="90" w:type="dxa"/>
+              <w:right w:w="90" w:type="dxa"/>
+            </w:tcMar>
+            <w:vAlign w:val="center"/>
+          </w:tcPr>
+          <w:p>
+            <w:pPr>
+              <w:spacing w:after="0" w:line="269" w:lineRule="auto"/>
+            </w:pPr>
+            <w:r>
+              <w:rPr>
+                <w:rFonts w:ascii="微软雅黑" w:hAnsi="微软雅黑" w:eastAsia="微软雅黑"/>
+                <w:b/>
+                <w:color w:val="FFFFFF"/>
+                <w:sz w:val="17"/>
+              </w:rPr>
+              <w:t>拟议职责</w:t>
+            </w:r>
+          </w:p>
+        </w:tc>
+        <w:tc>
+          <w:tcPr>
+            <w:tcW w:w="3072" w:type="dxa"/>
+            <w:tcBorders>
+              <w:top w:val="single" w:color="D9D9D9" w:sz="4" w:space="0"/>
+              <w:left w:val="single" w:color="D9D9D9" w:sz="4" w:space="0"/>
+              <w:bottom w:val="single" w:color="D9D9D9" w:sz="4" w:space="0"/>
+              <w:right w:val="single" w:color="D9D9D9" w:sz="4" w:space="0"/>
+            </w:tcBorders>
+            <w:shd w:val="clear" w:color="auto" w:fill="274766"/>
+            <w:tcMar>
+              <w:top w:w="90" w:type="dxa"/>
+              <w:left w:w="90" w:type="dxa"/>
+              <w:bottom w:w="90" w:type="dxa"/>
+              <w:right w:w="90" w:type="dxa"/>
+            </w:tcMar>
+            <w:vAlign w:val="center"/>
+          </w:tcPr>
+          <w:p>
+            <w:pPr>
+              <w:spacing w:after="0" w:line="269" w:lineRule="auto"/>
+            </w:pPr>
+            <w:r>
+              <w:rPr>
+                <w:rFonts w:ascii="微软雅黑" w:hAnsi="微软雅黑" w:eastAsia="微软雅黑"/>
+                <w:b/>
+                <w:color w:val="FFFFFF"/>
+                <w:sz w:val="17"/>
+              </w:rPr>
+              <w:t>正确性边界</w:t>
+            </w:r>
+          </w:p>
+        </w:tc>
+      </w:tr>
+      <w:tr>
+        <w:tblPrEx>
+          <w:tblCellMar>
+            <w:top w:w="0" w:type="dxa"/>
+            <w:left w:w="108" w:type="dxa"/>
+            <w:bottom w:w="0" w:type="dxa"/>
+            <w:right w:w="108" w:type="dxa"/>
+          </w:tblCellMar>
+        </w:tblPrEx>
+        <w:trPr>
+          <w:cantSplit/>
+        </w:trPr>
+        <w:tc>
+          <w:tcPr>
+            <w:tcW w:w="3072" w:type="dxa"/>
+            <w:tcBorders>
+              <w:top w:val="single" w:color="D9D9D9" w:sz="4" w:space="0"/>
+              <w:left w:val="single" w:color="D9D9D9" w:sz="4" w:space="0"/>
+              <w:bottom w:val="single" w:color="D9D9D9" w:sz="4" w:space="0"/>
+              <w:right w:val="single" w:color="D9D9D9" w:sz="4" w:space="0"/>
+            </w:tcBorders>
+            <w:tcMar>
+              <w:top w:w="90" w:type="dxa"/>
+              <w:left w:w="90" w:type="dxa"/>
+              <w:bottom w:w="90" w:type="dxa"/>
+              <w:right w:w="90" w:type="dxa"/>
+            </w:tcMar>
+            <w:vAlign w:val="center"/>
+          </w:tcPr>
+          <w:p>
+            <w:pPr>
+              <w:spacing w:after="0" w:line="269" w:lineRule="auto"/>
+            </w:pPr>
+            <w:r>
+              <w:rPr>
+                <w:rFonts w:ascii="微软雅黑" w:hAnsi="微软雅黑" w:eastAsia="微软雅黑"/>
+                <w:b w:val="0"/>
+                <w:color w:val="000000"/>
+                <w:sz w:val="17"/>
+              </w:rPr>
+              <w:t>Agent / Harness（智能体与执行框架）</w:t>
+            </w:r>
+          </w:p>
+        </w:tc>
+        <w:tc>
+          <w:tcPr>
+            <w:tcW w:w="3072" w:type="dxa"/>
+            <w:tcBorders>
+              <w:top w:val="single" w:color="D9D9D9" w:sz="4" w:space="0"/>
+              <w:left w:val="single" w:color="D9D9D9" w:sz="4" w:space="0"/>
+              <w:bottom w:val="single" w:color="D9D9D9" w:sz="4" w:space="0"/>
+              <w:right w:val="single" w:color="D9D9D9" w:sz="4" w:space="0"/>
+            </w:tcBorders>
+            <w:tcMar>
+              <w:top w:w="90" w:type="dxa"/>
+              <w:left w:w="90" w:type="dxa"/>
+              <w:bottom w:w="90" w:type="dxa"/>
+              <w:right w:w="90" w:type="dxa"/>
+            </w:tcMar>
+            <w:vAlign w:val="center"/>
+          </w:tcPr>
+          <w:p>
+            <w:pPr>
+              <w:spacing w:after="0" w:line="269" w:lineRule="auto"/>
+            </w:pPr>
+            <w:r>
+              <w:rPr>
+                <w:rFonts w:ascii="微软雅黑" w:hAnsi="微软雅黑" w:eastAsia="微软雅黑"/>
+                <w:b w:val="0"/>
+                <w:color w:val="000000"/>
+                <w:sz w:val="17"/>
+              </w:rPr>
+              <w:t>目标理解、规划、结果解释、原因诊断、动作选择、工具组织、状态与恢复</w:t>
+            </w:r>
+          </w:p>
+        </w:tc>
+        <w:tc>
+          <w:tcPr>
+            <w:tcW w:w="3072" w:type="dxa"/>
+            <w:tcBorders>
+              <w:top w:val="single" w:color="D9D9D9" w:sz="4" w:space="0"/>
+              <w:left w:val="single" w:color="D9D9D9" w:sz="4" w:space="0"/>
+              <w:bottom w:val="single" w:color="D9D9D9" w:sz="4" w:space="0"/>
+              <w:right w:val="single" w:color="D9D9D9" w:sz="4" w:space="0"/>
+            </w:tcBorders>
+            <w:tcMar>
+              <w:top w:w="90" w:type="dxa"/>
+              <w:left w:w="90" w:type="dxa"/>
+              <w:bottom w:w="90" w:type="dxa"/>
+              <w:right w:w="90" w:type="dxa"/>
+            </w:tcMar>
+            <w:vAlign w:val="center"/>
+          </w:tcPr>
+          <w:p>
+            <w:pPr>
+              <w:spacing w:after="0" w:line="269" w:lineRule="auto"/>
+            </w:pPr>
+            <w:r>
+              <w:rPr>
+                <w:rFonts w:ascii="微软雅黑" w:hAnsi="微软雅黑" w:eastAsia="微软雅黑"/>
+                <w:b w:val="0"/>
+                <w:color w:val="000000"/>
+                <w:sz w:val="17"/>
+              </w:rPr>
+              <w:t>可提出达标判断，但必须由确定性评价器复核；解释本身不是物理真值</w:t>
+            </w:r>
+          </w:p>
+        </w:tc>
+      </w:tr>
+      <w:tr>
+        <w:tblPrEx>
+          <w:tblCellMar>
+            <w:top w:w="0" w:type="dxa"/>
+            <w:left w:w="108" w:type="dxa"/>
+            <w:bottom w:w="0" w:type="dxa"/>
+            <w:right w:w="108" w:type="dxa"/>
+          </w:tblCellMar>
+        </w:tblPrEx>
+        <w:trPr>
+          <w:cantSplit/>
+        </w:trPr>
+        <w:tc>
+          <w:tcPr>
+            <w:tcW w:w="3072" w:type="dxa"/>
+            <w:tcBorders>
+              <w:top w:val="single" w:color="D9D9D9" w:sz="4" w:space="0"/>
+              <w:left w:val="single" w:color="D9D9D9" w:sz="4" w:space="0"/>
+              <w:bottom w:val="single" w:color="D9D9D9" w:sz="4" w:space="0"/>
+              <w:right w:val="single" w:color="D9D9D9" w:sz="4" w:space="0"/>
+            </w:tcBorders>
+            <w:shd w:val="clear" w:color="auto" w:fill="F4F7FA"/>
+            <w:tcMar>
+              <w:top w:w="90" w:type="dxa"/>
+              <w:left w:w="90" w:type="dxa"/>
+              <w:bottom w:w="90" w:type="dxa"/>
+              <w:right w:w="90" w:type="dxa"/>
+            </w:tcMar>
+            <w:vAlign w:val="center"/>
+          </w:tcPr>
+          <w:p>
+            <w:pPr>
+              <w:spacing w:after="0" w:line="269" w:lineRule="auto"/>
+            </w:pPr>
+            <w:r>
+              <w:rPr>
+                <w:rFonts w:ascii="微软雅黑" w:hAnsi="微软雅黑" w:eastAsia="微软雅黑"/>
+                <w:b w:val="0"/>
+                <w:color w:val="000000"/>
+                <w:sz w:val="17"/>
+              </w:rPr>
+              <w:t>Physics / Numerical（物理与数值）</w:t>
+            </w:r>
+          </w:p>
+        </w:tc>
+        <w:tc>
+          <w:tcPr>
+            <w:tcW w:w="3072" w:type="dxa"/>
+            <w:tcBorders>
+              <w:top w:val="single" w:color="D9D9D9" w:sz="4" w:space="0"/>
+              <w:left w:val="single" w:color="D9D9D9" w:sz="4" w:space="0"/>
+              <w:bottom w:val="single" w:color="D9D9D9" w:sz="4" w:space="0"/>
+              <w:right w:val="single" w:color="D9D9D9" w:sz="4" w:space="0"/>
+            </w:tcBorders>
+            <w:shd w:val="clear" w:color="auto" w:fill="F4F7FA"/>
+            <w:tcMar>
+              <w:top w:w="90" w:type="dxa"/>
+              <w:left w:w="90" w:type="dxa"/>
+              <w:bottom w:w="90" w:type="dxa"/>
+              <w:right w:w="90" w:type="dxa"/>
+            </w:tcMar>
+            <w:vAlign w:val="center"/>
+          </w:tcPr>
+          <w:p>
+            <w:pPr>
+              <w:spacing w:after="0" w:line="269" w:lineRule="auto"/>
+            </w:pPr>
+            <w:r>
+              <w:rPr>
+                <w:rFonts w:ascii="微软雅黑" w:hAnsi="微软雅黑" w:eastAsia="微软雅黑"/>
+                <w:b w:val="0"/>
+                <w:color w:val="000000"/>
+                <w:sz w:val="17"/>
+              </w:rPr>
+              <w:t>EM solver（电磁求解器）、器件模型、优化器、参数扫描、确定性验证</w:t>
+            </w:r>
+          </w:p>
+        </w:tc>
+        <w:tc>
+          <w:tcPr>
+            <w:tcW w:w="3072" w:type="dxa"/>
+            <w:tcBorders>
+              <w:top w:val="single" w:color="D9D9D9" w:sz="4" w:space="0"/>
+              <w:left w:val="single" w:color="D9D9D9" w:sz="4" w:space="0"/>
+              <w:bottom w:val="single" w:color="D9D9D9" w:sz="4" w:space="0"/>
+              <w:right w:val="single" w:color="D9D9D9" w:sz="4" w:space="0"/>
+            </w:tcBorders>
+            <w:shd w:val="clear" w:color="auto" w:fill="F4F7FA"/>
+            <w:tcMar>
+              <w:top w:w="90" w:type="dxa"/>
+              <w:left w:w="90" w:type="dxa"/>
+              <w:bottom w:w="90" w:type="dxa"/>
+              <w:right w:w="90" w:type="dxa"/>
+            </w:tcMar>
+            <w:vAlign w:val="center"/>
+          </w:tcPr>
+          <w:p>
+            <w:pPr>
+              <w:spacing w:after="0" w:line="269" w:lineRule="auto"/>
+            </w:pPr>
+            <w:r>
+              <w:rPr>
+                <w:rFonts w:ascii="微软雅黑" w:hAnsi="微软雅黑" w:eastAsia="微软雅黑"/>
+                <w:b w:val="0"/>
+                <w:color w:val="000000"/>
+                <w:sz w:val="17"/>
+              </w:rPr>
+              <w:t>提供可追溯的数值证据；结果仍取决于材料、网格、边界、模型与收敛条件</w:t>
+            </w:r>
+          </w:p>
+        </w:tc>
+      </w:tr>
+    </w:tbl>
     <w:p>
       <w:pPr>
         <w:spacing w:after="120" w:line="278" w:lineRule="auto"/>
       </w:pPr>
       <w:r>
         <w:rPr>
-          <w:rFonts w:ascii="Microsoft YaHei" w:hAnsi="Microsoft YaHei" w:eastAsia="Microsoft YaHei"/>
-          <w:sz w:val="19"/>
-        </w:rPr>
-        <w:t>研究重点由“需求理解与物理约束处理”进一步转向</w:t>
-      </w:r>
-      <w:r>
-        <w:rPr>
-          <w:rFonts w:ascii="Microsoft YaHei" w:hAnsi="Microsoft YaHei" w:eastAsia="Microsoft YaHei"/>
+          <w:rFonts w:ascii="微软雅黑" w:hAnsi="微软雅黑" w:eastAsia="微软雅黑"/>
           <w:b/>
           <w:sz w:val="19"/>
         </w:rPr>
-        <w:t>仿真后的结果分析与设计决策</w:t>
-      </w:r>
-      <w:r>
-        <w:rPr>
-          <w:rFonts w:ascii="Microsoft YaHei" w:hAnsi="Microsoft YaHei" w:eastAsia="Microsoft YaHei"/>
+        <w:t>LLM 不代替 Maxwell solver（麦克斯韦方程求解器）。</w:t>
+      </w:r>
+      <w:r>
+        <w:rPr>
+          <w:rFonts w:ascii="微软雅黑" w:hAnsi="微软雅黑" w:eastAsia="微软雅黑"/>
           <w:sz w:val="19"/>
         </w:rPr>
-        <w:t>。DesignSpec（结构化设计规范）仍是必要支持层，不自动成为本候选方向的最高层研究问题。物理推理失败与失败恢复均重要，但研究对象不缩减为单独的恢复模块。</w:t>
+        <w:t xml:space="preserve"> 调用求解器不等于物理正确，单次性能达标不等于工艺签核。</w:t>
+      </w:r>
+    </w:p>
+    <w:p>
+      <w:pPr>
+        <w:pStyle w:val="5"/>
+        <w:keepNext/>
+        <w:spacing w:after="120" w:line="278" w:lineRule="auto"/>
+      </w:pPr>
+      <w:r>
+        <w:rPr>
+          <w:rFonts w:ascii="微软雅黑" w:hAnsi="微软雅黑" w:eastAsia="微软雅黑"/>
+          <w:sz w:val="22"/>
+        </w:rPr>
+        <w:t>6.</w:t>
+      </w:r>
+      <w:r>
+        <w:rPr>
+          <w:rFonts w:hint="eastAsia" w:ascii="微软雅黑" w:hAnsi="微软雅黑" w:eastAsia="微软雅黑"/>
+          <w:sz w:val="22"/>
+          <w:lang w:val="en-US" w:eastAsia="zh-CN"/>
+        </w:rPr>
+        <w:t>3</w:t>
+      </w:r>
+      <w:r>
+        <w:rPr>
+          <w:rFonts w:ascii="微软雅黑" w:hAnsi="微软雅黑" w:eastAsia="微软雅黑"/>
+          <w:sz w:val="22"/>
+        </w:rPr>
+        <w:t xml:space="preserve"> Physics reasoning（物理推理）在 Harness 中的位置</w:t>
       </w:r>
     </w:p>
     <w:p>
@@ -13437,10 +13404,25 @@
       </w:pPr>
       <w:r>
         <w:rPr>
-          <w:rFonts w:ascii="Microsoft YaHei" w:hAnsi="Microsoft YaHei" w:eastAsia="Microsoft YaHei"/>
+          <w:rFonts w:ascii="微软雅黑" w:hAnsi="微软雅黑" w:eastAsia="微软雅黑"/>
           <w:sz w:val="22"/>
         </w:rPr>
-        <w:t>图 1｜研究主线（拟议概念，不是已实现系统）</w:t>
+        <w:t xml:space="preserve">图 </w:t>
+      </w:r>
+      <w:r>
+        <w:rPr>
+          <w:rFonts w:hint="eastAsia" w:ascii="微软雅黑" w:hAnsi="微软雅黑" w:eastAsia="微软雅黑"/>
+          <w:sz w:val="22"/>
+          <w:lang w:val="en-US" w:eastAsia="zh-CN"/>
+        </w:rPr>
+        <w:t>1</w:t>
+      </w:r>
+      <w:r>
+        <w:rPr>
+          <w:rFonts w:ascii="微软雅黑" w:hAnsi="微软雅黑" w:eastAsia="微软雅黑"/>
+          <w:sz w:val="22"/>
+        </w:rPr>
+        <w:t>｜完整流程中的研究集中区域</w:t>
       </w:r>
     </w:p>
     <w:p>
@@ -13451,478 +13433,24 @@
       </w:pPr>
       <w:r>
         <w:drawing>
-          <wp:inline xmlns:a="http://schemas.openxmlformats.org/drawingml/2006/main" xmlns:pic="http://schemas.openxmlformats.org/drawingml/2006/picture">
-            <wp:extent cx="5852160" cy="1627632"/>
-            <wp:docPr id="11" name="Picture 11"/>
+          <wp:inline distT="0" distB="0" distL="114300" distR="114300">
+            <wp:extent cx="5852160" cy="2047875"/>
+            <wp:effectExtent l="0" t="0" r="15240" b="9525"/>
+            <wp:docPr id="12" name="Picture 12"/>
             <wp:cNvGraphicFramePr>
-              <a:graphicFrameLocks noChangeAspect="1"/>
+              <a:graphicFrameLocks xmlns:a="http://schemas.openxmlformats.org/drawingml/2006/main" noChangeAspect="1"/>
             </wp:cNvGraphicFramePr>
-            <a:graphic>
+            <a:graphic xmlns:a="http://schemas.openxmlformats.org/drawingml/2006/main">
               <a:graphicData uri="http://schemas.openxmlformats.org/drawingml/2006/picture">
-                <pic:pic>
+                <pic:pic xmlns:pic="http://schemas.openxmlformats.org/drawingml/2006/picture">
                   <pic:nvPicPr>
-                    <pic:cNvPr id="0" name="concept-1.png"/>
-                    <pic:cNvPicPr/>
+                    <pic:cNvPr id="12" name="Picture 12"/>
+                    <pic:cNvPicPr>
+                      <a:picLocks noChangeAspect="1"/>
+                    </pic:cNvPicPr>
                   </pic:nvPicPr>
                   <pic:blipFill>
-                    <a:blip r:embed="rId22"/>
-                    <a:stretch>
-                      <a:fillRect/>
-                    </a:stretch>
-                  </pic:blipFill>
-                  <pic:spPr>
-                    <a:xfrm>
-                      <a:off x="0" y="0"/>
-                      <a:ext cx="5852160" cy="1627632"/>
-                    </a:xfrm>
-                    <a:prstGeom prst="rect"/>
-                  </pic:spPr>
-                </pic:pic>
-              </a:graphicData>
-            </a:graphic>
-          </wp:inline>
-        </w:drawing>
-      </w:r>
-    </w:p>
-    <w:p>
-      <w:pPr>
-        <w:spacing w:after="80" w:line="278" w:lineRule="auto"/>
-      </w:pPr>
-      <w:r>
-        <w:rPr>
-          <w:rFonts w:ascii="Microsoft YaHei" w:hAnsi="Microsoft YaHei" w:eastAsia="Microsoft YaHei"/>
-          <w:sz w:val="16"/>
-        </w:rPr>
-        <w:t>候选方向概念图 1（INFERENCE / USER RESEARCH PREFERENCE；非已实现系统或实验结果）</w:t>
-      </w:r>
-    </w:p>
-    <w:p>
-      <w:pPr>
-        <w:pStyle w:val="5"/>
-        <w:keepNext/>
-        <w:spacing w:after="120" w:line="278" w:lineRule="auto"/>
-      </w:pPr>
-      <w:r>
-        <w:rPr>
-          <w:rFonts w:ascii="Microsoft YaHei" w:hAnsi="Microsoft YaHei" w:eastAsia="Microsoft YaHei"/>
-          <w:sz w:val="22"/>
-        </w:rPr>
-        <w:t>6.6.3 拟议系统概念：双层分工</w:t>
-      </w:r>
-    </w:p>
-    <w:p>
-      <w:pPr>
-        <w:spacing w:after="120" w:line="278" w:lineRule="auto"/>
-      </w:pPr>
-      <w:r>
-        <w:rPr>
-          <w:rFonts w:ascii="Microsoft YaHei" w:hAnsi="Microsoft YaHei" w:eastAsia="Microsoft YaHei"/>
-          <w:color w:val="44546A"/>
-          <w:sz w:val="19"/>
-        </w:rPr>
-        <w:t>INFERENCE / USER RESEARCH PREFERENCE</w:t>
-      </w:r>
-      <w:r>
-        <w:rPr>
-          <w:rFonts w:ascii="Microsoft YaHei" w:hAnsi="Microsoft YaHei" w:eastAsia="Microsoft YaHei"/>
-          <w:sz w:val="19"/>
-        </w:rPr>
-        <w:t>：核心方法具有研究深度，Harness 是证明方法价值的系统载体，而非以工具拼接本身宣称科研贡献。</w:t>
-      </w:r>
-    </w:p>
-    <w:tbl>
-      <w:tblPr>
-        <w:tblW w:type="auto" w:w="0"/>
-        <w:tblLayout w:type="fixed"/>
-        <w:tblLook w:firstColumn="1" w:firstRow="1" w:lastColumn="0" w:lastRow="0" w:noHBand="0" w:noVBand="1" w:val="04A0"/>
-      </w:tblPr>
-      <w:tblGrid>
-        <w:gridCol w:w="3293"/>
-        <w:gridCol w:w="3293"/>
-        <w:gridCol w:w="3293"/>
-      </w:tblGrid>
-      <w:tr>
-        <w:trPr>
-          <w:cantSplit/>
-          <w:tblHeader w:val="true"/>
-        </w:trPr>
-        <w:tc>
-          <w:tcPr>
-            <w:tcW w:type="dxa" w:w="3072"/>
-            <w:vAlign w:val="center"/>
-            <w:tcBorders>
-              <w:top w:val="single" w:sz="4" w:color="D9D9D9"/>
-              <w:left w:val="single" w:sz="4" w:color="D9D9D9"/>
-              <w:bottom w:val="single" w:sz="4" w:color="D9D9D9"/>
-              <w:right w:val="single" w:sz="4" w:color="D9D9D9"/>
-            </w:tcBorders>
-            <w:tcMar>
-              <w:top w:w="90" w:type="dxa"/>
-              <w:start w:w="90" w:type="dxa"/>
-              <w:bottom w:w="90" w:type="dxa"/>
-              <w:end w:w="90" w:type="dxa"/>
-            </w:tcMar>
-            <w:shd w:fill="274766"/>
-          </w:tcPr>
-          <w:p>
-            <w:pPr>
-              <w:spacing w:after="0" w:line="269" w:lineRule="auto"/>
-            </w:pPr>
-            <w:r>
-              <w:rPr>
-                <w:rFonts w:ascii="Microsoft YaHei" w:hAnsi="Microsoft YaHei" w:eastAsia="Microsoft YaHei"/>
-                <w:b/>
-                <w:color w:val="FFFFFF"/>
-                <w:sz w:val="17"/>
-              </w:rPr>
-              <w:t>层</w:t>
-            </w:r>
-          </w:p>
-        </w:tc>
-        <w:tc>
-          <w:tcPr>
-            <w:tcW w:type="dxa" w:w="3072"/>
-            <w:vAlign w:val="center"/>
-            <w:tcBorders>
-              <w:top w:val="single" w:sz="4" w:color="D9D9D9"/>
-              <w:left w:val="single" w:sz="4" w:color="D9D9D9"/>
-              <w:bottom w:val="single" w:sz="4" w:color="D9D9D9"/>
-              <w:right w:val="single" w:sz="4" w:color="D9D9D9"/>
-            </w:tcBorders>
-            <w:tcMar>
-              <w:top w:w="90" w:type="dxa"/>
-              <w:start w:w="90" w:type="dxa"/>
-              <w:bottom w:w="90" w:type="dxa"/>
-              <w:end w:w="90" w:type="dxa"/>
-            </w:tcMar>
-            <w:shd w:fill="274766"/>
-          </w:tcPr>
-          <w:p>
-            <w:pPr>
-              <w:spacing w:after="0" w:line="269" w:lineRule="auto"/>
-            </w:pPr>
-            <w:r>
-              <w:rPr>
-                <w:rFonts w:ascii="Microsoft YaHei" w:hAnsi="Microsoft YaHei" w:eastAsia="Microsoft YaHei"/>
-                <w:b/>
-                <w:color w:val="FFFFFF"/>
-                <w:sz w:val="17"/>
-              </w:rPr>
-              <w:t>拟议职责</w:t>
-            </w:r>
-          </w:p>
-        </w:tc>
-        <w:tc>
-          <w:tcPr>
-            <w:tcW w:type="dxa" w:w="3072"/>
-            <w:vAlign w:val="center"/>
-            <w:tcBorders>
-              <w:top w:val="single" w:sz="4" w:color="D9D9D9"/>
-              <w:left w:val="single" w:sz="4" w:color="D9D9D9"/>
-              <w:bottom w:val="single" w:sz="4" w:color="D9D9D9"/>
-              <w:right w:val="single" w:sz="4" w:color="D9D9D9"/>
-            </w:tcBorders>
-            <w:tcMar>
-              <w:top w:w="90" w:type="dxa"/>
-              <w:start w:w="90" w:type="dxa"/>
-              <w:bottom w:w="90" w:type="dxa"/>
-              <w:end w:w="90" w:type="dxa"/>
-            </w:tcMar>
-            <w:shd w:fill="274766"/>
-          </w:tcPr>
-          <w:p>
-            <w:pPr>
-              <w:spacing w:after="0" w:line="269" w:lineRule="auto"/>
-            </w:pPr>
-            <w:r>
-              <w:rPr>
-                <w:rFonts w:ascii="Microsoft YaHei" w:hAnsi="Microsoft YaHei" w:eastAsia="Microsoft YaHei"/>
-                <w:b/>
-                <w:color w:val="FFFFFF"/>
-                <w:sz w:val="17"/>
-              </w:rPr>
-              <w:t>正确性边界</w:t>
-            </w:r>
-          </w:p>
-        </w:tc>
-      </w:tr>
-      <w:tr>
-        <w:trPr>
-          <w:cantSplit/>
-        </w:trPr>
-        <w:tc>
-          <w:tcPr>
-            <w:tcW w:type="dxa" w:w="3072"/>
-            <w:vAlign w:val="center"/>
-            <w:tcBorders>
-              <w:top w:val="single" w:sz="4" w:color="D9D9D9"/>
-              <w:left w:val="single" w:sz="4" w:color="D9D9D9"/>
-              <w:bottom w:val="single" w:sz="4" w:color="D9D9D9"/>
-              <w:right w:val="single" w:sz="4" w:color="D9D9D9"/>
-            </w:tcBorders>
-            <w:tcMar>
-              <w:top w:w="90" w:type="dxa"/>
-              <w:start w:w="90" w:type="dxa"/>
-              <w:bottom w:w="90" w:type="dxa"/>
-              <w:end w:w="90" w:type="dxa"/>
-            </w:tcMar>
-          </w:tcPr>
-          <w:p>
-            <w:pPr>
-              <w:spacing w:after="0" w:line="269" w:lineRule="auto"/>
-            </w:pPr>
-            <w:r>
-              <w:rPr>
-                <w:rFonts w:ascii="Microsoft YaHei" w:hAnsi="Microsoft YaHei" w:eastAsia="Microsoft YaHei"/>
-                <w:b w:val="0"/>
-                <w:color w:val="000000"/>
-                <w:sz w:val="17"/>
-              </w:rPr>
-              <w:t>Agent / Harness（智能体与执行框架）</w:t>
-            </w:r>
-          </w:p>
-        </w:tc>
-        <w:tc>
-          <w:tcPr>
-            <w:tcW w:type="dxa" w:w="3072"/>
-            <w:vAlign w:val="center"/>
-            <w:tcBorders>
-              <w:top w:val="single" w:sz="4" w:color="D9D9D9"/>
-              <w:left w:val="single" w:sz="4" w:color="D9D9D9"/>
-              <w:bottom w:val="single" w:sz="4" w:color="D9D9D9"/>
-              <w:right w:val="single" w:sz="4" w:color="D9D9D9"/>
-            </w:tcBorders>
-            <w:tcMar>
-              <w:top w:w="90" w:type="dxa"/>
-              <w:start w:w="90" w:type="dxa"/>
-              <w:bottom w:w="90" w:type="dxa"/>
-              <w:end w:w="90" w:type="dxa"/>
-            </w:tcMar>
-          </w:tcPr>
-          <w:p>
-            <w:pPr>
-              <w:spacing w:after="0" w:line="269" w:lineRule="auto"/>
-            </w:pPr>
-            <w:r>
-              <w:rPr>
-                <w:rFonts w:ascii="Microsoft YaHei" w:hAnsi="Microsoft YaHei" w:eastAsia="Microsoft YaHei"/>
-                <w:b w:val="0"/>
-                <w:color w:val="000000"/>
-                <w:sz w:val="17"/>
-              </w:rPr>
-              <w:t>目标理解、规划、结果解释、原因诊断、动作选择、工具组织、状态与恢复</w:t>
-            </w:r>
-          </w:p>
-        </w:tc>
-        <w:tc>
-          <w:tcPr>
-            <w:tcW w:type="dxa" w:w="3072"/>
-            <w:vAlign w:val="center"/>
-            <w:tcBorders>
-              <w:top w:val="single" w:sz="4" w:color="D9D9D9"/>
-              <w:left w:val="single" w:sz="4" w:color="D9D9D9"/>
-              <w:bottom w:val="single" w:sz="4" w:color="D9D9D9"/>
-              <w:right w:val="single" w:sz="4" w:color="D9D9D9"/>
-            </w:tcBorders>
-            <w:tcMar>
-              <w:top w:w="90" w:type="dxa"/>
-              <w:start w:w="90" w:type="dxa"/>
-              <w:bottom w:w="90" w:type="dxa"/>
-              <w:end w:w="90" w:type="dxa"/>
-            </w:tcMar>
-          </w:tcPr>
-          <w:p>
-            <w:pPr>
-              <w:spacing w:after="0" w:line="269" w:lineRule="auto"/>
-            </w:pPr>
-            <w:r>
-              <w:rPr>
-                <w:rFonts w:ascii="Microsoft YaHei" w:hAnsi="Microsoft YaHei" w:eastAsia="Microsoft YaHei"/>
-                <w:b w:val="0"/>
-                <w:color w:val="000000"/>
-                <w:sz w:val="17"/>
-              </w:rPr>
-              <w:t>可提出达标判断，但必须由确定性评价器复核；解释本身不是物理真值</w:t>
-            </w:r>
-          </w:p>
-        </w:tc>
-      </w:tr>
-      <w:tr>
-        <w:trPr>
-          <w:cantSplit/>
-        </w:trPr>
-        <w:tc>
-          <w:tcPr>
-            <w:tcW w:type="dxa" w:w="3072"/>
-            <w:vAlign w:val="center"/>
-            <w:tcBorders>
-              <w:top w:val="single" w:sz="4" w:color="D9D9D9"/>
-              <w:left w:val="single" w:sz="4" w:color="D9D9D9"/>
-              <w:bottom w:val="single" w:sz="4" w:color="D9D9D9"/>
-              <w:right w:val="single" w:sz="4" w:color="D9D9D9"/>
-            </w:tcBorders>
-            <w:tcMar>
-              <w:top w:w="90" w:type="dxa"/>
-              <w:start w:w="90" w:type="dxa"/>
-              <w:bottom w:w="90" w:type="dxa"/>
-              <w:end w:w="90" w:type="dxa"/>
-            </w:tcMar>
-            <w:shd w:fill="F4F7FA"/>
-          </w:tcPr>
-          <w:p>
-            <w:pPr>
-              <w:spacing w:after="0" w:line="269" w:lineRule="auto"/>
-            </w:pPr>
-            <w:r>
-              <w:rPr>
-                <w:rFonts w:ascii="Microsoft YaHei" w:hAnsi="Microsoft YaHei" w:eastAsia="Microsoft YaHei"/>
-                <w:b w:val="0"/>
-                <w:color w:val="000000"/>
-                <w:sz w:val="17"/>
-              </w:rPr>
-              <w:t>Physics / Numerical（物理与数值）</w:t>
-            </w:r>
-          </w:p>
-        </w:tc>
-        <w:tc>
-          <w:tcPr>
-            <w:tcW w:type="dxa" w:w="3072"/>
-            <w:vAlign w:val="center"/>
-            <w:tcBorders>
-              <w:top w:val="single" w:sz="4" w:color="D9D9D9"/>
-              <w:left w:val="single" w:sz="4" w:color="D9D9D9"/>
-              <w:bottom w:val="single" w:sz="4" w:color="D9D9D9"/>
-              <w:right w:val="single" w:sz="4" w:color="D9D9D9"/>
-            </w:tcBorders>
-            <w:tcMar>
-              <w:top w:w="90" w:type="dxa"/>
-              <w:start w:w="90" w:type="dxa"/>
-              <w:bottom w:w="90" w:type="dxa"/>
-              <w:end w:w="90" w:type="dxa"/>
-            </w:tcMar>
-            <w:shd w:fill="F4F7FA"/>
-          </w:tcPr>
-          <w:p>
-            <w:pPr>
-              <w:spacing w:after="0" w:line="269" w:lineRule="auto"/>
-            </w:pPr>
-            <w:r>
-              <w:rPr>
-                <w:rFonts w:ascii="Microsoft YaHei" w:hAnsi="Microsoft YaHei" w:eastAsia="Microsoft YaHei"/>
-                <w:b w:val="0"/>
-                <w:color w:val="000000"/>
-                <w:sz w:val="17"/>
-              </w:rPr>
-              <w:t>EM solver（电磁求解器）、器件模型、优化器、参数扫描、确定性验证</w:t>
-            </w:r>
-          </w:p>
-        </w:tc>
-        <w:tc>
-          <w:tcPr>
-            <w:tcW w:type="dxa" w:w="3072"/>
-            <w:vAlign w:val="center"/>
-            <w:tcBorders>
-              <w:top w:val="single" w:sz="4" w:color="D9D9D9"/>
-              <w:left w:val="single" w:sz="4" w:color="D9D9D9"/>
-              <w:bottom w:val="single" w:sz="4" w:color="D9D9D9"/>
-              <w:right w:val="single" w:sz="4" w:color="D9D9D9"/>
-            </w:tcBorders>
-            <w:tcMar>
-              <w:top w:w="90" w:type="dxa"/>
-              <w:start w:w="90" w:type="dxa"/>
-              <w:bottom w:w="90" w:type="dxa"/>
-              <w:end w:w="90" w:type="dxa"/>
-            </w:tcMar>
-            <w:shd w:fill="F4F7FA"/>
-          </w:tcPr>
-          <w:p>
-            <w:pPr>
-              <w:spacing w:after="0" w:line="269" w:lineRule="auto"/>
-            </w:pPr>
-            <w:r>
-              <w:rPr>
-                <w:rFonts w:ascii="Microsoft YaHei" w:hAnsi="Microsoft YaHei" w:eastAsia="Microsoft YaHei"/>
-                <w:b w:val="0"/>
-                <w:color w:val="000000"/>
-                <w:sz w:val="17"/>
-              </w:rPr>
-              <w:t>提供可追溯的数值证据；结果仍取决于材料、网格、边界、模型与收敛条件</w:t>
-            </w:r>
-          </w:p>
-        </w:tc>
-      </w:tr>
-    </w:tbl>
-    <w:p>
-      <w:pPr>
-        <w:spacing w:after="120" w:line="278" w:lineRule="auto"/>
-      </w:pPr>
-      <w:r>
-        <w:rPr>
-          <w:rFonts w:ascii="Microsoft YaHei" w:hAnsi="Microsoft YaHei" w:eastAsia="Microsoft YaHei"/>
-          <w:b/>
-          <w:sz w:val="19"/>
-        </w:rPr>
-        <w:t>LLM 不代替 Maxwell solver（麦克斯韦方程求解器）。</w:t>
-      </w:r>
-      <w:r>
-        <w:rPr>
-          <w:rFonts w:ascii="Microsoft YaHei" w:hAnsi="Microsoft YaHei" w:eastAsia="Microsoft YaHei"/>
-          <w:sz w:val="19"/>
-        </w:rPr>
-        <w:t xml:space="preserve"> 调用求解器不等于物理正确，单次性能达标不等于工艺签核。</w:t>
-      </w:r>
-    </w:p>
-    <w:p>
-      <w:pPr>
-        <w:pStyle w:val="5"/>
-        <w:keepNext/>
-        <w:spacing w:after="120" w:line="278" w:lineRule="auto"/>
-      </w:pPr>
-      <w:r>
-        <w:rPr>
-          <w:rFonts w:ascii="Microsoft YaHei" w:hAnsi="Microsoft YaHei" w:eastAsia="Microsoft YaHei"/>
-          <w:sz w:val="22"/>
-        </w:rPr>
-        <w:t>6.6.4 Physics reasoning（物理推理）在 Harness 中的位置</w:t>
-      </w:r>
-    </w:p>
-    <w:p>
-      <w:pPr>
-        <w:pStyle w:val="6"/>
-        <w:keepNext/>
-        <w:spacing w:after="120" w:line="278" w:lineRule="auto"/>
-      </w:pPr>
-      <w:r>
-        <w:rPr>
-          <w:rFonts w:ascii="Microsoft YaHei" w:hAnsi="Microsoft YaHei" w:eastAsia="Microsoft YaHei"/>
-          <w:sz w:val="22"/>
-        </w:rPr>
-        <w:t>图 2｜完整流程中的研究集中区域</w:t>
-      </w:r>
-    </w:p>
-    <w:p>
-      <w:pPr>
-        <w:keepNext/>
-        <w:spacing w:before="100" w:after="20"/>
-        <w:jc w:val="center"/>
-      </w:pPr>
-      <w:r>
-        <w:drawing>
-          <wp:inline xmlns:a="http://schemas.openxmlformats.org/drawingml/2006/main" xmlns:pic="http://schemas.openxmlformats.org/drawingml/2006/picture">
-            <wp:extent cx="5852160" cy="2048256"/>
-            <wp:docPr id="12" name="Picture 12"/>
-            <wp:cNvGraphicFramePr>
-              <a:graphicFrameLocks noChangeAspect="1"/>
-            </wp:cNvGraphicFramePr>
-            <a:graphic>
-              <a:graphicData uri="http://schemas.openxmlformats.org/drawingml/2006/picture">
-                <pic:pic>
-                  <pic:nvPicPr>
-                    <pic:cNvPr id="0" name="concept-2.png"/>
-                    <pic:cNvPicPr/>
-                  </pic:nvPicPr>
-                  <pic:blipFill>
-                    <a:blip r:embed="rId23"/>
+                    <a:blip r:embed="rId15"/>
                     <a:stretch>
                       <a:fillRect/>
                     </a:stretch>
@@ -13932,7 +13460,9 @@
                       <a:off x="0" y="0"/>
                       <a:ext cx="5852160" cy="2048256"/>
                     </a:xfrm>
-                    <a:prstGeom prst="rect"/>
+                    <a:prstGeom prst="rect">
+                      <a:avLst/>
+                    </a:prstGeom>
                   </pic:spPr>
                 </pic:pic>
               </a:graphicData>
@@ -13947,10 +13477,25 @@
       </w:pPr>
       <w:r>
         <w:rPr>
-          <w:rFonts w:ascii="Microsoft YaHei" w:hAnsi="Microsoft YaHei" w:eastAsia="Microsoft YaHei"/>
+          <w:rFonts w:ascii="微软雅黑" w:hAnsi="微软雅黑" w:eastAsia="微软雅黑"/>
           <w:sz w:val="16"/>
         </w:rPr>
-        <w:t>候选方向概念图 2（INFERENCE / USER RESEARCH PREFERENCE；非已实现系统或实验结果）</w:t>
+        <w:t xml:space="preserve">候选方向概念图 </w:t>
+      </w:r>
+      <w:r>
+        <w:rPr>
+          <w:rFonts w:hint="eastAsia"/>
+          <w:sz w:val="16"/>
+          <w:lang w:val="en-US" w:eastAsia="zh-CN"/>
+        </w:rPr>
+        <w:t>1</w:t>
+      </w:r>
+      <w:r>
+        <w:rPr>
+          <w:rFonts w:ascii="微软雅黑" w:hAnsi="微软雅黑" w:eastAsia="微软雅黑"/>
+          <w:sz w:val="16"/>
+        </w:rPr>
+        <w:t>（INFERENCE / USER RESEARCH PREFERENCE；非已实现系统或实验结果）</w:t>
       </w:r>
     </w:p>
     <w:p>
@@ -13959,7 +13504,7 @@
       </w:pPr>
       <w:r>
         <w:rPr>
-          <w:rFonts w:ascii="Microsoft YaHei" w:hAnsi="Microsoft YaHei" w:eastAsia="Microsoft YaHei"/>
+          <w:rFonts w:ascii="微软雅黑" w:hAnsi="微软雅黑" w:eastAsia="微软雅黑"/>
           <w:color w:val="44546A"/>
           <w:sz w:val="19"/>
         </w:rPr>
@@ -13967,7 +13512,7 @@
       </w:r>
       <w:r>
         <w:rPr>
-          <w:rFonts w:ascii="Microsoft YaHei" w:hAnsi="Microsoft YaHei" w:eastAsia="Microsoft YaHei"/>
+          <w:rFonts w:ascii="微软雅黑" w:hAnsi="微软雅黑" w:eastAsia="微软雅黑"/>
           <w:sz w:val="19"/>
         </w:rPr>
         <w:t>：诊断应形成能被下一轮仿真检验的预测，而非仅生成听起来合理的解释；记录输入条件、结果、诊断假设、选择理由和后续反馈，有助于识别错误因果解释。这是候选方法要求，不是已验证增益。</w:t>
@@ -13981,10 +13526,25 @@
       </w:pPr>
       <w:r>
         <w:rPr>
-          <w:rFonts w:ascii="Microsoft YaHei" w:hAnsi="Microsoft YaHei" w:eastAsia="Microsoft YaHei"/>
+          <w:rFonts w:ascii="微软雅黑" w:hAnsi="微软雅黑" w:eastAsia="微软雅黑"/>
           <w:sz w:val="22"/>
         </w:rPr>
-        <w:t>6.6.5 与传统优化 / 逆设计的关系</w:t>
+        <w:t>6.</w:t>
+      </w:r>
+      <w:r>
+        <w:rPr>
+          <w:rFonts w:hint="eastAsia" w:ascii="微软雅黑" w:hAnsi="微软雅黑" w:eastAsia="微软雅黑"/>
+          <w:sz w:val="22"/>
+          <w:lang w:val="en-US" w:eastAsia="zh-CN"/>
+        </w:rPr>
+        <w:t>4</w:t>
+      </w:r>
+      <w:r>
+        <w:rPr>
+          <w:rFonts w:ascii="微软雅黑" w:hAnsi="微软雅黑" w:eastAsia="微软雅黑"/>
+          <w:sz w:val="22"/>
+        </w:rPr>
+        <w:t xml:space="preserve"> 与传统优化 / 逆设计的关系</w:t>
       </w:r>
     </w:p>
     <w:p>
@@ -13995,10 +13555,25 @@
       </w:pPr>
       <w:r>
         <w:rPr>
-          <w:rFonts w:ascii="Microsoft YaHei" w:hAnsi="Microsoft YaHei" w:eastAsia="Microsoft YaHei"/>
+          <w:rFonts w:ascii="微软雅黑" w:hAnsi="微软雅黑" w:eastAsia="微软雅黑"/>
           <w:sz w:val="22"/>
         </w:rPr>
-        <w:t>图 3｜五种方法的比较框架</w:t>
+        <w:t xml:space="preserve">图 </w:t>
+      </w:r>
+      <w:r>
+        <w:rPr>
+          <w:rFonts w:hint="eastAsia" w:ascii="微软雅黑" w:hAnsi="微软雅黑" w:eastAsia="微软雅黑"/>
+          <w:sz w:val="22"/>
+          <w:lang w:val="en-US" w:eastAsia="zh-CN"/>
+        </w:rPr>
+        <w:t>2</w:t>
+      </w:r>
+      <w:r>
+        <w:rPr>
+          <w:rFonts w:ascii="微软雅黑" w:hAnsi="微软雅黑" w:eastAsia="微软雅黑"/>
+          <w:sz w:val="22"/>
+        </w:rPr>
+        <w:t>｜五种方法的比较框架</w:t>
       </w:r>
     </w:p>
     <w:p>
@@ -14009,21 +13584,24 @@
       </w:pPr>
       <w:r>
         <w:drawing>
-          <wp:inline xmlns:a="http://schemas.openxmlformats.org/drawingml/2006/main" xmlns:pic="http://schemas.openxmlformats.org/drawingml/2006/picture">
-            <wp:extent cx="5852160" cy="2048256"/>
+          <wp:inline distT="0" distB="0" distL="114300" distR="114300">
+            <wp:extent cx="5852160" cy="2047875"/>
+            <wp:effectExtent l="0" t="0" r="15240" b="9525"/>
             <wp:docPr id="13" name="Picture 13"/>
             <wp:cNvGraphicFramePr>
-              <a:graphicFrameLocks noChangeAspect="1"/>
+              <a:graphicFrameLocks xmlns:a="http://schemas.openxmlformats.org/drawingml/2006/main" noChangeAspect="1"/>
             </wp:cNvGraphicFramePr>
-            <a:graphic>
+            <a:graphic xmlns:a="http://schemas.openxmlformats.org/drawingml/2006/main">
               <a:graphicData uri="http://schemas.openxmlformats.org/drawingml/2006/picture">
-                <pic:pic>
+                <pic:pic xmlns:pic="http://schemas.openxmlformats.org/drawingml/2006/picture">
                   <pic:nvPicPr>
-                    <pic:cNvPr id="0" name="concept-3.png"/>
-                    <pic:cNvPicPr/>
+                    <pic:cNvPr id="13" name="Picture 13"/>
+                    <pic:cNvPicPr>
+                      <a:picLocks noChangeAspect="1"/>
+                    </pic:cNvPicPr>
                   </pic:nvPicPr>
                   <pic:blipFill>
-                    <a:blip r:embed="rId24"/>
+                    <a:blip r:embed="rId16"/>
                     <a:stretch>
                       <a:fillRect/>
                     </a:stretch>
@@ -14033,7 +13611,9 @@
                       <a:off x="0" y="0"/>
                       <a:ext cx="5852160" cy="2048256"/>
                     </a:xfrm>
-                    <a:prstGeom prst="rect"/>
+                    <a:prstGeom prst="rect">
+                      <a:avLst/>
+                    </a:prstGeom>
                   </pic:spPr>
                 </pic:pic>
               </a:graphicData>
@@ -14048,29 +13628,82 @@
       </w:pPr>
       <w:r>
         <w:rPr>
-          <w:rFonts w:ascii="Microsoft YaHei" w:hAnsi="Microsoft YaHei" w:eastAsia="Microsoft YaHei"/>
+          <w:rFonts w:ascii="微软雅黑" w:hAnsi="微软雅黑" w:eastAsia="微软雅黑"/>
           <w:sz w:val="16"/>
         </w:rPr>
-        <w:t>候选方向概念图 3（INFERENCE / USER RESEARCH PREFERENCE；非已实现系统或实验结果）</w:t>
+        <w:t xml:space="preserve">候选方向概念图 </w:t>
+      </w:r>
+      <w:r>
+        <w:rPr>
+          <w:rFonts w:hint="eastAsia"/>
+          <w:sz w:val="16"/>
+          <w:lang w:val="en-US" w:eastAsia="zh-CN"/>
+        </w:rPr>
+        <w:t>2</w:t>
+      </w:r>
+      <w:r>
+        <w:rPr>
+          <w:rFonts w:ascii="微软雅黑" w:hAnsi="微软雅黑" w:eastAsia="微软雅黑"/>
+          <w:sz w:val="16"/>
+        </w:rPr>
+        <w:t>（INFERENCE / USER RESEARCH PREFERENCE；非已实现系统或实验结果）</w:t>
       </w:r>
     </w:p>
     <w:p>
       <w:pPr>
         <w:spacing w:after="120" w:line="278" w:lineRule="auto"/>
+        <w:rPr>
+          <w:rFonts w:ascii="微软雅黑" w:hAnsi="微软雅黑" w:eastAsia="微软雅黑"/>
+          <w:sz w:val="19"/>
+        </w:rPr>
       </w:pPr>
       <w:r>
         <w:rPr>
-          <w:rFonts w:ascii="Microsoft YaHei" w:hAnsi="Microsoft YaHei" w:eastAsia="Microsoft YaHei"/>
+          <w:rFonts w:ascii="微软雅黑" w:hAnsi="微软雅黑" w:eastAsia="微软雅黑"/>
           <w:sz w:val="19"/>
         </w:rPr>
         <w:t>下表为概念分析，不是同条件实验结果。传统优化与逆设计有交集；工具调用型 Agent 也可能已经具备物理诊断，不能按名称假定其缺失。</w:t>
       </w:r>
+    </w:p>
+    <w:p>
+      <w:pPr>
+        <w:spacing w:after="120" w:line="278" w:lineRule="auto"/>
+        <w:rPr>
+          <w:rFonts w:ascii="微软雅黑" w:hAnsi="微软雅黑" w:eastAsia="微软雅黑"/>
+          <w:sz w:val="19"/>
+        </w:rPr>
+      </w:pPr>
+    </w:p>
+    <w:p>
+      <w:pPr>
+        <w:spacing w:after="120" w:line="278" w:lineRule="auto"/>
+        <w:rPr>
+          <w:rFonts w:ascii="微软雅黑" w:hAnsi="微软雅黑" w:eastAsia="微软雅黑"/>
+          <w:sz w:val="19"/>
+        </w:rPr>
+      </w:pPr>
+    </w:p>
+    <w:p>
+      <w:pPr>
+        <w:spacing w:after="120" w:line="278" w:lineRule="auto"/>
+        <w:rPr>
+          <w:rFonts w:ascii="微软雅黑" w:hAnsi="微软雅黑" w:eastAsia="微软雅黑"/>
+          <w:sz w:val="19"/>
+        </w:rPr>
+      </w:pPr>
     </w:p>
     <w:tbl>
       <w:tblPr>
-        <w:tblW w:type="auto" w:w="0"/>
+        <w:tblStyle w:val="32"/>
+        <w:tblW w:w="0" w:type="auto"/>
+        <w:tblInd w:w="0" w:type="dxa"/>
         <w:tblLayout w:type="fixed"/>
-        <w:tblLook w:firstColumn="1" w:firstRow="1" w:lastColumn="0" w:lastRow="0" w:noHBand="0" w:noVBand="1" w:val="04A0"/>
+        <w:tblCellMar>
+          <w:top w:w="0" w:type="dxa"/>
+          <w:left w:w="108" w:type="dxa"/>
+          <w:bottom w:w="0" w:type="dxa"/>
+          <w:right w:w="108" w:type="dxa"/>
+        </w:tblCellMar>
       </w:tblPr>
       <w:tblGrid>
         <w:gridCol w:w="2469"/>
@@ -14079,27 +13712,35 @@
         <w:gridCol w:w="2469"/>
       </w:tblGrid>
       <w:tr>
+        <w:tblPrEx>
+          <w:tblCellMar>
+            <w:top w:w="0" w:type="dxa"/>
+            <w:left w:w="108" w:type="dxa"/>
+            <w:bottom w:w="0" w:type="dxa"/>
+            <w:right w:w="108" w:type="dxa"/>
+          </w:tblCellMar>
+        </w:tblPrEx>
         <w:trPr>
           <w:cantSplit/>
-          <w:tblHeader w:val="true"/>
+          <w:tblHeader/>
         </w:trPr>
         <w:tc>
           <w:tcPr>
-            <w:tcW w:type="dxa" w:w="2304"/>
-            <w:vAlign w:val="center"/>
-            <w:tcBorders>
-              <w:top w:val="single" w:sz="4" w:color="D9D9D9"/>
-              <w:left w:val="single" w:sz="4" w:color="D9D9D9"/>
-              <w:bottom w:val="single" w:sz="4" w:color="D9D9D9"/>
-              <w:right w:val="single" w:sz="4" w:color="D9D9D9"/>
-            </w:tcBorders>
+            <w:tcW w:w="2304" w:type="dxa"/>
+            <w:tcBorders>
+              <w:top w:val="single" w:color="D9D9D9" w:sz="4" w:space="0"/>
+              <w:left w:val="single" w:color="D9D9D9" w:sz="4" w:space="0"/>
+              <w:bottom w:val="single" w:color="D9D9D9" w:sz="4" w:space="0"/>
+              <w:right w:val="single" w:color="D9D9D9" w:sz="4" w:space="0"/>
+            </w:tcBorders>
+            <w:shd w:val="clear" w:color="auto" w:fill="274766"/>
             <w:tcMar>
               <w:top w:w="90" w:type="dxa"/>
-              <w:start w:w="90" w:type="dxa"/>
+              <w:left w:w="90" w:type="dxa"/>
               <w:bottom w:w="90" w:type="dxa"/>
-              <w:end w:w="90" w:type="dxa"/>
-            </w:tcMar>
-            <w:shd w:fill="274766"/>
+              <w:right w:w="90" w:type="dxa"/>
+            </w:tcMar>
+            <w:vAlign w:val="center"/>
           </w:tcPr>
           <w:p>
             <w:pPr>
@@ -14107,7 +13748,7 @@
             </w:pPr>
             <w:r>
               <w:rPr>
-                <w:rFonts w:ascii="Microsoft YaHei" w:hAnsi="Microsoft YaHei" w:eastAsia="Microsoft YaHei"/>
+                <w:rFonts w:ascii="微软雅黑" w:hAnsi="微软雅黑" w:eastAsia="微软雅黑"/>
                 <w:b/>
                 <w:color w:val="FFFFFF"/>
                 <w:sz w:val="16"/>
@@ -14118,21 +13759,21 @@
         </w:tc>
         <w:tc>
           <w:tcPr>
-            <w:tcW w:type="dxa" w:w="2304"/>
-            <w:vAlign w:val="center"/>
-            <w:tcBorders>
-              <w:top w:val="single" w:sz="4" w:color="D9D9D9"/>
-              <w:left w:val="single" w:sz="4" w:color="D9D9D9"/>
-              <w:bottom w:val="single" w:sz="4" w:color="D9D9D9"/>
-              <w:right w:val="single" w:sz="4" w:color="D9D9D9"/>
-            </w:tcBorders>
+            <w:tcW w:w="2304" w:type="dxa"/>
+            <w:tcBorders>
+              <w:top w:val="single" w:color="D9D9D9" w:sz="4" w:space="0"/>
+              <w:left w:val="single" w:color="D9D9D9" w:sz="4" w:space="0"/>
+              <w:bottom w:val="single" w:color="D9D9D9" w:sz="4" w:space="0"/>
+              <w:right w:val="single" w:color="D9D9D9" w:sz="4" w:space="0"/>
+            </w:tcBorders>
+            <w:shd w:val="clear" w:color="auto" w:fill="274766"/>
             <w:tcMar>
               <w:top w:w="90" w:type="dxa"/>
-              <w:start w:w="90" w:type="dxa"/>
+              <w:left w:w="90" w:type="dxa"/>
               <w:bottom w:w="90" w:type="dxa"/>
-              <w:end w:w="90" w:type="dxa"/>
-            </w:tcMar>
-            <w:shd w:fill="274766"/>
+              <w:right w:w="90" w:type="dxa"/>
+            </w:tcMar>
+            <w:vAlign w:val="center"/>
           </w:tcPr>
           <w:p>
             <w:pPr>
@@ -14140,7 +13781,7 @@
             </w:pPr>
             <w:r>
               <w:rPr>
-                <w:rFonts w:ascii="Microsoft YaHei" w:hAnsi="Microsoft YaHei" w:eastAsia="Microsoft YaHei"/>
+                <w:rFonts w:ascii="微软雅黑" w:hAnsi="微软雅黑" w:eastAsia="微软雅黑"/>
                 <w:b/>
                 <w:color w:val="FFFFFF"/>
                 <w:sz w:val="16"/>
@@ -14151,21 +13792,21 @@
         </w:tc>
         <w:tc>
           <w:tcPr>
-            <w:tcW w:type="dxa" w:w="2304"/>
-            <w:vAlign w:val="center"/>
-            <w:tcBorders>
-              <w:top w:val="single" w:sz="4" w:color="D9D9D9"/>
-              <w:left w:val="single" w:sz="4" w:color="D9D9D9"/>
-              <w:bottom w:val="single" w:sz="4" w:color="D9D9D9"/>
-              <w:right w:val="single" w:sz="4" w:color="D9D9D9"/>
-            </w:tcBorders>
+            <w:tcW w:w="2304" w:type="dxa"/>
+            <w:tcBorders>
+              <w:top w:val="single" w:color="D9D9D9" w:sz="4" w:space="0"/>
+              <w:left w:val="single" w:color="D9D9D9" w:sz="4" w:space="0"/>
+              <w:bottom w:val="single" w:color="D9D9D9" w:sz="4" w:space="0"/>
+              <w:right w:val="single" w:color="D9D9D9" w:sz="4" w:space="0"/>
+            </w:tcBorders>
+            <w:shd w:val="clear" w:color="auto" w:fill="274766"/>
             <w:tcMar>
               <w:top w:w="90" w:type="dxa"/>
-              <w:start w:w="90" w:type="dxa"/>
+              <w:left w:w="90" w:type="dxa"/>
               <w:bottom w:w="90" w:type="dxa"/>
-              <w:end w:w="90" w:type="dxa"/>
-            </w:tcMar>
-            <w:shd w:fill="274766"/>
+              <w:right w:w="90" w:type="dxa"/>
+            </w:tcMar>
+            <w:vAlign w:val="center"/>
           </w:tcPr>
           <w:p>
             <w:pPr>
@@ -14173,7 +13814,7 @@
             </w:pPr>
             <w:r>
               <w:rPr>
-                <w:rFonts w:ascii="Microsoft YaHei" w:hAnsi="Microsoft YaHei" w:eastAsia="Microsoft YaHei"/>
+                <w:rFonts w:ascii="微软雅黑" w:hAnsi="微软雅黑" w:eastAsia="微软雅黑"/>
                 <w:b/>
                 <w:color w:val="FFFFFF"/>
                 <w:sz w:val="16"/>
@@ -14184,21 +13825,21 @@
         </w:tc>
         <w:tc>
           <w:tcPr>
-            <w:tcW w:type="dxa" w:w="2304"/>
-            <w:vAlign w:val="center"/>
-            <w:tcBorders>
-              <w:top w:val="single" w:sz="4" w:color="D9D9D9"/>
-              <w:left w:val="single" w:sz="4" w:color="D9D9D9"/>
-              <w:bottom w:val="single" w:sz="4" w:color="D9D9D9"/>
-              <w:right w:val="single" w:sz="4" w:color="D9D9D9"/>
-            </w:tcBorders>
+            <w:tcW w:w="2304" w:type="dxa"/>
+            <w:tcBorders>
+              <w:top w:val="single" w:color="D9D9D9" w:sz="4" w:space="0"/>
+              <w:left w:val="single" w:color="D9D9D9" w:sz="4" w:space="0"/>
+              <w:bottom w:val="single" w:color="D9D9D9" w:sz="4" w:space="0"/>
+              <w:right w:val="single" w:color="D9D9D9" w:sz="4" w:space="0"/>
+            </w:tcBorders>
+            <w:shd w:val="clear" w:color="auto" w:fill="274766"/>
             <w:tcMar>
               <w:top w:w="90" w:type="dxa"/>
-              <w:start w:w="90" w:type="dxa"/>
+              <w:left w:w="90" w:type="dxa"/>
               <w:bottom w:w="90" w:type="dxa"/>
-              <w:end w:w="90" w:type="dxa"/>
-            </w:tcMar>
-            <w:shd w:fill="274766"/>
+              <w:right w:w="90" w:type="dxa"/>
+            </w:tcMar>
+            <w:vAlign w:val="center"/>
           </w:tcPr>
           <w:p>
             <w:pPr>
@@ -14206,7 +13847,7 @@
             </w:pPr>
             <w:r>
               <w:rPr>
-                <w:rFonts w:ascii="Microsoft YaHei" w:hAnsi="Microsoft YaHei" w:eastAsia="Microsoft YaHei"/>
+                <w:rFonts w:ascii="微软雅黑" w:hAnsi="微软雅黑" w:eastAsia="微软雅黑"/>
                 <w:b/>
                 <w:color w:val="FFFFFF"/>
                 <w:sz w:val="16"/>
@@ -14217,25 +13858,33 @@
         </w:tc>
       </w:tr>
       <w:tr>
+        <w:tblPrEx>
+          <w:tblCellMar>
+            <w:top w:w="0" w:type="dxa"/>
+            <w:left w:w="108" w:type="dxa"/>
+            <w:bottom w:w="0" w:type="dxa"/>
+            <w:right w:w="108" w:type="dxa"/>
+          </w:tblCellMar>
+        </w:tblPrEx>
         <w:trPr>
           <w:cantSplit/>
         </w:trPr>
         <w:tc>
           <w:tcPr>
-            <w:tcW w:type="dxa" w:w="2304"/>
-            <w:vAlign w:val="center"/>
-            <w:tcBorders>
-              <w:top w:val="single" w:sz="4" w:color="D9D9D9"/>
-              <w:left w:val="single" w:sz="4" w:color="D9D9D9"/>
-              <w:bottom w:val="single" w:sz="4" w:color="D9D9D9"/>
-              <w:right w:val="single" w:sz="4" w:color="D9D9D9"/>
+            <w:tcW w:w="2304" w:type="dxa"/>
+            <w:tcBorders>
+              <w:top w:val="single" w:color="D9D9D9" w:sz="4" w:space="0"/>
+              <w:left w:val="single" w:color="D9D9D9" w:sz="4" w:space="0"/>
+              <w:bottom w:val="single" w:color="D9D9D9" w:sz="4" w:space="0"/>
+              <w:right w:val="single" w:color="D9D9D9" w:sz="4" w:space="0"/>
             </w:tcBorders>
             <w:tcMar>
               <w:top w:w="90" w:type="dxa"/>
-              <w:start w:w="90" w:type="dxa"/>
+              <w:left w:w="90" w:type="dxa"/>
               <w:bottom w:w="90" w:type="dxa"/>
-              <w:end w:w="90" w:type="dxa"/>
-            </w:tcMar>
+              <w:right w:w="90" w:type="dxa"/>
+            </w:tcMar>
+            <w:vAlign w:val="center"/>
           </w:tcPr>
           <w:p>
             <w:pPr>
@@ -14243,7 +13892,7 @@
             </w:pPr>
             <w:r>
               <w:rPr>
-                <w:rFonts w:ascii="Microsoft YaHei" w:hAnsi="Microsoft YaHei" w:eastAsia="Microsoft YaHei"/>
+                <w:rFonts w:ascii="微软雅黑" w:hAnsi="微软雅黑" w:eastAsia="微软雅黑"/>
                 <w:b w:val="0"/>
                 <w:color w:val="000000"/>
                 <w:sz w:val="16"/>
@@ -14254,20 +13903,20 @@
         </w:tc>
         <w:tc>
           <w:tcPr>
-            <w:tcW w:type="dxa" w:w="2304"/>
-            <w:vAlign w:val="center"/>
-            <w:tcBorders>
-              <w:top w:val="single" w:sz="4" w:color="D9D9D9"/>
-              <w:left w:val="single" w:sz="4" w:color="D9D9D9"/>
-              <w:bottom w:val="single" w:sz="4" w:color="D9D9D9"/>
-              <w:right w:val="single" w:sz="4" w:color="D9D9D9"/>
+            <w:tcW w:w="2304" w:type="dxa"/>
+            <w:tcBorders>
+              <w:top w:val="single" w:color="D9D9D9" w:sz="4" w:space="0"/>
+              <w:left w:val="single" w:color="D9D9D9" w:sz="4" w:space="0"/>
+              <w:bottom w:val="single" w:color="D9D9D9" w:sz="4" w:space="0"/>
+              <w:right w:val="single" w:color="D9D9D9" w:sz="4" w:space="0"/>
             </w:tcBorders>
             <w:tcMar>
               <w:top w:w="90" w:type="dxa"/>
-              <w:start w:w="90" w:type="dxa"/>
+              <w:left w:w="90" w:type="dxa"/>
               <w:bottom w:w="90" w:type="dxa"/>
-              <w:end w:w="90" w:type="dxa"/>
-            </w:tcMar>
+              <w:right w:w="90" w:type="dxa"/>
+            </w:tcMar>
+            <w:vAlign w:val="center"/>
           </w:tcPr>
           <w:p>
             <w:pPr>
@@ -14275,7 +13924,7 @@
             </w:pPr>
             <w:r>
               <w:rPr>
-                <w:rFonts w:ascii="Microsoft YaHei" w:hAnsi="Microsoft YaHei" w:eastAsia="Microsoft YaHei"/>
+                <w:rFonts w:ascii="微软雅黑" w:hAnsi="微软雅黑" w:eastAsia="微软雅黑"/>
                 <w:b w:val="0"/>
                 <w:color w:val="000000"/>
                 <w:sz w:val="16"/>
@@ -14286,20 +13935,20 @@
         </w:tc>
         <w:tc>
           <w:tcPr>
-            <w:tcW w:type="dxa" w:w="2304"/>
-            <w:vAlign w:val="center"/>
-            <w:tcBorders>
-              <w:top w:val="single" w:sz="4" w:color="D9D9D9"/>
-              <w:left w:val="single" w:sz="4" w:color="D9D9D9"/>
-              <w:bottom w:val="single" w:sz="4" w:color="D9D9D9"/>
-              <w:right w:val="single" w:sz="4" w:color="D9D9D9"/>
+            <w:tcW w:w="2304" w:type="dxa"/>
+            <w:tcBorders>
+              <w:top w:val="single" w:color="D9D9D9" w:sz="4" w:space="0"/>
+              <w:left w:val="single" w:color="D9D9D9" w:sz="4" w:space="0"/>
+              <w:bottom w:val="single" w:color="D9D9D9" w:sz="4" w:space="0"/>
+              <w:right w:val="single" w:color="D9D9D9" w:sz="4" w:space="0"/>
             </w:tcBorders>
             <w:tcMar>
               <w:top w:w="90" w:type="dxa"/>
-              <w:start w:w="90" w:type="dxa"/>
+              <w:left w:w="90" w:type="dxa"/>
               <w:bottom w:w="90" w:type="dxa"/>
-              <w:end w:w="90" w:type="dxa"/>
-            </w:tcMar>
+              <w:right w:w="90" w:type="dxa"/>
+            </w:tcMar>
+            <w:vAlign w:val="center"/>
           </w:tcPr>
           <w:p>
             <w:pPr>
@@ -14307,7 +13956,7 @@
             </w:pPr>
             <w:r>
               <w:rPr>
-                <w:rFonts w:ascii="Microsoft YaHei" w:hAnsi="Microsoft YaHei" w:eastAsia="Microsoft YaHei"/>
+                <w:rFonts w:ascii="微软雅黑" w:hAnsi="微软雅黑" w:eastAsia="微软雅黑"/>
                 <w:b w:val="0"/>
                 <w:color w:val="000000"/>
                 <w:sz w:val="16"/>
@@ -14318,20 +13967,20 @@
         </w:tc>
         <w:tc>
           <w:tcPr>
-            <w:tcW w:type="dxa" w:w="2304"/>
-            <w:vAlign w:val="center"/>
-            <w:tcBorders>
-              <w:top w:val="single" w:sz="4" w:color="D9D9D9"/>
-              <w:left w:val="single" w:sz="4" w:color="D9D9D9"/>
-              <w:bottom w:val="single" w:sz="4" w:color="D9D9D9"/>
-              <w:right w:val="single" w:sz="4" w:color="D9D9D9"/>
+            <w:tcW w:w="2304" w:type="dxa"/>
+            <w:tcBorders>
+              <w:top w:val="single" w:color="D9D9D9" w:sz="4" w:space="0"/>
+              <w:left w:val="single" w:color="D9D9D9" w:sz="4" w:space="0"/>
+              <w:bottom w:val="single" w:color="D9D9D9" w:sz="4" w:space="0"/>
+              <w:right w:val="single" w:color="D9D9D9" w:sz="4" w:space="0"/>
             </w:tcBorders>
             <w:tcMar>
               <w:top w:w="90" w:type="dxa"/>
-              <w:start w:w="90" w:type="dxa"/>
+              <w:left w:w="90" w:type="dxa"/>
               <w:bottom w:w="90" w:type="dxa"/>
-              <w:end w:w="90" w:type="dxa"/>
-            </w:tcMar>
+              <w:right w:w="90" w:type="dxa"/>
+            </w:tcMar>
+            <w:vAlign w:val="center"/>
           </w:tcPr>
           <w:p>
             <w:pPr>
@@ -14339,7 +13988,7 @@
             </w:pPr>
             <w:r>
               <w:rPr>
-                <w:rFonts w:ascii="Microsoft YaHei" w:hAnsi="Microsoft YaHei" w:eastAsia="Microsoft YaHei"/>
+                <w:rFonts w:ascii="微软雅黑" w:hAnsi="微软雅黑" w:eastAsia="微软雅黑"/>
                 <w:b w:val="0"/>
                 <w:color w:val="000000"/>
                 <w:sz w:val="16"/>
@@ -14350,26 +13999,34 @@
         </w:tc>
       </w:tr>
       <w:tr>
+        <w:tblPrEx>
+          <w:tblCellMar>
+            <w:top w:w="0" w:type="dxa"/>
+            <w:left w:w="108" w:type="dxa"/>
+            <w:bottom w:w="0" w:type="dxa"/>
+            <w:right w:w="108" w:type="dxa"/>
+          </w:tblCellMar>
+        </w:tblPrEx>
         <w:trPr>
           <w:cantSplit/>
         </w:trPr>
         <w:tc>
           <w:tcPr>
-            <w:tcW w:type="dxa" w:w="2304"/>
-            <w:vAlign w:val="center"/>
-            <w:tcBorders>
-              <w:top w:val="single" w:sz="4" w:color="D9D9D9"/>
-              <w:left w:val="single" w:sz="4" w:color="D9D9D9"/>
-              <w:bottom w:val="single" w:sz="4" w:color="D9D9D9"/>
-              <w:right w:val="single" w:sz="4" w:color="D9D9D9"/>
-            </w:tcBorders>
+            <w:tcW w:w="2304" w:type="dxa"/>
+            <w:tcBorders>
+              <w:top w:val="single" w:color="D9D9D9" w:sz="4" w:space="0"/>
+              <w:left w:val="single" w:color="D9D9D9" w:sz="4" w:space="0"/>
+              <w:bottom w:val="single" w:color="D9D9D9" w:sz="4" w:space="0"/>
+              <w:right w:val="single" w:color="D9D9D9" w:sz="4" w:space="0"/>
+            </w:tcBorders>
+            <w:shd w:val="clear" w:color="auto" w:fill="F4F7FA"/>
             <w:tcMar>
               <w:top w:w="90" w:type="dxa"/>
-              <w:start w:w="90" w:type="dxa"/>
+              <w:left w:w="90" w:type="dxa"/>
               <w:bottom w:w="90" w:type="dxa"/>
-              <w:end w:w="90" w:type="dxa"/>
-            </w:tcMar>
-            <w:shd w:fill="F4F7FA"/>
+              <w:right w:w="90" w:type="dxa"/>
+            </w:tcMar>
+            <w:vAlign w:val="center"/>
           </w:tcPr>
           <w:p>
             <w:pPr>
@@ -14377,7 +14034,7 @@
             </w:pPr>
             <w:r>
               <w:rPr>
-                <w:rFonts w:ascii="Microsoft YaHei" w:hAnsi="Microsoft YaHei" w:eastAsia="Microsoft YaHei"/>
+                <w:rFonts w:ascii="微软雅黑" w:hAnsi="微软雅黑" w:eastAsia="微软雅黑"/>
                 <w:b w:val="0"/>
                 <w:color w:val="000000"/>
                 <w:sz w:val="16"/>
@@ -14388,21 +14045,21 @@
         </w:tc>
         <w:tc>
           <w:tcPr>
-            <w:tcW w:type="dxa" w:w="2304"/>
-            <w:vAlign w:val="center"/>
-            <w:tcBorders>
-              <w:top w:val="single" w:sz="4" w:color="D9D9D9"/>
-              <w:left w:val="single" w:sz="4" w:color="D9D9D9"/>
-              <w:bottom w:val="single" w:sz="4" w:color="D9D9D9"/>
-              <w:right w:val="single" w:sz="4" w:color="D9D9D9"/>
-            </w:tcBorders>
+            <w:tcW w:w="2304" w:type="dxa"/>
+            <w:tcBorders>
+              <w:top w:val="single" w:color="D9D9D9" w:sz="4" w:space="0"/>
+              <w:left w:val="single" w:color="D9D9D9" w:sz="4" w:space="0"/>
+              <w:bottom w:val="single" w:color="D9D9D9" w:sz="4" w:space="0"/>
+              <w:right w:val="single" w:color="D9D9D9" w:sz="4" w:space="0"/>
+            </w:tcBorders>
+            <w:shd w:val="clear" w:color="auto" w:fill="F4F7FA"/>
             <w:tcMar>
               <w:top w:w="90" w:type="dxa"/>
-              <w:start w:w="90" w:type="dxa"/>
+              <w:left w:w="90" w:type="dxa"/>
               <w:bottom w:w="90" w:type="dxa"/>
-              <w:end w:w="90" w:type="dxa"/>
-            </w:tcMar>
-            <w:shd w:fill="F4F7FA"/>
+              <w:right w:w="90" w:type="dxa"/>
+            </w:tcMar>
+            <w:vAlign w:val="center"/>
           </w:tcPr>
           <w:p>
             <w:pPr>
@@ -14410,7 +14067,7 @@
             </w:pPr>
             <w:r>
               <w:rPr>
-                <w:rFonts w:ascii="Microsoft YaHei" w:hAnsi="Microsoft YaHei" w:eastAsia="Microsoft YaHei"/>
+                <w:rFonts w:ascii="微软雅黑" w:hAnsi="微软雅黑" w:eastAsia="微软雅黑"/>
                 <w:b w:val="0"/>
                 <w:color w:val="000000"/>
                 <w:sz w:val="16"/>
@@ -14421,21 +14078,21 @@
         </w:tc>
         <w:tc>
           <w:tcPr>
-            <w:tcW w:type="dxa" w:w="2304"/>
-            <w:vAlign w:val="center"/>
-            <w:tcBorders>
-              <w:top w:val="single" w:sz="4" w:color="D9D9D9"/>
-              <w:left w:val="single" w:sz="4" w:color="D9D9D9"/>
-              <w:bottom w:val="single" w:sz="4" w:color="D9D9D9"/>
-              <w:right w:val="single" w:sz="4" w:color="D9D9D9"/>
-            </w:tcBorders>
+            <w:tcW w:w="2304" w:type="dxa"/>
+            <w:tcBorders>
+              <w:top w:val="single" w:color="D9D9D9" w:sz="4" w:space="0"/>
+              <w:left w:val="single" w:color="D9D9D9" w:sz="4" w:space="0"/>
+              <w:bottom w:val="single" w:color="D9D9D9" w:sz="4" w:space="0"/>
+              <w:right w:val="single" w:color="D9D9D9" w:sz="4" w:space="0"/>
+            </w:tcBorders>
+            <w:shd w:val="clear" w:color="auto" w:fill="F4F7FA"/>
             <w:tcMar>
               <w:top w:w="90" w:type="dxa"/>
-              <w:start w:w="90" w:type="dxa"/>
+              <w:left w:w="90" w:type="dxa"/>
               <w:bottom w:w="90" w:type="dxa"/>
-              <w:end w:w="90" w:type="dxa"/>
-            </w:tcMar>
-            <w:shd w:fill="F4F7FA"/>
+              <w:right w:w="90" w:type="dxa"/>
+            </w:tcMar>
+            <w:vAlign w:val="center"/>
           </w:tcPr>
           <w:p>
             <w:pPr>
@@ -14443,7 +14100,7 @@
             </w:pPr>
             <w:r>
               <w:rPr>
-                <w:rFonts w:ascii="Microsoft YaHei" w:hAnsi="Microsoft YaHei" w:eastAsia="Microsoft YaHei"/>
+                <w:rFonts w:ascii="微软雅黑" w:hAnsi="微软雅黑" w:eastAsia="微软雅黑"/>
                 <w:b w:val="0"/>
                 <w:color w:val="000000"/>
                 <w:sz w:val="16"/>
@@ -14454,21 +14111,21 @@
         </w:tc>
         <w:tc>
           <w:tcPr>
-            <w:tcW w:type="dxa" w:w="2304"/>
-            <w:vAlign w:val="center"/>
-            <w:tcBorders>
-              <w:top w:val="single" w:sz="4" w:color="D9D9D9"/>
-              <w:left w:val="single" w:sz="4" w:color="D9D9D9"/>
-              <w:bottom w:val="single" w:sz="4" w:color="D9D9D9"/>
-              <w:right w:val="single" w:sz="4" w:color="D9D9D9"/>
-            </w:tcBorders>
+            <w:tcW w:w="2304" w:type="dxa"/>
+            <w:tcBorders>
+              <w:top w:val="single" w:color="D9D9D9" w:sz="4" w:space="0"/>
+              <w:left w:val="single" w:color="D9D9D9" w:sz="4" w:space="0"/>
+              <w:bottom w:val="single" w:color="D9D9D9" w:sz="4" w:space="0"/>
+              <w:right w:val="single" w:color="D9D9D9" w:sz="4" w:space="0"/>
+            </w:tcBorders>
+            <w:shd w:val="clear" w:color="auto" w:fill="F4F7FA"/>
             <w:tcMar>
               <w:top w:w="90" w:type="dxa"/>
-              <w:start w:w="90" w:type="dxa"/>
+              <w:left w:w="90" w:type="dxa"/>
               <w:bottom w:w="90" w:type="dxa"/>
-              <w:end w:w="90" w:type="dxa"/>
-            </w:tcMar>
-            <w:shd w:fill="F4F7FA"/>
+              <w:right w:w="90" w:type="dxa"/>
+            </w:tcMar>
+            <w:vAlign w:val="center"/>
           </w:tcPr>
           <w:p>
             <w:pPr>
@@ -14476,7 +14133,7 @@
             </w:pPr>
             <w:r>
               <w:rPr>
-                <w:rFonts w:ascii="Microsoft YaHei" w:hAnsi="Microsoft YaHei" w:eastAsia="Microsoft YaHei"/>
+                <w:rFonts w:ascii="微软雅黑" w:hAnsi="微软雅黑" w:eastAsia="微软雅黑"/>
                 <w:b w:val="0"/>
                 <w:color w:val="000000"/>
                 <w:sz w:val="16"/>
@@ -14487,25 +14144,33 @@
         </w:tc>
       </w:tr>
       <w:tr>
+        <w:tblPrEx>
+          <w:tblCellMar>
+            <w:top w:w="0" w:type="dxa"/>
+            <w:left w:w="108" w:type="dxa"/>
+            <w:bottom w:w="0" w:type="dxa"/>
+            <w:right w:w="108" w:type="dxa"/>
+          </w:tblCellMar>
+        </w:tblPrEx>
         <w:trPr>
           <w:cantSplit/>
         </w:trPr>
         <w:tc>
           <w:tcPr>
-            <w:tcW w:type="dxa" w:w="2304"/>
-            <w:vAlign w:val="center"/>
-            <w:tcBorders>
-              <w:top w:val="single" w:sz="4" w:color="D9D9D9"/>
-              <w:left w:val="single" w:sz="4" w:color="D9D9D9"/>
-              <w:bottom w:val="single" w:sz="4" w:color="D9D9D9"/>
-              <w:right w:val="single" w:sz="4" w:color="D9D9D9"/>
+            <w:tcW w:w="2304" w:type="dxa"/>
+            <w:tcBorders>
+              <w:top w:val="single" w:color="D9D9D9" w:sz="4" w:space="0"/>
+              <w:left w:val="single" w:color="D9D9D9" w:sz="4" w:space="0"/>
+              <w:bottom w:val="single" w:color="D9D9D9" w:sz="4" w:space="0"/>
+              <w:right w:val="single" w:color="D9D9D9" w:sz="4" w:space="0"/>
             </w:tcBorders>
             <w:tcMar>
               <w:top w:w="90" w:type="dxa"/>
-              <w:start w:w="90" w:type="dxa"/>
+              <w:left w:w="90" w:type="dxa"/>
               <w:bottom w:w="90" w:type="dxa"/>
-              <w:end w:w="90" w:type="dxa"/>
-            </w:tcMar>
+              <w:right w:w="90" w:type="dxa"/>
+            </w:tcMar>
+            <w:vAlign w:val="center"/>
           </w:tcPr>
           <w:p>
             <w:pPr>
@@ -14513,7 +14178,7 @@
             </w:pPr>
             <w:r>
               <w:rPr>
-                <w:rFonts w:ascii="Microsoft YaHei" w:hAnsi="Microsoft YaHei" w:eastAsia="Microsoft YaHei"/>
+                <w:rFonts w:ascii="微软雅黑" w:hAnsi="微软雅黑" w:eastAsia="微软雅黑"/>
                 <w:b w:val="0"/>
                 <w:color w:val="000000"/>
                 <w:sz w:val="16"/>
@@ -14524,20 +14189,20 @@
         </w:tc>
         <w:tc>
           <w:tcPr>
-            <w:tcW w:type="dxa" w:w="2304"/>
-            <w:vAlign w:val="center"/>
-            <w:tcBorders>
-              <w:top w:val="single" w:sz="4" w:color="D9D9D9"/>
-              <w:left w:val="single" w:sz="4" w:color="D9D9D9"/>
-              <w:bottom w:val="single" w:sz="4" w:color="D9D9D9"/>
-              <w:right w:val="single" w:sz="4" w:color="D9D9D9"/>
+            <w:tcW w:w="2304" w:type="dxa"/>
+            <w:tcBorders>
+              <w:top w:val="single" w:color="D9D9D9" w:sz="4" w:space="0"/>
+              <w:left w:val="single" w:color="D9D9D9" w:sz="4" w:space="0"/>
+              <w:bottom w:val="single" w:color="D9D9D9" w:sz="4" w:space="0"/>
+              <w:right w:val="single" w:color="D9D9D9" w:sz="4" w:space="0"/>
             </w:tcBorders>
             <w:tcMar>
               <w:top w:w="90" w:type="dxa"/>
-              <w:start w:w="90" w:type="dxa"/>
+              <w:left w:w="90" w:type="dxa"/>
               <w:bottom w:w="90" w:type="dxa"/>
-              <w:end w:w="90" w:type="dxa"/>
-            </w:tcMar>
+              <w:right w:w="90" w:type="dxa"/>
+            </w:tcMar>
+            <w:vAlign w:val="center"/>
           </w:tcPr>
           <w:p>
             <w:pPr>
@@ -14545,7 +14210,7 @@
             </w:pPr>
             <w:r>
               <w:rPr>
-                <w:rFonts w:ascii="Microsoft YaHei" w:hAnsi="Microsoft YaHei" w:eastAsia="Microsoft YaHei"/>
+                <w:rFonts w:ascii="微软雅黑" w:hAnsi="微软雅黑" w:eastAsia="微软雅黑"/>
                 <w:b w:val="0"/>
                 <w:color w:val="000000"/>
                 <w:sz w:val="16"/>
@@ -14556,20 +14221,20 @@
         </w:tc>
         <w:tc>
           <w:tcPr>
-            <w:tcW w:type="dxa" w:w="2304"/>
-            <w:vAlign w:val="center"/>
-            <w:tcBorders>
-              <w:top w:val="single" w:sz="4" w:color="D9D9D9"/>
-              <w:left w:val="single" w:sz="4" w:color="D9D9D9"/>
-              <w:bottom w:val="single" w:sz="4" w:color="D9D9D9"/>
-              <w:right w:val="single" w:sz="4" w:color="D9D9D9"/>
+            <w:tcW w:w="2304" w:type="dxa"/>
+            <w:tcBorders>
+              <w:top w:val="single" w:color="D9D9D9" w:sz="4" w:space="0"/>
+              <w:left w:val="single" w:color="D9D9D9" w:sz="4" w:space="0"/>
+              <w:bottom w:val="single" w:color="D9D9D9" w:sz="4" w:space="0"/>
+              <w:right w:val="single" w:color="D9D9D9" w:sz="4" w:space="0"/>
             </w:tcBorders>
             <w:tcMar>
               <w:top w:w="90" w:type="dxa"/>
-              <w:start w:w="90" w:type="dxa"/>
+              <w:left w:w="90" w:type="dxa"/>
               <w:bottom w:w="90" w:type="dxa"/>
-              <w:end w:w="90" w:type="dxa"/>
-            </w:tcMar>
+              <w:right w:w="90" w:type="dxa"/>
+            </w:tcMar>
+            <w:vAlign w:val="center"/>
           </w:tcPr>
           <w:p>
             <w:pPr>
@@ -14577,7 +14242,7 @@
             </w:pPr>
             <w:r>
               <w:rPr>
-                <w:rFonts w:ascii="Microsoft YaHei" w:hAnsi="Microsoft YaHei" w:eastAsia="Microsoft YaHei"/>
+                <w:rFonts w:ascii="微软雅黑" w:hAnsi="微软雅黑" w:eastAsia="微软雅黑"/>
                 <w:b w:val="0"/>
                 <w:color w:val="000000"/>
                 <w:sz w:val="16"/>
@@ -14588,20 +14253,20 @@
         </w:tc>
         <w:tc>
           <w:tcPr>
-            <w:tcW w:type="dxa" w:w="2304"/>
-            <w:vAlign w:val="center"/>
-            <w:tcBorders>
-              <w:top w:val="single" w:sz="4" w:color="D9D9D9"/>
-              <w:left w:val="single" w:sz="4" w:color="D9D9D9"/>
-              <w:bottom w:val="single" w:sz="4" w:color="D9D9D9"/>
-              <w:right w:val="single" w:sz="4" w:color="D9D9D9"/>
+            <w:tcW w:w="2304" w:type="dxa"/>
+            <w:tcBorders>
+              <w:top w:val="single" w:color="D9D9D9" w:sz="4" w:space="0"/>
+              <w:left w:val="single" w:color="D9D9D9" w:sz="4" w:space="0"/>
+              <w:bottom w:val="single" w:color="D9D9D9" w:sz="4" w:space="0"/>
+              <w:right w:val="single" w:color="D9D9D9" w:sz="4" w:space="0"/>
             </w:tcBorders>
             <w:tcMar>
               <w:top w:w="90" w:type="dxa"/>
-              <w:start w:w="90" w:type="dxa"/>
+              <w:left w:w="90" w:type="dxa"/>
               <w:bottom w:w="90" w:type="dxa"/>
-              <w:end w:w="90" w:type="dxa"/>
-            </w:tcMar>
+              <w:right w:w="90" w:type="dxa"/>
+            </w:tcMar>
+            <w:vAlign w:val="center"/>
           </w:tcPr>
           <w:p>
             <w:pPr>
@@ -14609,7 +14274,7 @@
             </w:pPr>
             <w:r>
               <w:rPr>
-                <w:rFonts w:ascii="Microsoft YaHei" w:hAnsi="Microsoft YaHei" w:eastAsia="Microsoft YaHei"/>
+                <w:rFonts w:ascii="微软雅黑" w:hAnsi="微软雅黑" w:eastAsia="微软雅黑"/>
                 <w:b w:val="0"/>
                 <w:color w:val="000000"/>
                 <w:sz w:val="16"/>
@@ -14620,26 +14285,34 @@
         </w:tc>
       </w:tr>
       <w:tr>
+        <w:tblPrEx>
+          <w:tblCellMar>
+            <w:top w:w="0" w:type="dxa"/>
+            <w:left w:w="108" w:type="dxa"/>
+            <w:bottom w:w="0" w:type="dxa"/>
+            <w:right w:w="108" w:type="dxa"/>
+          </w:tblCellMar>
+        </w:tblPrEx>
         <w:trPr>
           <w:cantSplit/>
         </w:trPr>
         <w:tc>
           <w:tcPr>
-            <w:tcW w:type="dxa" w:w="2304"/>
-            <w:vAlign w:val="center"/>
-            <w:tcBorders>
-              <w:top w:val="single" w:sz="4" w:color="D9D9D9"/>
-              <w:left w:val="single" w:sz="4" w:color="D9D9D9"/>
-              <w:bottom w:val="single" w:sz="4" w:color="D9D9D9"/>
-              <w:right w:val="single" w:sz="4" w:color="D9D9D9"/>
-            </w:tcBorders>
+            <w:tcW w:w="2304" w:type="dxa"/>
+            <w:tcBorders>
+              <w:top w:val="single" w:color="D9D9D9" w:sz="4" w:space="0"/>
+              <w:left w:val="single" w:color="D9D9D9" w:sz="4" w:space="0"/>
+              <w:bottom w:val="single" w:color="D9D9D9" w:sz="4" w:space="0"/>
+              <w:right w:val="single" w:color="D9D9D9" w:sz="4" w:space="0"/>
+            </w:tcBorders>
+            <w:shd w:val="clear" w:color="auto" w:fill="F4F7FA"/>
             <w:tcMar>
               <w:top w:w="90" w:type="dxa"/>
-              <w:start w:w="90" w:type="dxa"/>
+              <w:left w:w="90" w:type="dxa"/>
               <w:bottom w:w="90" w:type="dxa"/>
-              <w:end w:w="90" w:type="dxa"/>
-            </w:tcMar>
-            <w:shd w:fill="F4F7FA"/>
+              <w:right w:w="90" w:type="dxa"/>
+            </w:tcMar>
+            <w:vAlign w:val="center"/>
           </w:tcPr>
           <w:p>
             <w:pPr>
@@ -14647,7 +14320,7 @@
             </w:pPr>
             <w:r>
               <w:rPr>
-                <w:rFonts w:ascii="Microsoft YaHei" w:hAnsi="Microsoft YaHei" w:eastAsia="Microsoft YaHei"/>
+                <w:rFonts w:ascii="微软雅黑" w:hAnsi="微软雅黑" w:eastAsia="微软雅黑"/>
                 <w:b w:val="0"/>
                 <w:color w:val="000000"/>
                 <w:sz w:val="16"/>
@@ -14658,21 +14331,21 @@
         </w:tc>
         <w:tc>
           <w:tcPr>
-            <w:tcW w:type="dxa" w:w="2304"/>
-            <w:vAlign w:val="center"/>
-            <w:tcBorders>
-              <w:top w:val="single" w:sz="4" w:color="D9D9D9"/>
-              <w:left w:val="single" w:sz="4" w:color="D9D9D9"/>
-              <w:bottom w:val="single" w:sz="4" w:color="D9D9D9"/>
-              <w:right w:val="single" w:sz="4" w:color="D9D9D9"/>
-            </w:tcBorders>
+            <w:tcW w:w="2304" w:type="dxa"/>
+            <w:tcBorders>
+              <w:top w:val="single" w:color="D9D9D9" w:sz="4" w:space="0"/>
+              <w:left w:val="single" w:color="D9D9D9" w:sz="4" w:space="0"/>
+              <w:bottom w:val="single" w:color="D9D9D9" w:sz="4" w:space="0"/>
+              <w:right w:val="single" w:color="D9D9D9" w:sz="4" w:space="0"/>
+            </w:tcBorders>
+            <w:shd w:val="clear" w:color="auto" w:fill="F4F7FA"/>
             <w:tcMar>
               <w:top w:w="90" w:type="dxa"/>
-              <w:start w:w="90" w:type="dxa"/>
+              <w:left w:w="90" w:type="dxa"/>
               <w:bottom w:w="90" w:type="dxa"/>
-              <w:end w:w="90" w:type="dxa"/>
-            </w:tcMar>
-            <w:shd w:fill="F4F7FA"/>
+              <w:right w:w="90" w:type="dxa"/>
+            </w:tcMar>
+            <w:vAlign w:val="center"/>
           </w:tcPr>
           <w:p>
             <w:pPr>
@@ -14680,7 +14353,7 @@
             </w:pPr>
             <w:r>
               <w:rPr>
-                <w:rFonts w:ascii="Microsoft YaHei" w:hAnsi="Microsoft YaHei" w:eastAsia="Microsoft YaHei"/>
+                <w:rFonts w:ascii="微软雅黑" w:hAnsi="微软雅黑" w:eastAsia="微软雅黑"/>
                 <w:b w:val="0"/>
                 <w:color w:val="000000"/>
                 <w:sz w:val="16"/>
@@ -14691,21 +14364,21 @@
         </w:tc>
         <w:tc>
           <w:tcPr>
-            <w:tcW w:type="dxa" w:w="2304"/>
-            <w:vAlign w:val="center"/>
-            <w:tcBorders>
-              <w:top w:val="single" w:sz="4" w:color="D9D9D9"/>
-              <w:left w:val="single" w:sz="4" w:color="D9D9D9"/>
-              <w:bottom w:val="single" w:sz="4" w:color="D9D9D9"/>
-              <w:right w:val="single" w:sz="4" w:color="D9D9D9"/>
-            </w:tcBorders>
+            <w:tcW w:w="2304" w:type="dxa"/>
+            <w:tcBorders>
+              <w:top w:val="single" w:color="D9D9D9" w:sz="4" w:space="0"/>
+              <w:left w:val="single" w:color="D9D9D9" w:sz="4" w:space="0"/>
+              <w:bottom w:val="single" w:color="D9D9D9" w:sz="4" w:space="0"/>
+              <w:right w:val="single" w:color="D9D9D9" w:sz="4" w:space="0"/>
+            </w:tcBorders>
+            <w:shd w:val="clear" w:color="auto" w:fill="F4F7FA"/>
             <w:tcMar>
               <w:top w:w="90" w:type="dxa"/>
-              <w:start w:w="90" w:type="dxa"/>
+              <w:left w:w="90" w:type="dxa"/>
               <w:bottom w:w="90" w:type="dxa"/>
-              <w:end w:w="90" w:type="dxa"/>
-            </w:tcMar>
-            <w:shd w:fill="F4F7FA"/>
+              <w:right w:w="90" w:type="dxa"/>
+            </w:tcMar>
+            <w:vAlign w:val="center"/>
           </w:tcPr>
           <w:p>
             <w:pPr>
@@ -14713,7 +14386,7 @@
             </w:pPr>
             <w:r>
               <w:rPr>
-                <w:rFonts w:ascii="Microsoft YaHei" w:hAnsi="Microsoft YaHei" w:eastAsia="Microsoft YaHei"/>
+                <w:rFonts w:ascii="微软雅黑" w:hAnsi="微软雅黑" w:eastAsia="微软雅黑"/>
                 <w:b w:val="0"/>
                 <w:color w:val="000000"/>
                 <w:sz w:val="16"/>
@@ -14724,21 +14397,21 @@
         </w:tc>
         <w:tc>
           <w:tcPr>
-            <w:tcW w:type="dxa" w:w="2304"/>
-            <w:vAlign w:val="center"/>
-            <w:tcBorders>
-              <w:top w:val="single" w:sz="4" w:color="D9D9D9"/>
-              <w:left w:val="single" w:sz="4" w:color="D9D9D9"/>
-              <w:bottom w:val="single" w:sz="4" w:color="D9D9D9"/>
-              <w:right w:val="single" w:sz="4" w:color="D9D9D9"/>
-            </w:tcBorders>
+            <w:tcW w:w="2304" w:type="dxa"/>
+            <w:tcBorders>
+              <w:top w:val="single" w:color="D9D9D9" w:sz="4" w:space="0"/>
+              <w:left w:val="single" w:color="D9D9D9" w:sz="4" w:space="0"/>
+              <w:bottom w:val="single" w:color="D9D9D9" w:sz="4" w:space="0"/>
+              <w:right w:val="single" w:color="D9D9D9" w:sz="4" w:space="0"/>
+            </w:tcBorders>
+            <w:shd w:val="clear" w:color="auto" w:fill="F4F7FA"/>
             <w:tcMar>
               <w:top w:w="90" w:type="dxa"/>
-              <w:start w:w="90" w:type="dxa"/>
+              <w:left w:w="90" w:type="dxa"/>
               <w:bottom w:w="90" w:type="dxa"/>
-              <w:end w:w="90" w:type="dxa"/>
-            </w:tcMar>
-            <w:shd w:fill="F4F7FA"/>
+              <w:right w:w="90" w:type="dxa"/>
+            </w:tcMar>
+            <w:vAlign w:val="center"/>
           </w:tcPr>
           <w:p>
             <w:pPr>
@@ -14746,7 +14419,7 @@
             </w:pPr>
             <w:r>
               <w:rPr>
-                <w:rFonts w:ascii="Microsoft YaHei" w:hAnsi="Microsoft YaHei" w:eastAsia="Microsoft YaHei"/>
+                <w:rFonts w:ascii="微软雅黑" w:hAnsi="微软雅黑" w:eastAsia="微软雅黑"/>
                 <w:b w:val="0"/>
                 <w:color w:val="000000"/>
                 <w:sz w:val="16"/>
@@ -14757,25 +14430,33 @@
         </w:tc>
       </w:tr>
       <w:tr>
+        <w:tblPrEx>
+          <w:tblCellMar>
+            <w:top w:w="0" w:type="dxa"/>
+            <w:left w:w="108" w:type="dxa"/>
+            <w:bottom w:w="0" w:type="dxa"/>
+            <w:right w:w="108" w:type="dxa"/>
+          </w:tblCellMar>
+        </w:tblPrEx>
         <w:trPr>
           <w:cantSplit/>
         </w:trPr>
         <w:tc>
           <w:tcPr>
-            <w:tcW w:type="dxa" w:w="2304"/>
-            <w:vAlign w:val="center"/>
-            <w:tcBorders>
-              <w:top w:val="single" w:sz="4" w:color="D9D9D9"/>
-              <w:left w:val="single" w:sz="4" w:color="D9D9D9"/>
-              <w:bottom w:val="single" w:sz="4" w:color="D9D9D9"/>
-              <w:right w:val="single" w:sz="4" w:color="D9D9D9"/>
+            <w:tcW w:w="2304" w:type="dxa"/>
+            <w:tcBorders>
+              <w:top w:val="single" w:color="D9D9D9" w:sz="4" w:space="0"/>
+              <w:left w:val="single" w:color="D9D9D9" w:sz="4" w:space="0"/>
+              <w:bottom w:val="single" w:color="D9D9D9" w:sz="4" w:space="0"/>
+              <w:right w:val="single" w:color="D9D9D9" w:sz="4" w:space="0"/>
             </w:tcBorders>
             <w:tcMar>
               <w:top w:w="90" w:type="dxa"/>
-              <w:start w:w="90" w:type="dxa"/>
+              <w:left w:w="90" w:type="dxa"/>
               <w:bottom w:w="90" w:type="dxa"/>
-              <w:end w:w="90" w:type="dxa"/>
-            </w:tcMar>
+              <w:right w:w="90" w:type="dxa"/>
+            </w:tcMar>
+            <w:vAlign w:val="center"/>
           </w:tcPr>
           <w:p>
             <w:pPr>
@@ -14783,7 +14464,7 @@
             </w:pPr>
             <w:r>
               <w:rPr>
-                <w:rFonts w:ascii="Microsoft YaHei" w:hAnsi="Microsoft YaHei" w:eastAsia="Microsoft YaHei"/>
+                <w:rFonts w:ascii="微软雅黑" w:hAnsi="微软雅黑" w:eastAsia="微软雅黑"/>
                 <w:b w:val="0"/>
                 <w:color w:val="000000"/>
                 <w:sz w:val="16"/>
@@ -14794,20 +14475,20 @@
         </w:tc>
         <w:tc>
           <w:tcPr>
-            <w:tcW w:type="dxa" w:w="2304"/>
-            <w:vAlign w:val="center"/>
-            <w:tcBorders>
-              <w:top w:val="single" w:sz="4" w:color="D9D9D9"/>
-              <w:left w:val="single" w:sz="4" w:color="D9D9D9"/>
-              <w:bottom w:val="single" w:sz="4" w:color="D9D9D9"/>
-              <w:right w:val="single" w:sz="4" w:color="D9D9D9"/>
+            <w:tcW w:w="2304" w:type="dxa"/>
+            <w:tcBorders>
+              <w:top w:val="single" w:color="D9D9D9" w:sz="4" w:space="0"/>
+              <w:left w:val="single" w:color="D9D9D9" w:sz="4" w:space="0"/>
+              <w:bottom w:val="single" w:color="D9D9D9" w:sz="4" w:space="0"/>
+              <w:right w:val="single" w:color="D9D9D9" w:sz="4" w:space="0"/>
             </w:tcBorders>
             <w:tcMar>
               <w:top w:w="90" w:type="dxa"/>
-              <w:start w:w="90" w:type="dxa"/>
+              <w:left w:w="90" w:type="dxa"/>
               <w:bottom w:w="90" w:type="dxa"/>
-              <w:end w:w="90" w:type="dxa"/>
-            </w:tcMar>
+              <w:right w:w="90" w:type="dxa"/>
+            </w:tcMar>
+            <w:vAlign w:val="center"/>
           </w:tcPr>
           <w:p>
             <w:pPr>
@@ -14815,7 +14496,7 @@
             </w:pPr>
             <w:r>
               <w:rPr>
-                <w:rFonts w:ascii="Microsoft YaHei" w:hAnsi="Microsoft YaHei" w:eastAsia="Microsoft YaHei"/>
+                <w:rFonts w:ascii="微软雅黑" w:hAnsi="微软雅黑" w:eastAsia="微软雅黑"/>
                 <w:b w:val="0"/>
                 <w:color w:val="000000"/>
                 <w:sz w:val="16"/>
@@ -14826,20 +14507,20 @@
         </w:tc>
         <w:tc>
           <w:tcPr>
-            <w:tcW w:type="dxa" w:w="2304"/>
-            <w:vAlign w:val="center"/>
-            <w:tcBorders>
-              <w:top w:val="single" w:sz="4" w:color="D9D9D9"/>
-              <w:left w:val="single" w:sz="4" w:color="D9D9D9"/>
-              <w:bottom w:val="single" w:sz="4" w:color="D9D9D9"/>
-              <w:right w:val="single" w:sz="4" w:color="D9D9D9"/>
+            <w:tcW w:w="2304" w:type="dxa"/>
+            <w:tcBorders>
+              <w:top w:val="single" w:color="D9D9D9" w:sz="4" w:space="0"/>
+              <w:left w:val="single" w:color="D9D9D9" w:sz="4" w:space="0"/>
+              <w:bottom w:val="single" w:color="D9D9D9" w:sz="4" w:space="0"/>
+              <w:right w:val="single" w:color="D9D9D9" w:sz="4" w:space="0"/>
             </w:tcBorders>
             <w:tcMar>
               <w:top w:w="90" w:type="dxa"/>
-              <w:start w:w="90" w:type="dxa"/>
+              <w:left w:w="90" w:type="dxa"/>
               <w:bottom w:w="90" w:type="dxa"/>
-              <w:end w:w="90" w:type="dxa"/>
-            </w:tcMar>
+              <w:right w:w="90" w:type="dxa"/>
+            </w:tcMar>
+            <w:vAlign w:val="center"/>
           </w:tcPr>
           <w:p>
             <w:pPr>
@@ -14847,7 +14528,7 @@
             </w:pPr>
             <w:r>
               <w:rPr>
-                <w:rFonts w:ascii="Microsoft YaHei" w:hAnsi="Microsoft YaHei" w:eastAsia="Microsoft YaHei"/>
+                <w:rFonts w:ascii="微软雅黑" w:hAnsi="微软雅黑" w:eastAsia="微软雅黑"/>
                 <w:b w:val="0"/>
                 <w:color w:val="000000"/>
                 <w:sz w:val="16"/>
@@ -14858,20 +14539,20 @@
         </w:tc>
         <w:tc>
           <w:tcPr>
-            <w:tcW w:type="dxa" w:w="2304"/>
-            <w:vAlign w:val="center"/>
-            <w:tcBorders>
-              <w:top w:val="single" w:sz="4" w:color="D9D9D9"/>
-              <w:left w:val="single" w:sz="4" w:color="D9D9D9"/>
-              <w:bottom w:val="single" w:sz="4" w:color="D9D9D9"/>
-              <w:right w:val="single" w:sz="4" w:color="D9D9D9"/>
+            <w:tcW w:w="2304" w:type="dxa"/>
+            <w:tcBorders>
+              <w:top w:val="single" w:color="D9D9D9" w:sz="4" w:space="0"/>
+              <w:left w:val="single" w:color="D9D9D9" w:sz="4" w:space="0"/>
+              <w:bottom w:val="single" w:color="D9D9D9" w:sz="4" w:space="0"/>
+              <w:right w:val="single" w:color="D9D9D9" w:sz="4" w:space="0"/>
             </w:tcBorders>
             <w:tcMar>
               <w:top w:w="90" w:type="dxa"/>
-              <w:start w:w="90" w:type="dxa"/>
+              <w:left w:w="90" w:type="dxa"/>
               <w:bottom w:w="90" w:type="dxa"/>
-              <w:end w:w="90" w:type="dxa"/>
-            </w:tcMar>
+              <w:right w:w="90" w:type="dxa"/>
+            </w:tcMar>
+            <w:vAlign w:val="center"/>
           </w:tcPr>
           <w:p>
             <w:pPr>
@@ -14879,7 +14560,7 @@
             </w:pPr>
             <w:r>
               <w:rPr>
-                <w:rFonts w:ascii="Microsoft YaHei" w:hAnsi="Microsoft YaHei" w:eastAsia="Microsoft YaHei"/>
+                <w:rFonts w:ascii="微软雅黑" w:hAnsi="微软雅黑" w:eastAsia="微软雅黑"/>
                 <w:b w:val="0"/>
                 <w:color w:val="000000"/>
                 <w:sz w:val="16"/>
@@ -14896,14 +14577,14 @@
       </w:pPr>
       <w:r>
         <w:rPr>
-          <w:rFonts w:ascii="Microsoft YaHei" w:hAnsi="Microsoft YaHei" w:eastAsia="Microsoft YaHei"/>
+          <w:rFonts w:ascii="微软雅黑" w:hAnsi="微软雅黑" w:eastAsia="微软雅黑"/>
           <w:sz w:val="19"/>
         </w:rPr>
         <w:t xml:space="preserve">只有在目标/拓扑切换、多约束冲突、模型有效性诊断或策略选择等环节存在可证明的额外价值，Agent 才可能超出“包装优化器”。这些可能性为 </w:t>
       </w:r>
       <w:r>
         <w:rPr>
-          <w:rFonts w:ascii="Microsoft YaHei" w:hAnsi="Microsoft YaHei" w:eastAsia="Microsoft YaHei"/>
+          <w:rFonts w:ascii="微软雅黑" w:hAnsi="微软雅黑" w:eastAsia="微软雅黑"/>
           <w:color w:val="44546A"/>
           <w:sz w:val="19"/>
         </w:rPr>
@@ -14911,7 +14592,7 @@
       </w:r>
       <w:r>
         <w:rPr>
-          <w:rFonts w:ascii="Microsoft YaHei" w:hAnsi="Microsoft YaHei" w:eastAsia="Microsoft YaHei"/>
+          <w:rFonts w:ascii="微软雅黑" w:hAnsi="微软雅黑" w:eastAsia="微软雅黑"/>
           <w:sz w:val="19"/>
         </w:rPr>
         <w:t>，不是研究贡献结论。</w:t>
@@ -14925,98 +14606,39 @@
       </w:pPr>
       <w:r>
         <w:rPr>
-          <w:rFonts w:ascii="Microsoft YaHei" w:hAnsi="Microsoft YaHei" w:eastAsia="Microsoft YaHei"/>
+          <w:rFonts w:ascii="微软雅黑" w:hAnsi="微软雅黑" w:eastAsia="微软雅黑"/>
           <w:sz w:val="22"/>
         </w:rPr>
-        <w:t>6.6.6 初步验证思路（非实验执行方案）</w:t>
-      </w:r>
-    </w:p>
-    <w:p>
-      <w:pPr>
-        <w:spacing w:after="120" w:line="278" w:lineRule="auto"/>
-      </w:pPr>
-      <w:r>
-        <w:rPr>
-          <w:rFonts w:ascii="Microsoft YaHei" w:hAnsi="Microsoft YaHei" w:eastAsia="Microsoft YaHei"/>
-          <w:color w:val="44546A"/>
-          <w:sz w:val="19"/>
-        </w:rPr>
-        <w:t>USER RESEARCH PREFERENCE</w:t>
-      </w:r>
-      <w:r>
-        <w:rPr>
-          <w:rFonts w:ascii="Microsoft YaHei" w:hAnsi="Microsoft YaHei" w:eastAsia="Microsoft YaHei"/>
-          <w:sz w:val="19"/>
-        </w:rPr>
-        <w:t>：基础 PIC 推理覆盖 MMI、MZI、定向耦合器、微环与波导等，关注参数—性能关系、权衡、合理性、结果解释、瓶颈诊断和动作选择；随后考虑 1–2 类器件的真实 simulation-in-the-loop（仿真在环），再讨论复杂 PIC / 系统。</w:t>
-      </w:r>
-    </w:p>
-    <w:p>
-      <w:pPr>
-        <w:spacing w:after="120" w:line="278" w:lineRule="auto"/>
-      </w:pPr>
-      <w:r>
-        <w:rPr>
-          <w:rFonts w:ascii="Microsoft YaHei" w:hAnsi="Microsoft YaHei" w:eastAsia="Microsoft YaHei"/>
-          <w:sz w:val="19"/>
-        </w:rPr>
-        <w:t>可能比较 Baseline Agent（基线智能体）与 Physics-guided Agent（物理引导智能体），但还应讨论传统优化 / 逆设计对照。设计成功率、迭代数、求解器调用、约束违反、物理无效决策、恢复率和最终 FoM（性能指标）仅为</w:t>
-      </w:r>
-      <w:r>
-        <w:rPr>
-          <w:rFonts w:ascii="Microsoft YaHei" w:hAnsi="Microsoft YaHei" w:eastAsia="Microsoft YaHei"/>
-          <w:b/>
-          <w:sz w:val="19"/>
-        </w:rPr>
-        <w:t>候选指标</w:t>
-      </w:r>
-      <w:r>
-        <w:rPr>
-          <w:rFonts w:ascii="Microsoft YaHei" w:hAnsi="Microsoft YaHei" w:eastAsia="Microsoft YaHei"/>
-          <w:sz w:val="19"/>
-        </w:rPr>
-        <w:t>；定义、预算、样本、任务和判据均未确定。本轮没有启动 benchmark、仿真或实验设计细化。</w:t>
-      </w:r>
-    </w:p>
-    <w:p>
-      <w:pPr>
-        <w:spacing w:after="120" w:line="278" w:lineRule="auto"/>
-      </w:pPr>
-      <w:r>
-        <w:rPr>
-          <w:rFonts w:ascii="Microsoft YaHei" w:hAnsi="Microsoft YaHei" w:eastAsia="Microsoft YaHei"/>
-          <w:b/>
-          <w:sz w:val="19"/>
-        </w:rPr>
-        <w:t>DAS 当前候选定位</w:t>
-      </w:r>
-      <w:r>
-        <w:rPr>
-          <w:rFonts w:ascii="Microsoft YaHei" w:hAnsi="Microsoft YaHei" w:eastAsia="Microsoft YaHei"/>
-          <w:sz w:val="19"/>
-        </w:rPr>
-        <w:t>：后续复杂应用与系统级验证场景之一，最终角色仍需导师确认。DAS 和 Photonic AI Computing（光子人工智能计算）原有三方向调研及候选路线不删除、不判为淘汰。</w:t>
-      </w:r>
-    </w:p>
-    <w:p>
-      <w:pPr>
-        <w:pStyle w:val="5"/>
-        <w:keepNext/>
-        <w:spacing w:after="120" w:line="278" w:lineRule="auto"/>
-      </w:pPr>
-      <w:r>
-        <w:rPr>
-          <w:rFonts w:ascii="Microsoft YaHei" w:hAnsi="Microsoft YaHei" w:eastAsia="Microsoft YaHei"/>
+        <w:t>6.</w:t>
+      </w:r>
+      <w:r>
+        <w:rPr>
+          <w:rFonts w:hint="eastAsia" w:ascii="微软雅黑" w:hAnsi="微软雅黑" w:eastAsia="微软雅黑"/>
           <w:sz w:val="22"/>
-        </w:rPr>
-        <w:t>6.6.7 三个假设与开放问题</w:t>
+          <w:lang w:val="en-US" w:eastAsia="zh-CN"/>
+        </w:rPr>
+        <w:t>5</w:t>
+      </w:r>
+      <w:r>
+        <w:rPr>
+          <w:rFonts w:ascii="微软雅黑" w:hAnsi="微软雅黑" w:eastAsia="微软雅黑"/>
+          <w:sz w:val="22"/>
+        </w:rPr>
+        <w:t xml:space="preserve"> 三个假设与开放问题</w:t>
       </w:r>
     </w:p>
     <w:tbl>
       <w:tblPr>
-        <w:tblW w:type="auto" w:w="0"/>
+        <w:tblStyle w:val="32"/>
+        <w:tblW w:w="0" w:type="auto"/>
+        <w:tblInd w:w="0" w:type="dxa"/>
         <w:tblLayout w:type="fixed"/>
-        <w:tblLook w:firstColumn="1" w:firstRow="1" w:lastColumn="0" w:lastRow="0" w:noHBand="0" w:noVBand="1" w:val="04A0"/>
+        <w:tblCellMar>
+          <w:top w:w="0" w:type="dxa"/>
+          <w:left w:w="108" w:type="dxa"/>
+          <w:bottom w:w="0" w:type="dxa"/>
+          <w:right w:w="108" w:type="dxa"/>
+        </w:tblCellMar>
       </w:tblPr>
       <w:tblGrid>
         <w:gridCol w:w="3293"/>
@@ -15024,27 +14646,35 @@
         <w:gridCol w:w="3293"/>
       </w:tblGrid>
       <w:tr>
+        <w:tblPrEx>
+          <w:tblCellMar>
+            <w:top w:w="0" w:type="dxa"/>
+            <w:left w:w="108" w:type="dxa"/>
+            <w:bottom w:w="0" w:type="dxa"/>
+            <w:right w:w="108" w:type="dxa"/>
+          </w:tblCellMar>
+        </w:tblPrEx>
         <w:trPr>
           <w:cantSplit/>
-          <w:tblHeader w:val="true"/>
+          <w:tblHeader/>
         </w:trPr>
         <w:tc>
           <w:tcPr>
-            <w:tcW w:type="dxa" w:w="3072"/>
-            <w:vAlign w:val="center"/>
-            <w:tcBorders>
-              <w:top w:val="single" w:sz="4" w:color="D9D9D9"/>
-              <w:left w:val="single" w:sz="4" w:color="D9D9D9"/>
-              <w:bottom w:val="single" w:sz="4" w:color="D9D9D9"/>
-              <w:right w:val="single" w:sz="4" w:color="D9D9D9"/>
-            </w:tcBorders>
+            <w:tcW w:w="3072" w:type="dxa"/>
+            <w:tcBorders>
+              <w:top w:val="single" w:color="D9D9D9" w:sz="4" w:space="0"/>
+              <w:left w:val="single" w:color="D9D9D9" w:sz="4" w:space="0"/>
+              <w:bottom w:val="single" w:color="D9D9D9" w:sz="4" w:space="0"/>
+              <w:right w:val="single" w:color="D9D9D9" w:sz="4" w:space="0"/>
+            </w:tcBorders>
+            <w:shd w:val="clear" w:color="auto" w:fill="274766"/>
             <w:tcMar>
               <w:top w:w="90" w:type="dxa"/>
-              <w:start w:w="90" w:type="dxa"/>
+              <w:left w:w="90" w:type="dxa"/>
               <w:bottom w:w="90" w:type="dxa"/>
-              <w:end w:w="90" w:type="dxa"/>
-            </w:tcMar>
-            <w:shd w:fill="274766"/>
+              <w:right w:w="90" w:type="dxa"/>
+            </w:tcMar>
+            <w:vAlign w:val="center"/>
           </w:tcPr>
           <w:p>
             <w:pPr>
@@ -15052,7 +14682,7 @@
             </w:pPr>
             <w:r>
               <w:rPr>
-                <w:rFonts w:ascii="Microsoft YaHei" w:hAnsi="Microsoft YaHei" w:eastAsia="Microsoft YaHei"/>
+                <w:rFonts w:ascii="微软雅黑" w:hAnsi="微软雅黑" w:eastAsia="微软雅黑"/>
                 <w:b/>
                 <w:color w:val="FFFFFF"/>
                 <w:sz w:val="17"/>
@@ -15063,21 +14693,21 @@
         </w:tc>
         <w:tc>
           <w:tcPr>
-            <w:tcW w:type="dxa" w:w="3072"/>
-            <w:vAlign w:val="center"/>
-            <w:tcBorders>
-              <w:top w:val="single" w:sz="4" w:color="D9D9D9"/>
-              <w:left w:val="single" w:sz="4" w:color="D9D9D9"/>
-              <w:bottom w:val="single" w:sz="4" w:color="D9D9D9"/>
-              <w:right w:val="single" w:sz="4" w:color="D9D9D9"/>
-            </w:tcBorders>
+            <w:tcW w:w="3072" w:type="dxa"/>
+            <w:tcBorders>
+              <w:top w:val="single" w:color="D9D9D9" w:sz="4" w:space="0"/>
+              <w:left w:val="single" w:color="D9D9D9" w:sz="4" w:space="0"/>
+              <w:bottom w:val="single" w:color="D9D9D9" w:sz="4" w:space="0"/>
+              <w:right w:val="single" w:color="D9D9D9" w:sz="4" w:space="0"/>
+            </w:tcBorders>
+            <w:shd w:val="clear" w:color="auto" w:fill="274766"/>
             <w:tcMar>
               <w:top w:w="90" w:type="dxa"/>
-              <w:start w:w="90" w:type="dxa"/>
+              <w:left w:w="90" w:type="dxa"/>
               <w:bottom w:w="90" w:type="dxa"/>
-              <w:end w:w="90" w:type="dxa"/>
-            </w:tcMar>
-            <w:shd w:fill="274766"/>
+              <w:right w:w="90" w:type="dxa"/>
+            </w:tcMar>
+            <w:vAlign w:val="center"/>
           </w:tcPr>
           <w:p>
             <w:pPr>
@@ -15085,7 +14715,7 @@
             </w:pPr>
             <w:r>
               <w:rPr>
-                <w:rFonts w:ascii="Microsoft YaHei" w:hAnsi="Microsoft YaHei" w:eastAsia="Microsoft YaHei"/>
+                <w:rFonts w:ascii="微软雅黑" w:hAnsi="微软雅黑" w:eastAsia="微软雅黑"/>
                 <w:b/>
                 <w:color w:val="FFFFFF"/>
                 <w:sz w:val="17"/>
@@ -15096,21 +14726,21 @@
         </w:tc>
         <w:tc>
           <w:tcPr>
-            <w:tcW w:type="dxa" w:w="3072"/>
-            <w:vAlign w:val="center"/>
-            <w:tcBorders>
-              <w:top w:val="single" w:sz="4" w:color="D9D9D9"/>
-              <w:left w:val="single" w:sz="4" w:color="D9D9D9"/>
-              <w:bottom w:val="single" w:sz="4" w:color="D9D9D9"/>
-              <w:right w:val="single" w:sz="4" w:color="D9D9D9"/>
-            </w:tcBorders>
+            <w:tcW w:w="3072" w:type="dxa"/>
+            <w:tcBorders>
+              <w:top w:val="single" w:color="D9D9D9" w:sz="4" w:space="0"/>
+              <w:left w:val="single" w:color="D9D9D9" w:sz="4" w:space="0"/>
+              <w:bottom w:val="single" w:color="D9D9D9" w:sz="4" w:space="0"/>
+              <w:right w:val="single" w:color="D9D9D9" w:sz="4" w:space="0"/>
+            </w:tcBorders>
+            <w:shd w:val="clear" w:color="auto" w:fill="274766"/>
             <w:tcMar>
               <w:top w:w="90" w:type="dxa"/>
-              <w:start w:w="90" w:type="dxa"/>
+              <w:left w:w="90" w:type="dxa"/>
               <w:bottom w:w="90" w:type="dxa"/>
-              <w:end w:w="90" w:type="dxa"/>
-            </w:tcMar>
-            <w:shd w:fill="274766"/>
+              <w:right w:w="90" w:type="dxa"/>
+            </w:tcMar>
+            <w:vAlign w:val="center"/>
           </w:tcPr>
           <w:p>
             <w:pPr>
@@ -15118,7 +14748,7 @@
             </w:pPr>
             <w:r>
               <w:rPr>
-                <w:rFonts w:ascii="Microsoft YaHei" w:hAnsi="Microsoft YaHei" w:eastAsia="Microsoft YaHei"/>
+                <w:rFonts w:ascii="微软雅黑" w:hAnsi="微软雅黑" w:eastAsia="微软雅黑"/>
                 <w:b/>
                 <w:color w:val="FFFFFF"/>
                 <w:sz w:val="17"/>
@@ -15129,25 +14759,33 @@
         </w:tc>
       </w:tr>
       <w:tr>
+        <w:tblPrEx>
+          <w:tblCellMar>
+            <w:top w:w="0" w:type="dxa"/>
+            <w:left w:w="108" w:type="dxa"/>
+            <w:bottom w:w="0" w:type="dxa"/>
+            <w:right w:w="108" w:type="dxa"/>
+          </w:tblCellMar>
+        </w:tblPrEx>
         <w:trPr>
           <w:cantSplit/>
         </w:trPr>
         <w:tc>
           <w:tcPr>
-            <w:tcW w:type="dxa" w:w="3072"/>
-            <w:vAlign w:val="center"/>
-            <w:tcBorders>
-              <w:top w:val="single" w:sz="4" w:color="D9D9D9"/>
-              <w:left w:val="single" w:sz="4" w:color="D9D9D9"/>
-              <w:bottom w:val="single" w:sz="4" w:color="D9D9D9"/>
-              <w:right w:val="single" w:sz="4" w:color="D9D9D9"/>
+            <w:tcW w:w="3072" w:type="dxa"/>
+            <w:tcBorders>
+              <w:top w:val="single" w:color="D9D9D9" w:sz="4" w:space="0"/>
+              <w:left w:val="single" w:color="D9D9D9" w:sz="4" w:space="0"/>
+              <w:bottom w:val="single" w:color="D9D9D9" w:sz="4" w:space="0"/>
+              <w:right w:val="single" w:color="D9D9D9" w:sz="4" w:space="0"/>
             </w:tcBorders>
             <w:tcMar>
               <w:top w:w="90" w:type="dxa"/>
-              <w:start w:w="90" w:type="dxa"/>
+              <w:left w:w="90" w:type="dxa"/>
               <w:bottom w:w="90" w:type="dxa"/>
-              <w:end w:w="90" w:type="dxa"/>
-            </w:tcMar>
+              <w:right w:w="90" w:type="dxa"/>
+            </w:tcMar>
+            <w:vAlign w:val="center"/>
           </w:tcPr>
           <w:p>
             <w:pPr>
@@ -15155,7 +14793,7 @@
             </w:pPr>
             <w:r>
               <w:rPr>
-                <w:rFonts w:ascii="Microsoft YaHei" w:hAnsi="Microsoft YaHei" w:eastAsia="Microsoft YaHei"/>
+                <w:rFonts w:ascii="微软雅黑" w:hAnsi="微软雅黑" w:eastAsia="微软雅黑"/>
                 <w:b w:val="0"/>
                 <w:color w:val="000000"/>
                 <w:sz w:val="17"/>
@@ -15166,20 +14804,20 @@
         </w:tc>
         <w:tc>
           <w:tcPr>
-            <w:tcW w:type="dxa" w:w="3072"/>
-            <w:vAlign w:val="center"/>
-            <w:tcBorders>
-              <w:top w:val="single" w:sz="4" w:color="D9D9D9"/>
-              <w:left w:val="single" w:sz="4" w:color="D9D9D9"/>
-              <w:bottom w:val="single" w:sz="4" w:color="D9D9D9"/>
-              <w:right w:val="single" w:sz="4" w:color="D9D9D9"/>
+            <w:tcW w:w="3072" w:type="dxa"/>
+            <w:tcBorders>
+              <w:top w:val="single" w:color="D9D9D9" w:sz="4" w:space="0"/>
+              <w:left w:val="single" w:color="D9D9D9" w:sz="4" w:space="0"/>
+              <w:bottom w:val="single" w:color="D9D9D9" w:sz="4" w:space="0"/>
+              <w:right w:val="single" w:color="D9D9D9" w:sz="4" w:space="0"/>
             </w:tcBorders>
             <w:tcMar>
               <w:top w:w="90" w:type="dxa"/>
-              <w:start w:w="90" w:type="dxa"/>
+              <w:left w:w="90" w:type="dxa"/>
               <w:bottom w:w="90" w:type="dxa"/>
-              <w:end w:w="90" w:type="dxa"/>
-            </w:tcMar>
+              <w:right w:w="90" w:type="dxa"/>
+            </w:tcMar>
+            <w:vAlign w:val="center"/>
           </w:tcPr>
           <w:p>
             <w:pPr>
@@ -15187,7 +14825,7 @@
             </w:pPr>
             <w:r>
               <w:rPr>
-                <w:rFonts w:ascii="Microsoft YaHei" w:hAnsi="Microsoft YaHei" w:eastAsia="Microsoft YaHei"/>
+                <w:rFonts w:ascii="微软雅黑" w:hAnsi="微软雅黑" w:eastAsia="微软雅黑"/>
                 <w:b w:val="0"/>
                 <w:color w:val="000000"/>
                 <w:sz w:val="17"/>
@@ -15198,20 +14836,20 @@
         </w:tc>
         <w:tc>
           <w:tcPr>
-            <w:tcW w:type="dxa" w:w="3072"/>
-            <w:vAlign w:val="center"/>
-            <w:tcBorders>
-              <w:top w:val="single" w:sz="4" w:color="D9D9D9"/>
-              <w:left w:val="single" w:sz="4" w:color="D9D9D9"/>
-              <w:bottom w:val="single" w:sz="4" w:color="D9D9D9"/>
-              <w:right w:val="single" w:sz="4" w:color="D9D9D9"/>
+            <w:tcW w:w="3072" w:type="dxa"/>
+            <w:tcBorders>
+              <w:top w:val="single" w:color="D9D9D9" w:sz="4" w:space="0"/>
+              <w:left w:val="single" w:color="D9D9D9" w:sz="4" w:space="0"/>
+              <w:bottom w:val="single" w:color="D9D9D9" w:sz="4" w:space="0"/>
+              <w:right w:val="single" w:color="D9D9D9" w:sz="4" w:space="0"/>
             </w:tcBorders>
             <w:tcMar>
               <w:top w:w="90" w:type="dxa"/>
-              <w:start w:w="90" w:type="dxa"/>
+              <w:left w:w="90" w:type="dxa"/>
               <w:bottom w:w="90" w:type="dxa"/>
-              <w:end w:w="90" w:type="dxa"/>
-            </w:tcMar>
+              <w:right w:w="90" w:type="dxa"/>
+            </w:tcMar>
+            <w:vAlign w:val="center"/>
           </w:tcPr>
           <w:p>
             <w:pPr>
@@ -15219,7 +14857,7 @@
             </w:pPr>
             <w:r>
               <w:rPr>
-                <w:rFonts w:ascii="Microsoft YaHei" w:hAnsi="Microsoft YaHei" w:eastAsia="Microsoft YaHei"/>
+                <w:rFonts w:ascii="微软雅黑" w:hAnsi="微软雅黑" w:eastAsia="微软雅黑"/>
                 <w:b w:val="0"/>
                 <w:color w:val="000000"/>
                 <w:sz w:val="17"/>
@@ -15230,26 +14868,34 @@
         </w:tc>
       </w:tr>
       <w:tr>
+        <w:tblPrEx>
+          <w:tblCellMar>
+            <w:top w:w="0" w:type="dxa"/>
+            <w:left w:w="108" w:type="dxa"/>
+            <w:bottom w:w="0" w:type="dxa"/>
+            <w:right w:w="108" w:type="dxa"/>
+          </w:tblCellMar>
+        </w:tblPrEx>
         <w:trPr>
           <w:cantSplit/>
         </w:trPr>
         <w:tc>
           <w:tcPr>
-            <w:tcW w:type="dxa" w:w="3072"/>
-            <w:vAlign w:val="center"/>
-            <w:tcBorders>
-              <w:top w:val="single" w:sz="4" w:color="D9D9D9"/>
-              <w:left w:val="single" w:sz="4" w:color="D9D9D9"/>
-              <w:bottom w:val="single" w:sz="4" w:color="D9D9D9"/>
-              <w:right w:val="single" w:sz="4" w:color="D9D9D9"/>
-            </w:tcBorders>
+            <w:tcW w:w="3072" w:type="dxa"/>
+            <w:tcBorders>
+              <w:top w:val="single" w:color="D9D9D9" w:sz="4" w:space="0"/>
+              <w:left w:val="single" w:color="D9D9D9" w:sz="4" w:space="0"/>
+              <w:bottom w:val="single" w:color="D9D9D9" w:sz="4" w:space="0"/>
+              <w:right w:val="single" w:color="D9D9D9" w:sz="4" w:space="0"/>
+            </w:tcBorders>
+            <w:shd w:val="clear" w:color="auto" w:fill="F4F7FA"/>
             <w:tcMar>
               <w:top w:w="90" w:type="dxa"/>
-              <w:start w:w="90" w:type="dxa"/>
+              <w:left w:w="90" w:type="dxa"/>
               <w:bottom w:w="90" w:type="dxa"/>
-              <w:end w:w="90" w:type="dxa"/>
-            </w:tcMar>
-            <w:shd w:fill="F4F7FA"/>
+              <w:right w:w="90" w:type="dxa"/>
+            </w:tcMar>
+            <w:vAlign w:val="center"/>
           </w:tcPr>
           <w:p>
             <w:pPr>
@@ -15257,7 +14903,7 @@
             </w:pPr>
             <w:r>
               <w:rPr>
-                <w:rFonts w:ascii="Microsoft YaHei" w:hAnsi="Microsoft YaHei" w:eastAsia="Microsoft YaHei"/>
+                <w:rFonts w:ascii="微软雅黑" w:hAnsi="微软雅黑" w:eastAsia="微软雅黑"/>
                 <w:b w:val="0"/>
                 <w:color w:val="000000"/>
                 <w:sz w:val="17"/>
@@ -15268,21 +14914,21 @@
         </w:tc>
         <w:tc>
           <w:tcPr>
-            <w:tcW w:type="dxa" w:w="3072"/>
-            <w:vAlign w:val="center"/>
-            <w:tcBorders>
-              <w:top w:val="single" w:sz="4" w:color="D9D9D9"/>
-              <w:left w:val="single" w:sz="4" w:color="D9D9D9"/>
-              <w:bottom w:val="single" w:sz="4" w:color="D9D9D9"/>
-              <w:right w:val="single" w:sz="4" w:color="D9D9D9"/>
-            </w:tcBorders>
+            <w:tcW w:w="3072" w:type="dxa"/>
+            <w:tcBorders>
+              <w:top w:val="single" w:color="D9D9D9" w:sz="4" w:space="0"/>
+              <w:left w:val="single" w:color="D9D9D9" w:sz="4" w:space="0"/>
+              <w:bottom w:val="single" w:color="D9D9D9" w:sz="4" w:space="0"/>
+              <w:right w:val="single" w:color="D9D9D9" w:sz="4" w:space="0"/>
+            </w:tcBorders>
+            <w:shd w:val="clear" w:color="auto" w:fill="F4F7FA"/>
             <w:tcMar>
               <w:top w:w="90" w:type="dxa"/>
-              <w:start w:w="90" w:type="dxa"/>
+              <w:left w:w="90" w:type="dxa"/>
               <w:bottom w:w="90" w:type="dxa"/>
-              <w:end w:w="90" w:type="dxa"/>
-            </w:tcMar>
-            <w:shd w:fill="F4F7FA"/>
+              <w:right w:w="90" w:type="dxa"/>
+            </w:tcMar>
+            <w:vAlign w:val="center"/>
           </w:tcPr>
           <w:p>
             <w:pPr>
@@ -15290,7 +14936,7 @@
             </w:pPr>
             <w:r>
               <w:rPr>
-                <w:rFonts w:ascii="Microsoft YaHei" w:hAnsi="Microsoft YaHei" w:eastAsia="Microsoft YaHei"/>
+                <w:rFonts w:ascii="微软雅黑" w:hAnsi="微软雅黑" w:eastAsia="微软雅黑"/>
                 <w:b w:val="0"/>
                 <w:color w:val="000000"/>
                 <w:sz w:val="17"/>
@@ -15301,21 +14947,21 @@
         </w:tc>
         <w:tc>
           <w:tcPr>
-            <w:tcW w:type="dxa" w:w="3072"/>
-            <w:vAlign w:val="center"/>
-            <w:tcBorders>
-              <w:top w:val="single" w:sz="4" w:color="D9D9D9"/>
-              <w:left w:val="single" w:sz="4" w:color="D9D9D9"/>
-              <w:bottom w:val="single" w:sz="4" w:color="D9D9D9"/>
-              <w:right w:val="single" w:sz="4" w:color="D9D9D9"/>
-            </w:tcBorders>
+            <w:tcW w:w="3072" w:type="dxa"/>
+            <w:tcBorders>
+              <w:top w:val="single" w:color="D9D9D9" w:sz="4" w:space="0"/>
+              <w:left w:val="single" w:color="D9D9D9" w:sz="4" w:space="0"/>
+              <w:bottom w:val="single" w:color="D9D9D9" w:sz="4" w:space="0"/>
+              <w:right w:val="single" w:color="D9D9D9" w:sz="4" w:space="0"/>
+            </w:tcBorders>
+            <w:shd w:val="clear" w:color="auto" w:fill="F4F7FA"/>
             <w:tcMar>
               <w:top w:w="90" w:type="dxa"/>
-              <w:start w:w="90" w:type="dxa"/>
+              <w:left w:w="90" w:type="dxa"/>
               <w:bottom w:w="90" w:type="dxa"/>
-              <w:end w:w="90" w:type="dxa"/>
-            </w:tcMar>
-            <w:shd w:fill="F4F7FA"/>
+              <w:right w:w="90" w:type="dxa"/>
+            </w:tcMar>
+            <w:vAlign w:val="center"/>
           </w:tcPr>
           <w:p>
             <w:pPr>
@@ -15323,7 +14969,7 @@
             </w:pPr>
             <w:r>
               <w:rPr>
-                <w:rFonts w:ascii="Microsoft YaHei" w:hAnsi="Microsoft YaHei" w:eastAsia="Microsoft YaHei"/>
+                <w:rFonts w:ascii="微软雅黑" w:hAnsi="微软雅黑" w:eastAsia="微软雅黑"/>
                 <w:b w:val="0"/>
                 <w:color w:val="000000"/>
                 <w:sz w:val="17"/>
@@ -15334,25 +14980,33 @@
         </w:tc>
       </w:tr>
       <w:tr>
+        <w:tblPrEx>
+          <w:tblCellMar>
+            <w:top w:w="0" w:type="dxa"/>
+            <w:left w:w="108" w:type="dxa"/>
+            <w:bottom w:w="0" w:type="dxa"/>
+            <w:right w:w="108" w:type="dxa"/>
+          </w:tblCellMar>
+        </w:tblPrEx>
         <w:trPr>
           <w:cantSplit/>
         </w:trPr>
         <w:tc>
           <w:tcPr>
-            <w:tcW w:type="dxa" w:w="3072"/>
-            <w:vAlign w:val="center"/>
-            <w:tcBorders>
-              <w:top w:val="single" w:sz="4" w:color="D9D9D9"/>
-              <w:left w:val="single" w:sz="4" w:color="D9D9D9"/>
-              <w:bottom w:val="single" w:sz="4" w:color="D9D9D9"/>
-              <w:right w:val="single" w:sz="4" w:color="D9D9D9"/>
+            <w:tcW w:w="3072" w:type="dxa"/>
+            <w:tcBorders>
+              <w:top w:val="single" w:color="D9D9D9" w:sz="4" w:space="0"/>
+              <w:left w:val="single" w:color="D9D9D9" w:sz="4" w:space="0"/>
+              <w:bottom w:val="single" w:color="D9D9D9" w:sz="4" w:space="0"/>
+              <w:right w:val="single" w:color="D9D9D9" w:sz="4" w:space="0"/>
             </w:tcBorders>
             <w:tcMar>
               <w:top w:w="90" w:type="dxa"/>
-              <w:start w:w="90" w:type="dxa"/>
+              <w:left w:w="90" w:type="dxa"/>
               <w:bottom w:w="90" w:type="dxa"/>
-              <w:end w:w="90" w:type="dxa"/>
-            </w:tcMar>
+              <w:right w:w="90" w:type="dxa"/>
+            </w:tcMar>
+            <w:vAlign w:val="center"/>
           </w:tcPr>
           <w:p>
             <w:pPr>
@@ -15360,7 +15014,7 @@
             </w:pPr>
             <w:r>
               <w:rPr>
-                <w:rFonts w:ascii="Microsoft YaHei" w:hAnsi="Microsoft YaHei" w:eastAsia="Microsoft YaHei"/>
+                <w:rFonts w:ascii="微软雅黑" w:hAnsi="微软雅黑" w:eastAsia="微软雅黑"/>
                 <w:b w:val="0"/>
                 <w:color w:val="000000"/>
                 <w:sz w:val="17"/>
@@ -15371,20 +15025,20 @@
         </w:tc>
         <w:tc>
           <w:tcPr>
-            <w:tcW w:type="dxa" w:w="3072"/>
-            <w:vAlign w:val="center"/>
-            <w:tcBorders>
-              <w:top w:val="single" w:sz="4" w:color="D9D9D9"/>
-              <w:left w:val="single" w:sz="4" w:color="D9D9D9"/>
-              <w:bottom w:val="single" w:sz="4" w:color="D9D9D9"/>
-              <w:right w:val="single" w:sz="4" w:color="D9D9D9"/>
+            <w:tcW w:w="3072" w:type="dxa"/>
+            <w:tcBorders>
+              <w:top w:val="single" w:color="D9D9D9" w:sz="4" w:space="0"/>
+              <w:left w:val="single" w:color="D9D9D9" w:sz="4" w:space="0"/>
+              <w:bottom w:val="single" w:color="D9D9D9" w:sz="4" w:space="0"/>
+              <w:right w:val="single" w:color="D9D9D9" w:sz="4" w:space="0"/>
             </w:tcBorders>
             <w:tcMar>
               <w:top w:w="90" w:type="dxa"/>
-              <w:start w:w="90" w:type="dxa"/>
+              <w:left w:w="90" w:type="dxa"/>
               <w:bottom w:w="90" w:type="dxa"/>
-              <w:end w:w="90" w:type="dxa"/>
-            </w:tcMar>
+              <w:right w:w="90" w:type="dxa"/>
+            </w:tcMar>
+            <w:vAlign w:val="center"/>
           </w:tcPr>
           <w:p>
             <w:pPr>
@@ -15392,7 +15046,7 @@
             </w:pPr>
             <w:r>
               <w:rPr>
-                <w:rFonts w:ascii="Microsoft YaHei" w:hAnsi="Microsoft YaHei" w:eastAsia="Microsoft YaHei"/>
+                <w:rFonts w:ascii="微软雅黑" w:hAnsi="微软雅黑" w:eastAsia="微软雅黑"/>
                 <w:b w:val="0"/>
                 <w:color w:val="000000"/>
                 <w:sz w:val="17"/>
@@ -15403,20 +15057,20 @@
         </w:tc>
         <w:tc>
           <w:tcPr>
-            <w:tcW w:type="dxa" w:w="3072"/>
-            <w:vAlign w:val="center"/>
-            <w:tcBorders>
-              <w:top w:val="single" w:sz="4" w:color="D9D9D9"/>
-              <w:left w:val="single" w:sz="4" w:color="D9D9D9"/>
-              <w:bottom w:val="single" w:sz="4" w:color="D9D9D9"/>
-              <w:right w:val="single" w:sz="4" w:color="D9D9D9"/>
+            <w:tcW w:w="3072" w:type="dxa"/>
+            <w:tcBorders>
+              <w:top w:val="single" w:color="D9D9D9" w:sz="4" w:space="0"/>
+              <w:left w:val="single" w:color="D9D9D9" w:sz="4" w:space="0"/>
+              <w:bottom w:val="single" w:color="D9D9D9" w:sz="4" w:space="0"/>
+              <w:right w:val="single" w:color="D9D9D9" w:sz="4" w:space="0"/>
             </w:tcBorders>
             <w:tcMar>
               <w:top w:w="90" w:type="dxa"/>
-              <w:start w:w="90" w:type="dxa"/>
+              <w:left w:w="90" w:type="dxa"/>
               <w:bottom w:w="90" w:type="dxa"/>
-              <w:end w:w="90" w:type="dxa"/>
-            </w:tcMar>
+              <w:right w:w="90" w:type="dxa"/>
+            </w:tcMar>
+            <w:vAlign w:val="center"/>
           </w:tcPr>
           <w:p>
             <w:pPr>
@@ -15424,7 +15078,7 @@
             </w:pPr>
             <w:r>
               <w:rPr>
-                <w:rFonts w:ascii="Microsoft YaHei" w:hAnsi="Microsoft YaHei" w:eastAsia="Microsoft YaHei"/>
+                <w:rFonts w:ascii="微软雅黑" w:hAnsi="微软雅黑" w:eastAsia="微软雅黑"/>
                 <w:b w:val="0"/>
                 <w:color w:val="000000"/>
                 <w:sz w:val="17"/>
@@ -15443,10 +15097,25 @@
       </w:pPr>
       <w:r>
         <w:rPr>
-          <w:rFonts w:ascii="Microsoft YaHei" w:hAnsi="Microsoft YaHei" w:eastAsia="Microsoft YaHei"/>
+          <w:rFonts w:ascii="微软雅黑" w:hAnsi="微软雅黑" w:eastAsia="微软雅黑"/>
           <w:sz w:val="22"/>
         </w:rPr>
-        <w:t>6.6.8 当前证据缺口</w:t>
+        <w:t>6.</w:t>
+      </w:r>
+      <w:r>
+        <w:rPr>
+          <w:rFonts w:hint="eastAsia" w:ascii="微软雅黑" w:hAnsi="微软雅黑" w:eastAsia="微软雅黑"/>
+          <w:sz w:val="22"/>
+          <w:lang w:val="en-US" w:eastAsia="zh-CN"/>
+        </w:rPr>
+        <w:t>6</w:t>
+      </w:r>
+      <w:r>
+        <w:rPr>
+          <w:rFonts w:ascii="微软雅黑" w:hAnsi="微软雅黑" w:eastAsia="微软雅黑"/>
+          <w:sz w:val="22"/>
+        </w:rPr>
+        <w:t xml:space="preserve"> 最强反驳、风险与更简单替代</w:t>
       </w:r>
     </w:p>
     <w:p>
@@ -15455,10 +15124,25 @@
       </w:pPr>
       <w:r>
         <w:rPr>
-          <w:rFonts w:ascii="Microsoft YaHei" w:hAnsi="Microsoft YaHei" w:eastAsia="Microsoft YaHei"/>
+          <w:rFonts w:ascii="微软雅黑" w:hAnsi="微软雅黑" w:eastAsia="微软雅黑"/>
           <w:sz w:val="19"/>
         </w:rPr>
-        <w:t>1. 缺乏本候选方法与现有系统的逐能力差异证据，不能宣称首次解决物理诊断。</w:t>
+        <w:t xml:space="preserve">- </w:t>
+      </w:r>
+      <w:r>
+        <w:rPr>
+          <w:rFonts w:ascii="微软雅黑" w:hAnsi="微软雅黑" w:eastAsia="微软雅黑"/>
+          <w:b/>
+          <w:sz w:val="19"/>
+        </w:rPr>
+        <w:t>已有能力反例</w:t>
+      </w:r>
+      <w:r>
+        <w:rPr>
+          <w:rFonts w:ascii="微软雅黑" w:hAnsi="微软雅黑" w:eastAsia="微软雅黑"/>
+          <w:sz w:val="19"/>
+        </w:rPr>
+        <w:t>：AutoPhotonicDesign 已展示定量反馈与自主迭代；若其已有诊断/策略选择足够，本方向创新空间可能很窄。专家修正说明条件边界，不证明所有诊断均缺失。</w:t>
       </w:r>
     </w:p>
     <w:p>
@@ -15467,10 +15151,25 @@
       </w:pPr>
       <w:r>
         <w:rPr>
-          <w:rFonts w:ascii="Microsoft YaHei" w:hAnsi="Microsoft YaHei" w:eastAsia="Microsoft YaHei"/>
+          <w:rFonts w:ascii="微软雅黑" w:hAnsi="微软雅黑" w:eastAsia="微软雅黑"/>
           <w:sz w:val="19"/>
         </w:rPr>
-        <w:t>2. 缺少同工具、预算和信息条件下的比较，不能宣称可靠性或效率增益。</w:t>
+        <w:t xml:space="preserve">- </w:t>
+      </w:r>
+      <w:r>
+        <w:rPr>
+          <w:rFonts w:ascii="微软雅黑" w:hAnsi="微软雅黑" w:eastAsia="微软雅黑"/>
+          <w:b/>
+          <w:sz w:val="19"/>
+        </w:rPr>
+        <w:t>数值优化反例</w:t>
+      </w:r>
+      <w:r>
+        <w:rPr>
+          <w:rFonts w:ascii="微软雅黑" w:hAnsi="微软雅黑" w:eastAsia="微软雅黑"/>
+          <w:sz w:val="19"/>
+        </w:rPr>
+        <w:t>：固定目标下成熟优化更直接、确定且成本更低；必要时优先采用规则、参数扫描或优化器，而非增加 Agent。</w:t>
       </w:r>
     </w:p>
     <w:p>
@@ -15479,10 +15178,25 @@
       </w:pPr>
       <w:r>
         <w:rPr>
-          <w:rFonts w:ascii="Microsoft YaHei" w:hAnsi="Microsoft YaHei" w:eastAsia="Microsoft YaHei"/>
+          <w:rFonts w:ascii="微软雅黑" w:hAnsi="微软雅黑" w:eastAsia="微软雅黑"/>
           <w:sz w:val="19"/>
         </w:rPr>
-        <w:t>3. 缺少诊断预测与后续仿真结果的一致性证据；“解释正确”不自动意味着“决策正确”。</w:t>
+        <w:t xml:space="preserve">- </w:t>
+      </w:r>
+      <w:r>
+        <w:rPr>
+          <w:rFonts w:ascii="微软雅黑" w:hAnsi="微软雅黑" w:eastAsia="微软雅黑"/>
+          <w:b/>
+          <w:sz w:val="19"/>
+        </w:rPr>
+        <w:t>错误因果风险</w:t>
+      </w:r>
+      <w:r>
+        <w:rPr>
+          <w:rFonts w:ascii="微软雅黑" w:hAnsi="微软雅黑" w:eastAsia="微软雅黑"/>
+          <w:sz w:val="19"/>
+        </w:rPr>
+        <w:t>：Agent 的物理故事可能与真实失败原因无关；仿真设置错误还会让反馈“有数值但不可信”。</w:t>
       </w:r>
     </w:p>
     <w:p>
@@ -15491,10 +15205,25 @@
       </w:pPr>
       <w:r>
         <w:rPr>
-          <w:rFonts w:ascii="Microsoft YaHei" w:hAnsi="Microsoft YaHei" w:eastAsia="Microsoft YaHei"/>
+          <w:rFonts w:ascii="微软雅黑" w:hAnsi="微软雅黑" w:eastAsia="微软雅黑"/>
           <w:sz w:val="19"/>
         </w:rPr>
-        <w:t>4. 缺少跨器件、工艺、模型和任务的迁移证据。</w:t>
+        <w:t xml:space="preserve">- </w:t>
+      </w:r>
+      <w:r>
+        <w:rPr>
+          <w:rFonts w:ascii="微软雅黑" w:hAnsi="微软雅黑" w:eastAsia="微软雅黑"/>
+          <w:b/>
+          <w:sz w:val="19"/>
+        </w:rPr>
+        <w:t>评价偏差风险</w:t>
+      </w:r>
+      <w:r>
+        <w:rPr>
+          <w:rFonts w:ascii="微软雅黑" w:hAnsi="微软雅黑" w:eastAsia="微软雅黑"/>
+          <w:sz w:val="19"/>
+        </w:rPr>
+        <w:t>：同一 LLM 生成与评判诊断，或只选择成功案例，均可能虚高结果；具体评价设计尚未确定。</w:t>
       </w:r>
     </w:p>
     <w:p>
@@ -15503,10 +15232,52 @@
       </w:pPr>
       <w:r>
         <w:rPr>
-          <w:rFonts w:ascii="Microsoft YaHei" w:hAnsi="Microsoft YaHei" w:eastAsia="Microsoft YaHei"/>
+          <w:rFonts w:ascii="微软雅黑" w:hAnsi="微软雅黑" w:eastAsia="微软雅黑"/>
           <w:sz w:val="19"/>
         </w:rPr>
-        <w:t>5. 没有本项目制造、全系统 DAS、PDK 签核或实验结果；仿真结论不能越级外推。</w:t>
+        <w:t xml:space="preserve">- </w:t>
+      </w:r>
+      <w:r>
+        <w:rPr>
+          <w:rFonts w:ascii="微软雅黑" w:hAnsi="微软雅黑" w:eastAsia="微软雅黑"/>
+          <w:b/>
+          <w:sz w:val="19"/>
+        </w:rPr>
+        <w:t>机会成本</w:t>
+      </w:r>
+      <w:r>
+        <w:rPr>
+          <w:rFonts w:ascii="微软雅黑" w:hAnsi="微软雅黑" w:eastAsia="微软雅黑"/>
+          <w:sz w:val="19"/>
+        </w:rPr>
+        <w:t>：通用 Harness、领域知识、复杂 DAS 和方法研究同时扩张会分散精力。候选系统边界需收敛，不能承诺硕士阶段完成通用端到端签核。</w:t>
+      </w:r>
+    </w:p>
+    <w:p>
+      <w:pPr>
+        <w:spacing w:after="120" w:line="278" w:lineRule="auto"/>
+      </w:pPr>
+      <w:r>
+        <w:rPr>
+          <w:rFonts w:ascii="微软雅黑" w:hAnsi="微软雅黑" w:eastAsia="微软雅黑"/>
+          <w:sz w:val="19"/>
+        </w:rPr>
+        <w:t xml:space="preserve">上述风险为 </w:t>
+      </w:r>
+      <w:r>
+        <w:rPr>
+          <w:rFonts w:ascii="微软雅黑" w:hAnsi="微软雅黑" w:eastAsia="微软雅黑"/>
+          <w:color w:val="44546A"/>
+          <w:sz w:val="19"/>
+        </w:rPr>
+        <w:t>INFERENCE</w:t>
+      </w:r>
+      <w:r>
+        <w:rPr>
+          <w:rFonts w:ascii="微软雅黑" w:hAnsi="微软雅黑" w:eastAsia="微软雅黑"/>
+          <w:sz w:val="19"/>
+        </w:rPr>
+        <w:t>；基于现有证据的审查不等于已经否定或确认候选方向。</w:t>
       </w:r>
     </w:p>
     <w:p>
@@ -15517,10 +15288,25 @@
       </w:pPr>
       <w:r>
         <w:rPr>
-          <w:rFonts w:ascii="Microsoft YaHei" w:hAnsi="Microsoft YaHei" w:eastAsia="Microsoft YaHei"/>
+          <w:rFonts w:ascii="微软雅黑" w:hAnsi="微软雅黑" w:eastAsia="微软雅黑"/>
           <w:sz w:val="22"/>
         </w:rPr>
-        <w:t>6.6.9 最强反驳、风险与更简单替代</w:t>
+        <w:t>6.</w:t>
+      </w:r>
+      <w:r>
+        <w:rPr>
+          <w:rFonts w:hint="eastAsia" w:ascii="微软雅黑" w:hAnsi="微软雅黑" w:eastAsia="微软雅黑"/>
+          <w:sz w:val="22"/>
+          <w:lang w:val="en-US" w:eastAsia="zh-CN"/>
+        </w:rPr>
+        <w:t>7</w:t>
+      </w:r>
+      <w:r>
+        <w:rPr>
+          <w:rFonts w:ascii="微软雅黑" w:hAnsi="微软雅黑" w:eastAsia="微软雅黑"/>
+          <w:sz w:val="22"/>
+        </w:rPr>
+        <w:t xml:space="preserve"> 需要导师确认</w:t>
       </w:r>
     </w:p>
     <w:p>
@@ -15529,25 +15315,10 @@
       </w:pPr>
       <w:r>
         <w:rPr>
-          <w:rFonts w:ascii="Microsoft YaHei" w:hAnsi="Microsoft YaHei" w:eastAsia="Microsoft YaHei"/>
+          <w:rFonts w:ascii="微软雅黑" w:hAnsi="微软雅黑" w:eastAsia="微软雅黑"/>
           <w:sz w:val="19"/>
         </w:rPr>
-        <w:t xml:space="preserve">- </w:t>
-      </w:r>
-      <w:r>
-        <w:rPr>
-          <w:rFonts w:ascii="Microsoft YaHei" w:hAnsi="Microsoft YaHei" w:eastAsia="Microsoft YaHei"/>
-          <w:b/>
-          <w:sz w:val="19"/>
-        </w:rPr>
-        <w:t>已有能力反例</w:t>
-      </w:r>
-      <w:r>
-        <w:rPr>
-          <w:rFonts w:ascii="Microsoft YaHei" w:hAnsi="Microsoft YaHei" w:eastAsia="Microsoft YaHei"/>
-          <w:sz w:val="19"/>
-        </w:rPr>
-        <w:t>：AutoPhotonicDesign 已展示定量反馈与自主迭代；若其已有诊断/策略选择足够，本方向创新空间可能很窄。专家修正说明条件边界，不证明所有诊断均缺失。</w:t>
+        <w:t>- 核心研究问题应聚焦哪种诊断与决策，如何与已有优化工作形成实质差异？</w:t>
       </w:r>
     </w:p>
     <w:p>
@@ -15556,25 +15327,10 @@
       </w:pPr>
       <w:r>
         <w:rPr>
-          <w:rFonts w:ascii="Microsoft YaHei" w:hAnsi="Microsoft YaHei" w:eastAsia="Microsoft YaHei"/>
+          <w:rFonts w:ascii="微软雅黑" w:hAnsi="微软雅黑" w:eastAsia="微软雅黑"/>
           <w:sz w:val="19"/>
         </w:rPr>
-        <w:t xml:space="preserve">- </w:t>
-      </w:r>
-      <w:r>
-        <w:rPr>
-          <w:rFonts w:ascii="Microsoft YaHei" w:hAnsi="Microsoft YaHei" w:eastAsia="Microsoft YaHei"/>
-          <w:b/>
-          <w:sz w:val="19"/>
-        </w:rPr>
-        <w:t>数值优化反例</w:t>
-      </w:r>
-      <w:r>
-        <w:rPr>
-          <w:rFonts w:ascii="Microsoft YaHei" w:hAnsi="Microsoft YaHei" w:eastAsia="Microsoft YaHei"/>
-          <w:sz w:val="19"/>
-        </w:rPr>
-        <w:t>：固定目标下成熟优化更直接、确定且成本更低；必要时优先采用规则、参数扫描或优化器，而非增加 Agent。</w:t>
+        <w:t>- 本候选主线是否值得继续核验，DAS 是主任务还是后续复杂应用之一？</w:t>
       </w:r>
     </w:p>
     <w:p>
@@ -15583,25 +15339,10 @@
       </w:pPr>
       <w:r>
         <w:rPr>
-          <w:rFonts w:ascii="Microsoft YaHei" w:hAnsi="Microsoft YaHei" w:eastAsia="Microsoft YaHei"/>
+          <w:rFonts w:ascii="微软雅黑" w:hAnsi="微软雅黑" w:eastAsia="微软雅黑"/>
           <w:sz w:val="19"/>
         </w:rPr>
-        <w:t xml:space="preserve">- </w:t>
-      </w:r>
-      <w:r>
-        <w:rPr>
-          <w:rFonts w:ascii="Microsoft YaHei" w:hAnsi="Microsoft YaHei" w:eastAsia="Microsoft YaHei"/>
-          <w:b/>
-          <w:sz w:val="19"/>
-        </w:rPr>
-        <w:t>错误因果风险</w:t>
-      </w:r>
-      <w:r>
-        <w:rPr>
-          <w:rFonts w:ascii="Microsoft YaHei" w:hAnsi="Microsoft YaHei" w:eastAsia="Microsoft YaHei"/>
-          <w:sz w:val="19"/>
-        </w:rPr>
-        <w:t>：Agent 的物理故事可能与真实失败原因无关；仿真设置错误还会让反馈“有数值但不可信”。</w:t>
+        <w:t>- 基础器件覆盖、方法深度与 Harness 系统边界如何取舍？</w:t>
       </w:r>
     </w:p>
     <w:p>
@@ -15610,25 +15351,10 @@
       </w:pPr>
       <w:r>
         <w:rPr>
-          <w:rFonts w:ascii="Microsoft YaHei" w:hAnsi="Microsoft YaHei" w:eastAsia="Microsoft YaHei"/>
+          <w:rFonts w:ascii="微软雅黑" w:hAnsi="微软雅黑" w:eastAsia="微软雅黑"/>
           <w:sz w:val="19"/>
         </w:rPr>
-        <w:t xml:space="preserve">- </w:t>
-      </w:r>
-      <w:r>
-        <w:rPr>
-          <w:rFonts w:ascii="Microsoft YaHei" w:hAnsi="Microsoft YaHei" w:eastAsia="Microsoft YaHei"/>
-          <w:b/>
-          <w:sz w:val="19"/>
-        </w:rPr>
-        <w:t>评价偏差风险</w:t>
-      </w:r>
-      <w:r>
-        <w:rPr>
-          <w:rFonts w:ascii="Microsoft YaHei" w:hAnsi="Microsoft YaHei" w:eastAsia="Microsoft YaHei"/>
-          <w:sz w:val="19"/>
-        </w:rPr>
-        <w:t>：同一 LLM 生成与评判诊断，或只选择成功案例，均可能虚高结果；具体评价设计尚未确定。</w:t>
+        <w:t>- 哪些假设应先补文献证据，哪些将来才需要实证？</w:t>
       </w:r>
     </w:p>
     <w:p>
@@ -15637,25 +15363,10 @@
       </w:pPr>
       <w:r>
         <w:rPr>
-          <w:rFonts w:ascii="Microsoft YaHei" w:hAnsi="Microsoft YaHei" w:eastAsia="Microsoft YaHei"/>
+          <w:rFonts w:ascii="微软雅黑" w:hAnsi="微软雅黑" w:eastAsia="微软雅黑"/>
           <w:sz w:val="19"/>
         </w:rPr>
-        <w:t xml:space="preserve">- </w:t>
-      </w:r>
-      <w:r>
-        <w:rPr>
-          <w:rFonts w:ascii="Microsoft YaHei" w:hAnsi="Microsoft YaHei" w:eastAsia="Microsoft YaHei"/>
-          <w:b/>
-          <w:sz w:val="19"/>
-        </w:rPr>
-        <w:t>机会成本</w:t>
-      </w:r>
-      <w:r>
-        <w:rPr>
-          <w:rFonts w:ascii="Microsoft YaHei" w:hAnsi="Microsoft YaHei" w:eastAsia="Microsoft YaHei"/>
-          <w:sz w:val="19"/>
-        </w:rPr>
-        <w:t>：通用 Harness、领域知识、复杂 DAS 和方法研究同时扩张会分散精力。候选系统边界需收敛，不能承诺硕士阶段完成通用端到端签核。</w:t>
+        <w:t>原有三条候选路线（见仓库同名证据材料）与正式报告第六章（见仓库同名证据材料）继续保留。本页是候选方向收敛材料，不授权工程、仿真或最终选题。</w:t>
       </w:r>
     </w:p>
     <w:p>
@@ -15664,108 +15375,7 @@
       </w:pPr>
       <w:r>
         <w:rPr>
-          <w:rFonts w:ascii="Microsoft YaHei" w:hAnsi="Microsoft YaHei" w:eastAsia="Microsoft YaHei"/>
-          <w:sz w:val="19"/>
-        </w:rPr>
-        <w:t xml:space="preserve">上述风险为 </w:t>
-      </w:r>
-      <w:r>
-        <w:rPr>
-          <w:rFonts w:ascii="Microsoft YaHei" w:hAnsi="Microsoft YaHei" w:eastAsia="Microsoft YaHei"/>
-          <w:color w:val="44546A"/>
-          <w:sz w:val="19"/>
-        </w:rPr>
-        <w:t>INFERENCE</w:t>
-      </w:r>
-      <w:r>
-        <w:rPr>
-          <w:rFonts w:ascii="Microsoft YaHei" w:hAnsi="Microsoft YaHei" w:eastAsia="Microsoft YaHei"/>
-          <w:sz w:val="19"/>
-        </w:rPr>
-        <w:t>；基于现有证据的审查不等于已经否定或确认候选方向。</w:t>
-      </w:r>
-    </w:p>
-    <w:p>
-      <w:pPr>
-        <w:pStyle w:val="5"/>
-        <w:keepNext/>
-        <w:spacing w:after="120" w:line="278" w:lineRule="auto"/>
-      </w:pPr>
-      <w:r>
-        <w:rPr>
-          <w:rFonts w:ascii="Microsoft YaHei" w:hAnsi="Microsoft YaHei" w:eastAsia="Microsoft YaHei"/>
-          <w:sz w:val="22"/>
-        </w:rPr>
-        <w:t>6.6.10 需要导师确认</w:t>
-      </w:r>
-    </w:p>
-    <w:p>
-      <w:pPr>
-        <w:spacing w:after="120" w:line="278" w:lineRule="auto"/>
-      </w:pPr>
-      <w:r>
-        <w:rPr>
-          <w:rFonts w:ascii="Microsoft YaHei" w:hAnsi="Microsoft YaHei" w:eastAsia="Microsoft YaHei"/>
-          <w:sz w:val="19"/>
-        </w:rPr>
-        <w:t>- 核心研究问题应聚焦哪种诊断与决策，如何与已有优化工作形成实质差异？</w:t>
-      </w:r>
-    </w:p>
-    <w:p>
-      <w:pPr>
-        <w:spacing w:after="120" w:line="278" w:lineRule="auto"/>
-      </w:pPr>
-      <w:r>
-        <w:rPr>
-          <w:rFonts w:ascii="Microsoft YaHei" w:hAnsi="Microsoft YaHei" w:eastAsia="Microsoft YaHei"/>
-          <w:sz w:val="19"/>
-        </w:rPr>
-        <w:t>- 本候选主线是否值得继续核验，DAS 是主任务还是后续复杂应用之一？</w:t>
-      </w:r>
-    </w:p>
-    <w:p>
-      <w:pPr>
-        <w:spacing w:after="120" w:line="278" w:lineRule="auto"/>
-      </w:pPr>
-      <w:r>
-        <w:rPr>
-          <w:rFonts w:ascii="Microsoft YaHei" w:hAnsi="Microsoft YaHei" w:eastAsia="Microsoft YaHei"/>
-          <w:sz w:val="19"/>
-        </w:rPr>
-        <w:t>- 基础器件覆盖、方法深度与 Harness 系统边界如何取舍？</w:t>
-      </w:r>
-    </w:p>
-    <w:p>
-      <w:pPr>
-        <w:spacing w:after="120" w:line="278" w:lineRule="auto"/>
-      </w:pPr>
-      <w:r>
-        <w:rPr>
-          <w:rFonts w:ascii="Microsoft YaHei" w:hAnsi="Microsoft YaHei" w:eastAsia="Microsoft YaHei"/>
-          <w:sz w:val="19"/>
-        </w:rPr>
-        <w:t>- 哪些假设应先补文献证据，哪些将来才需要实证？</w:t>
-      </w:r>
-    </w:p>
-    <w:p>
-      <w:pPr>
-        <w:spacing w:after="120" w:line="278" w:lineRule="auto"/>
-      </w:pPr>
-      <w:r>
-        <w:rPr>
-          <w:rFonts w:ascii="Microsoft YaHei" w:hAnsi="Microsoft YaHei" w:eastAsia="Microsoft YaHei"/>
-          <w:sz w:val="19"/>
-        </w:rPr>
-        <w:t>原有三条候选路线（见仓库同名证据材料）与正式报告第六章（见仓库同名证据材料）继续保留。本页是候选方向收敛材料，不授权工程、仿真或最终选题。</w:t>
-      </w:r>
-    </w:p>
-    <w:p>
-      <w:pPr>
-        <w:spacing w:after="120" w:line="278" w:lineRule="auto"/>
-      </w:pPr>
-      <w:r>
-        <w:rPr>
-          <w:rFonts w:ascii="Microsoft YaHei" w:hAnsi="Microsoft YaHei" w:eastAsia="Microsoft YaHei"/>
+          <w:rFonts w:ascii="微软雅黑" w:hAnsi="微软雅黑" w:eastAsia="微软雅黑"/>
           <w:sz w:val="19"/>
         </w:rPr>
         <w:t>本节事实源：references/task-007/candidate-research-direction.md；2026-09-30 用户候选主线授权。新增内容仅为候选分析，原有研究与用户编辑保留。</w:t>
@@ -16148,6 +15758,9 @@
     <w:p>
       <w:pPr>
         <w:spacing w:after="120" w:line="278" w:lineRule="auto"/>
+        <w:rPr>
+          <w:rFonts w:ascii="微软雅黑" w:hAnsi="微软雅黑" w:eastAsia="微软雅黑"/>
+        </w:rPr>
       </w:pPr>
       <w:r>
         <w:rPr>
@@ -16156,76 +15769,6 @@
         </w:rPr>
         <w:t>完整数据条件、原文页码与图示来源见仓库 references/task-016-evidence/ 的 key-data.csv、figure-sources.md、evidence-log.md 和 source-manifest.md。</w:t>
       </w:r>
-    </w:p>
-    <w:p>
-      <w:pPr>
-        <w:pStyle w:val="16"/>
-        <w:numPr>
-          <w:ilvl w:val="0"/>
-          <w:numId w:val="0"/>
-        </w:numPr>
-        <w:spacing w:after="80"/>
-        <w:ind w:leftChars="0"/>
-        <w:rPr>
-          <w:rFonts w:ascii="微软雅黑" w:hAnsi="微软雅黑" w:eastAsia="微软雅黑"/>
-        </w:rPr>
-      </w:pPr>
-    </w:p>
-    <w:p>
-      <w:pPr>
-        <w:pStyle w:val="16"/>
-        <w:numPr>
-          <w:ilvl w:val="0"/>
-          <w:numId w:val="0"/>
-        </w:numPr>
-        <w:spacing w:after="80"/>
-        <w:ind w:leftChars="0"/>
-        <w:rPr>
-          <w:rFonts w:ascii="微软雅黑" w:hAnsi="微软雅黑" w:eastAsia="微软雅黑"/>
-        </w:rPr>
-      </w:pPr>
-    </w:p>
-    <w:p>
-      <w:pPr>
-        <w:pStyle w:val="16"/>
-        <w:numPr>
-          <w:ilvl w:val="0"/>
-          <w:numId w:val="0"/>
-        </w:numPr>
-        <w:spacing w:after="80"/>
-        <w:ind w:leftChars="0"/>
-        <w:rPr>
-          <w:rFonts w:ascii="微软雅黑" w:hAnsi="微软雅黑" w:eastAsia="微软雅黑"/>
-        </w:rPr>
-      </w:pPr>
-    </w:p>
-    <w:p>
-      <w:pPr>
-        <w:pStyle w:val="16"/>
-        <w:numPr>
-          <w:ilvl w:val="0"/>
-          <w:numId w:val="0"/>
-        </w:numPr>
-        <w:spacing w:after="80"/>
-        <w:ind w:leftChars="0"/>
-        <w:rPr>
-          <w:rFonts w:ascii="微软雅黑" w:hAnsi="微软雅黑" w:eastAsia="微软雅黑"/>
-        </w:rPr>
-      </w:pPr>
-    </w:p>
-    <w:p>
-      <w:pPr>
-        <w:pStyle w:val="16"/>
-        <w:numPr>
-          <w:ilvl w:val="0"/>
-          <w:numId w:val="0"/>
-        </w:numPr>
-        <w:spacing w:after="80"/>
-        <w:ind w:leftChars="0"/>
-        <w:rPr>
-          <w:rFonts w:ascii="微软雅黑" w:hAnsi="微软雅黑" w:eastAsia="微软雅黑"/>
-        </w:rPr>
-      </w:pPr>
     </w:p>
     <w:p>
       <w:pPr>
@@ -20496,7 +20039,7 @@
   <w:docDefaults>
     <w:rPrDefault>
       <w:rPr>
-        <w:rFonts w:asciiTheme="minorHAnsi" w:hAnsiTheme="minorHAnsi" w:eastAsiaTheme="minorEastAsia" w:cstheme="minorBidi"/>
+        <w:rFonts w:ascii="Times New Roman" w:hAnsi="Times New Roman" w:eastAsia="宋体" w:cs="Times New Roman"/>
       </w:rPr>
     </w:rPrDefault>
     <w:pPrDefault/>
@@ -20653,7 +20196,7 @@
     <w:lsdException w:unhideWhenUsed="0" w:uiPriority="59" w:semiHidden="0" w:name="Table Grid"/>
     <w:lsdException w:uiPriority="99" w:name="Table Theme"/>
     <w:lsdException w:qFormat="1" w:unhideWhenUsed="0" w:uiPriority="1" w:semiHidden="0" w:name="No Spacing"/>
-    <w:lsdException w:unhideWhenUsed="0" w:uiPriority="60" w:semiHidden="0" w:name="Light Shading"/>
+    <w:lsdException w:qFormat="1" w:unhideWhenUsed="0" w:uiPriority="60" w:semiHidden="0" w:name="Light Shading"/>
     <w:lsdException w:unhideWhenUsed="0" w:uiPriority="61" w:semiHidden="0" w:name="Light List"/>
     <w:lsdException w:qFormat="1" w:unhideWhenUsed="0" w:uiPriority="62" w:semiHidden="0" w:name="Light Grid"/>
     <w:lsdException w:unhideWhenUsed="0" w:uiPriority="63" w:semiHidden="0" w:name="Medium Shading 1"/>
@@ -20713,7 +20256,7 @@
     <w:lsdException w:unhideWhenUsed="0" w:uiPriority="72" w:semiHidden="0" w:name="Colorful List Accent 3"/>
     <w:lsdException w:qFormat="1" w:unhideWhenUsed="0" w:uiPriority="73" w:semiHidden="0" w:name="Colorful Grid Accent 3"/>
     <w:lsdException w:qFormat="1" w:unhideWhenUsed="0" w:uiPriority="60" w:semiHidden="0" w:name="Light Shading Accent 4"/>
-    <w:lsdException w:unhideWhenUsed="0" w:uiPriority="61" w:semiHidden="0" w:name="Light List Accent 4"/>
+    <w:lsdException w:qFormat="1" w:unhideWhenUsed="0" w:uiPriority="61" w:semiHidden="0" w:name="Light List Accent 4"/>
     <w:lsdException w:unhideWhenUsed="0" w:uiPriority="62" w:semiHidden="0" w:name="Light Grid Accent 4"/>
     <w:lsdException w:qFormat="1" w:unhideWhenUsed="0" w:uiPriority="63" w:semiHidden="0" w:name="Medium Shading 1 Accent 4"/>
     <w:lsdException w:unhideWhenUsed="0" w:uiPriority="64" w:semiHidden="0" w:name="Medium Shading 2 Accent 4"/>
@@ -20727,7 +20270,7 @@
     <w:lsdException w:unhideWhenUsed="0" w:uiPriority="72" w:semiHidden="0" w:name="Colorful List Accent 4"/>
     <w:lsdException w:unhideWhenUsed="0" w:uiPriority="73" w:semiHidden="0" w:name="Colorful Grid Accent 4"/>
     <w:lsdException w:unhideWhenUsed="0" w:uiPriority="60" w:semiHidden="0" w:name="Light Shading Accent 5"/>
-    <w:lsdException w:unhideWhenUsed="0" w:uiPriority="61" w:semiHidden="0" w:name="Light List Accent 5"/>
+    <w:lsdException w:qFormat="1" w:unhideWhenUsed="0" w:uiPriority="61" w:semiHidden="0" w:name="Light List Accent 5"/>
     <w:lsdException w:unhideWhenUsed="0" w:uiPriority="62" w:semiHidden="0" w:name="Light Grid Accent 5"/>
     <w:lsdException w:qFormat="1" w:unhideWhenUsed="0" w:uiPriority="63" w:semiHidden="0" w:name="Medium Shading 1 Accent 5"/>
     <w:lsdException w:unhideWhenUsed="0" w:uiPriority="64" w:semiHidden="0" w:name="Medium Shading 2 Accent 5"/>
@@ -20740,7 +20283,7 @@
     <w:lsdException w:qFormat="1" w:unhideWhenUsed="0" w:uiPriority="71" w:semiHidden="0" w:name="Colorful Shading Accent 5"/>
     <w:lsdException w:unhideWhenUsed="0" w:uiPriority="72" w:semiHidden="0" w:name="Colorful List Accent 5"/>
     <w:lsdException w:unhideWhenUsed="0" w:uiPriority="73" w:semiHidden="0" w:name="Colorful Grid Accent 5"/>
-    <w:lsdException w:unhideWhenUsed="0" w:uiPriority="60" w:semiHidden="0" w:name="Light Shading Accent 6"/>
+    <w:lsdException w:qFormat="1" w:unhideWhenUsed="0" w:uiPriority="60" w:semiHidden="0" w:name="Light Shading Accent 6"/>
     <w:lsdException w:unhideWhenUsed="0" w:uiPriority="61" w:semiHidden="0" w:name="Light List Accent 6"/>
     <w:lsdException w:unhideWhenUsed="0" w:uiPriority="62" w:semiHidden="0" w:name="Light Grid Accent 6"/>
     <w:lsdException w:qFormat="1" w:unhideWhenUsed="0" w:uiPriority="63" w:semiHidden="0" w:name="Medium Shading 1 Accent 6"/>
@@ -21344,6 +20887,7 @@
   <w:style w:type="table" w:styleId="34">
     <w:name w:val="Light Shading"/>
     <w:basedOn w:val="32"/>
+    <w:qFormat/>
     <w:uiPriority w:val="60"/>
     <w:pPr>
       <w:spacing w:after="0" w:line="240" w:lineRule="auto"/>
@@ -21940,6 +21484,7 @@
   <w:style w:type="table" w:styleId="40">
     <w:name w:val="Light Shading Accent 6"/>
     <w:basedOn w:val="32"/>
+    <w:qFormat/>
     <w:uiPriority w:val="60"/>
     <w:pPr>
       <w:spacing w:after="0" w:line="240" w:lineRule="auto"/>
@@ -22414,6 +21959,7 @@
   <w:style w:type="table" w:styleId="45">
     <w:name w:val="Light List Accent 4"/>
     <w:basedOn w:val="32"/>
+    <w:qFormat/>
     <w:uiPriority w:val="61"/>
     <w:pPr>
       <w:spacing w:after="0" w:line="240" w:lineRule="auto"/>
@@ -22507,6 +22053,7 @@
   <w:style w:type="table" w:styleId="46">
     <w:name w:val="Light List Accent 5"/>
     <w:basedOn w:val="32"/>
+    <w:qFormat/>
     <w:uiPriority w:val="61"/>
     <w:pPr>
       <w:spacing w:after="0" w:line="240" w:lineRule="auto"/>

</xml_diff>